<commit_message>
Move all text indices in thesis formulas to subscripts and rebuild docx
</commit_message>
<xml_diff>
--- a/40 - Projects/Диплом/Диплом_ГОСТ.docx
+++ b/40 - Projects/Диплом/Диплом_ГОСТ.docx
@@ -5286,7 +5286,7 @@
         <w:t xml:space="preserve"> </w:t>
       </w:r>
       <m:oMath>
-        <m:sSubSup>
+        <m:sSub>
           <m:e>
             <m:r>
               <m:t>h</m:t>
@@ -5296,8 +5296,12 @@
             <m:r>
               <m:t>i</m:t>
             </m:r>
-          </m:sub>
-          <m:sup>
+            <m:r>
+              <m:rPr>
+                <m:sty m:val="p"/>
+              </m:rPr>
+              <m:t>,</m:t>
+            </m:r>
             <m:r>
               <m:rPr>
                 <m:sty m:val="p"/>
@@ -5316,11 +5320,25 @@
               </m:rPr>
               <m:t>к</m:t>
             </m:r>
-          </m:sup>
-        </m:sSubSup>
+          </m:sub>
+        </m:sSub>
       </m:oMath>
       <w:r>
-        <w:t xml:space="preserve">, а переменная решения</w:t>
+        <w:t xml:space="preserve"> </w:t>
+      </w:r>
+      <w:r>
+        <w:t xml:space="preserve">– класс HOT или COLD, в котором объект хранится в момент</w:t>
+      </w:r>
+      <w:r>
+        <w:t xml:space="preserve"> </w:t>
+      </w:r>
+      <m:oMath>
+        <m:r>
+          <m:t>T</m:t>
+        </m:r>
+      </m:oMath>
+      <w:r>
+        <w:t xml:space="preserve">. Переменная решения</w:t>
       </w:r>
       <w:r>
         <w:t xml:space="preserve"> </w:t>
@@ -5343,27 +5361,73 @@
         <w:t xml:space="preserve"> </w:t>
       </w:r>
       <w:r>
-        <w:t xml:space="preserve">равна 1 для HOT и 0 для COLD.</w:t>
-      </w:r>
-    </w:p>
-    <w:p>
-      <w:pPr>
-        <w:pStyle w:val="a2"/>
-        <w:keepNext w:val="1"/>
-      </w:pPr>
-      <w:r>
-        <w:t xml:space="preserve">Закреплёнными называются объекты с запретом переноса, участвующие в выполняемом переносе или перенесённые раньше минимального интервала. Они входят в</w:t>
+        <w:t xml:space="preserve">– класс, в котором объект будет храниться по плану. План</w:t>
       </w:r>
       <w:r>
         <w:t xml:space="preserve"> </w:t>
       </w:r>
       <m:oMath>
         <m:r>
+          <m:t>h</m:t>
+        </m:r>
+      </m:oMath>
+      <w:r>
+        <w:t xml:space="preserve"> </w:t>
+      </w:r>
+      <w:r>
+        <w:t xml:space="preserve">делит</w:t>
+      </w:r>
+      <w:r>
+        <w:t xml:space="preserve"> </w:t>
+      </w:r>
+      <m:oMath>
+        <m:r>
           <m:t>I</m:t>
         </m:r>
       </m:oMath>
       <w:r>
-        <w:t xml:space="preserve">, но для них</w:t>
+        <w:t xml:space="preserve"> </w:t>
+      </w:r>
+      <w:r>
+        <w:t xml:space="preserve">на множество</w:t>
+      </w:r>
+      <w:r>
+        <w:t xml:space="preserve"> </w:t>
+      </w:r>
+      <m:oMath>
+        <m:sSub>
+          <m:e>
+            <m:r>
+              <m:t>I</m:t>
+            </m:r>
+          </m:e>
+          <m:sub>
+            <m:r>
+              <m:rPr>
+                <m:sty m:val="p"/>
+              </m:rPr>
+              <m:t>H</m:t>
+            </m:r>
+            <m:r>
+              <m:rPr>
+                <m:sty m:val="p"/>
+              </m:rPr>
+              <m:t>O</m:t>
+            </m:r>
+            <m:r>
+              <m:rPr>
+                <m:sty m:val="p"/>
+              </m:rPr>
+              <m:t>T</m:t>
+            </m:r>
+          </m:sub>
+        </m:sSub>
+      </m:oMath>
+      <w:r>
+        <w:t xml:space="preserve"> </w:t>
+      </w:r>
+      <w:r>
+        <w:t xml:space="preserve">объектов с</w:t>
       </w:r>
       <w:r>
         <w:t xml:space="preserve"> </w:t>
@@ -5387,18 +5451,163 @@
           </m:rPr>
           <m:t>=</m:t>
         </m:r>
-        <m:sSubSup>
+        <m:r>
+          <m:rPr>
+            <m:sty m:val="p"/>
+          </m:rPr>
+          <m:t>H</m:t>
+        </m:r>
+        <m:r>
+          <m:rPr>
+            <m:sty m:val="p"/>
+          </m:rPr>
+          <m:t>O</m:t>
+        </m:r>
+        <m:r>
+          <m:rPr>
+            <m:sty m:val="p"/>
+          </m:rPr>
+          <m:t>T</m:t>
+        </m:r>
+      </m:oMath>
+      <w:r>
+        <w:t xml:space="preserve"> </w:t>
+      </w:r>
+      <w:r>
+        <w:t xml:space="preserve">и множество</w:t>
+      </w:r>
+      <w:r>
+        <w:t xml:space="preserve"> </w:t>
+      </w:r>
+      <m:oMath>
+        <m:sSub>
           <m:e>
             <m:r>
-              <m:t>h</m:t>
+              <m:t>I</m:t>
             </m:r>
           </m:e>
           <m:sub>
             <m:r>
+              <m:rPr>
+                <m:sty m:val="p"/>
+              </m:rPr>
+              <m:t>C</m:t>
+            </m:r>
+            <m:r>
+              <m:rPr>
+                <m:sty m:val="p"/>
+              </m:rPr>
+              <m:t>O</m:t>
+            </m:r>
+            <m:r>
+              <m:rPr>
+                <m:sty m:val="p"/>
+              </m:rPr>
+              <m:t>L</m:t>
+            </m:r>
+            <m:r>
+              <m:rPr>
+                <m:sty m:val="p"/>
+              </m:rPr>
+              <m:t>D</m:t>
+            </m:r>
+          </m:sub>
+        </m:sSub>
+      </m:oMath>
+      <w:r>
+        <w:t xml:space="preserve"> </w:t>
+      </w:r>
+      <w:r>
+        <w:t xml:space="preserve">объектов с</w:t>
+      </w:r>
+      <w:r>
+        <w:t xml:space="preserve"> </w:t>
+      </w:r>
+      <m:oMath>
+        <m:sSub>
+          <m:e>
+            <m:r>
+              <m:t>h</m:t>
+            </m:r>
+          </m:e>
+          <m:sub>
+            <m:r>
               <m:t>i</m:t>
             </m:r>
           </m:sub>
-          <m:sup>
+        </m:sSub>
+        <m:r>
+          <m:rPr>
+            <m:sty m:val="p"/>
+          </m:rPr>
+          <m:t>=</m:t>
+        </m:r>
+        <m:r>
+          <m:rPr>
+            <m:sty m:val="p"/>
+          </m:rPr>
+          <m:t>C</m:t>
+        </m:r>
+        <m:r>
+          <m:rPr>
+            <m:sty m:val="p"/>
+          </m:rPr>
+          <m:t>O</m:t>
+        </m:r>
+        <m:r>
+          <m:rPr>
+            <m:sty m:val="p"/>
+          </m:rPr>
+          <m:t>L</m:t>
+        </m:r>
+        <m:r>
+          <m:rPr>
+            <m:sty m:val="p"/>
+          </m:rPr>
+          <m:t>D</m:t>
+        </m:r>
+      </m:oMath>
+      <w:r>
+        <w:t xml:space="preserve">, а объекты с</w:t>
+      </w:r>
+      <w:r>
+        <w:t xml:space="preserve"> </w:t>
+      </w:r>
+      <m:oMath>
+        <m:sSub>
+          <m:e>
+            <m:r>
+              <m:t>h</m:t>
+            </m:r>
+          </m:e>
+          <m:sub>
+            <m:r>
+              <m:t>i</m:t>
+            </m:r>
+          </m:sub>
+        </m:sSub>
+        <m:r>
+          <m:rPr>
+            <m:sty m:val="p"/>
+          </m:rPr>
+          <m:t>≠</m:t>
+        </m:r>
+        <m:sSub>
+          <m:e>
+            <m:r>
+              <m:t>h</m:t>
+            </m:r>
+          </m:e>
+          <m:sub>
+            <m:r>
+              <m:t>i</m:t>
+            </m:r>
+            <m:r>
+              <m:rPr>
+                <m:sty m:val="p"/>
+              </m:rPr>
+              <m:t>,</m:t>
+            </m:r>
             <m:r>
               <m:rPr>
                 <m:sty m:val="p"/>
@@ -5417,13 +5626,133 @@
               </m:rPr>
               <m:t>к</m:t>
             </m:r>
-          </m:sup>
-        </m:sSubSup>
+          </m:sub>
+        </m:sSub>
       </m:oMath>
       <w:r>
         <w:t xml:space="preserve"> </w:t>
       </w:r>
       <w:r>
+        <w:t xml:space="preserve">образуют множество переносимых объектов</w:t>
+      </w:r>
+      <w:r>
+        <w:t xml:space="preserve"> </w:t>
+      </w:r>
+      <m:oMath>
+        <m:sSub>
+          <m:e>
+            <m:r>
+              <m:t>I</m:t>
+            </m:r>
+          </m:e>
+          <m:sub>
+            <m:r>
+              <m:rPr>
+                <m:sty m:val="p"/>
+              </m:rPr>
+              <m:t>п</m:t>
+            </m:r>
+            <m:r>
+              <m:rPr>
+                <m:sty m:val="p"/>
+              </m:rPr>
+              <m:t>е</m:t>
+            </m:r>
+            <m:r>
+              <m:rPr>
+                <m:sty m:val="p"/>
+              </m:rPr>
+              <m:t>р</m:t>
+            </m:r>
+          </m:sub>
+        </m:sSub>
+      </m:oMath>
+      <w:r>
+        <w:t xml:space="preserve">.</w:t>
+      </w:r>
+    </w:p>
+    <w:p>
+      <w:pPr>
+        <w:pStyle w:val="a2"/>
+        <w:keepNext w:val="1"/>
+      </w:pPr>
+      <w:r>
+        <w:t xml:space="preserve">Закреплёнными называются объекты с запретом переноса, участвующие в выполняемом переносе или перенесённые раньше минимального интервала. Они входят в</w:t>
+      </w:r>
+      <w:r>
+        <w:t xml:space="preserve"> </w:t>
+      </w:r>
+      <m:oMath>
+        <m:r>
+          <m:t>I</m:t>
+        </m:r>
+      </m:oMath>
+      <w:r>
+        <w:t xml:space="preserve">, но для них</w:t>
+      </w:r>
+      <w:r>
+        <w:t xml:space="preserve"> </w:t>
+      </w:r>
+      <m:oMath>
+        <m:sSub>
+          <m:e>
+            <m:r>
+              <m:t>h</m:t>
+            </m:r>
+          </m:e>
+          <m:sub>
+            <m:r>
+              <m:t>i</m:t>
+            </m:r>
+          </m:sub>
+        </m:sSub>
+        <m:r>
+          <m:rPr>
+            <m:sty m:val="p"/>
+          </m:rPr>
+          <m:t>=</m:t>
+        </m:r>
+        <m:sSub>
+          <m:e>
+            <m:r>
+              <m:t>h</m:t>
+            </m:r>
+          </m:e>
+          <m:sub>
+            <m:r>
+              <m:t>i</m:t>
+            </m:r>
+            <m:r>
+              <m:rPr>
+                <m:sty m:val="p"/>
+              </m:rPr>
+              <m:t>,</m:t>
+            </m:r>
+            <m:r>
+              <m:rPr>
+                <m:sty m:val="p"/>
+              </m:rPr>
+              <m:t>т</m:t>
+            </m:r>
+            <m:r>
+              <m:rPr>
+                <m:sty m:val="p"/>
+              </m:rPr>
+              <m:t>е</m:t>
+            </m:r>
+            <m:r>
+              <m:rPr>
+                <m:sty m:val="p"/>
+              </m:rPr>
+              <m:t>к</m:t>
+            </m:r>
+          </m:sub>
+        </m:sSub>
+      </m:oMath>
+      <w:r>
+        <w:t xml:space="preserve"> </w:t>
+      </w:r>
+      <w:r>
         <w:t xml:space="preserve">(требование F-05). Предыдущие версии объектов в</w:t>
       </w:r>
       <w:r>
@@ -5444,13 +5773,13 @@
         <w:t xml:space="preserve"> </w:t>
       </w:r>
       <m:oMath>
-        <m:sSup>
+        <m:sSub>
           <m:e>
             <m:r>
               <m:t>S</m:t>
             </m:r>
           </m:e>
-          <m:sup>
+          <m:sub>
             <m:r>
               <m:rPr>
                 <m:sty m:val="p"/>
@@ -5469,8 +5798,8 @@
               </m:rPr>
               <m:t>d</m:t>
             </m:r>
-          </m:sup>
-        </m:sSup>
+          </m:sub>
+        </m:sSub>
       </m:oMath>
       <w:r>
         <w:t xml:space="preserve"> </w:t>
@@ -5511,10 +5840,10 @@
         <w:tblCaption w:val="Таблица 2.1 – Обозначения модели размещения"/>
       </w:tblPr>
       <w:tblGrid>
-        <w:gridCol w:w="1952"/>
-        <w:gridCol w:w="3772"/>
+        <w:gridCol w:w="1972"/>
+        <w:gridCol w:w="3758"/>
         <w:gridCol w:w="1270"/>
-        <w:gridCol w:w="2644"/>
+        <w:gridCol w:w="2638"/>
       </w:tblGrid>
       <w:tr>
         <w:trPr>
@@ -5522,7 +5851,7 @@
         </w:trPr>
         <w:tc>
           <w:tcPr>
-            <w:tcW w:w="1952" w:type="dxa"/>
+            <w:tcW w:w="1972" w:type="dxa"/>
           </w:tcPr>
           <w:p>
             <w:pPr>
@@ -5545,7 +5874,7 @@
         </w:tc>
         <w:tc>
           <w:tcPr>
-            <w:tcW w:w="3772" w:type="dxa"/>
+            <w:tcW w:w="3758" w:type="dxa"/>
           </w:tcPr>
           <w:p>
             <w:pPr>
@@ -5591,7 +5920,7 @@
         </w:tc>
         <w:tc>
           <w:tcPr>
-            <w:tcW w:w="2644" w:type="dxa"/>
+            <w:tcW w:w="2638" w:type="dxa"/>
           </w:tcPr>
           <w:p>
             <w:pPr>
@@ -5616,7 +5945,7 @@
       <w:tr>
         <w:tc>
           <w:tcPr>
-            <w:tcW w:w="1952" w:type="dxa"/>
+            <w:tcW w:w="1972" w:type="dxa"/>
           </w:tcPr>
           <w:p>
             <w:pPr>
@@ -5636,7 +5965,7 @@
         </w:tc>
         <w:tc>
           <w:tcPr>
-            <w:tcW w:w="3772" w:type="dxa"/>
+            <w:tcW w:w="3758" w:type="dxa"/>
           </w:tcPr>
           <w:p>
             <w:pPr>
@@ -5680,7 +6009,7 @@
         </w:tc>
         <w:tc>
           <w:tcPr>
-            <w:tcW w:w="2644" w:type="dxa"/>
+            <w:tcW w:w="2638" w:type="dxa"/>
           </w:tcPr>
           <w:p>
             <w:pPr>
@@ -5704,7 +6033,7 @@
       <w:tr>
         <w:tc>
           <w:tcPr>
-            <w:tcW w:w="1952" w:type="dxa"/>
+            <w:tcW w:w="1972" w:type="dxa"/>
           </w:tcPr>
           <w:p>
             <w:pPr>
@@ -5724,7 +6053,7 @@
         </w:tc>
         <w:tc>
           <w:tcPr>
-            <w:tcW w:w="3772" w:type="dxa"/>
+            <w:tcW w:w="3758" w:type="dxa"/>
           </w:tcPr>
           <w:p>
             <w:pPr>
@@ -5780,7 +6109,7 @@
         </w:tc>
         <w:tc>
           <w:tcPr>
-            <w:tcW w:w="2644" w:type="dxa"/>
+            <w:tcW w:w="2638" w:type="dxa"/>
           </w:tcPr>
           <w:p>
             <w:pPr>
@@ -5804,7 +6133,7 @@
       <w:tr>
         <w:tc>
           <w:tcPr>
-            <w:tcW w:w="1952" w:type="dxa"/>
+            <w:tcW w:w="1972" w:type="dxa"/>
           </w:tcPr>
           <w:p>
             <w:pPr>
@@ -5824,7 +6153,7 @@
         </w:tc>
         <w:tc>
           <w:tcPr>
-            <w:tcW w:w="3772" w:type="dxa"/>
+            <w:tcW w:w="3758" w:type="dxa"/>
           </w:tcPr>
           <w:p>
             <w:pPr>
@@ -5880,7 +6209,7 @@
         </w:tc>
         <w:tc>
           <w:tcPr>
-            <w:tcW w:w="2644" w:type="dxa"/>
+            <w:tcW w:w="2638" w:type="dxa"/>
           </w:tcPr>
           <w:p>
             <w:pPr>
@@ -5916,7 +6245,7 @@
       <w:tr>
         <w:tc>
           <w:tcPr>
-            <w:tcW w:w="1952" w:type="dxa"/>
+            <w:tcW w:w="1972" w:type="dxa"/>
           </w:tcPr>
           <w:p>
             <w:pPr>
@@ -5945,7 +6274,7 @@
         </w:tc>
         <w:tc>
           <w:tcPr>
-            <w:tcW w:w="3772" w:type="dxa"/>
+            <w:tcW w:w="3758" w:type="dxa"/>
           </w:tcPr>
           <w:p>
             <w:pPr>
@@ -6001,7 +6330,7 @@
         </w:tc>
         <w:tc>
           <w:tcPr>
-            <w:tcW w:w="2644" w:type="dxa"/>
+            <w:tcW w:w="2638" w:type="dxa"/>
           </w:tcPr>
           <w:p>
             <w:pPr>
@@ -6025,7 +6354,7 @@
       <w:tr>
         <w:tc>
           <w:tcPr>
-            <w:tcW w:w="1952" w:type="dxa"/>
+            <w:tcW w:w="1972" w:type="dxa"/>
           </w:tcPr>
           <w:p>
             <w:pPr>
@@ -6037,7 +6366,7 @@
               <w:pageBreakBefore w:val="0"/>
             </w:pPr>
             <m:oMath>
-              <m:sSubSup>
+              <m:sSub>
                 <m:e>
                   <m:r>
                     <m:t>h</m:t>
@@ -6047,8 +6376,12 @@
                   <m:r>
                     <m:t>i</m:t>
                   </m:r>
-                </m:sub>
-                <m:sup>
+                  <m:r>
+                    <m:rPr>
+                      <m:sty m:val="p"/>
+                    </m:rPr>
+                    <m:t>,</m:t>
+                  </m:r>
                   <m:r>
                     <m:rPr>
                       <m:sty m:val="p"/>
@@ -6067,14 +6400,14 @@
                     </m:rPr>
                     <m:t>к</m:t>
                   </m:r>
-                </m:sup>
-              </m:sSubSup>
+                </m:sub>
+              </m:sSub>
             </m:oMath>
           </w:p>
         </w:tc>
         <w:tc>
           <w:tcPr>
-            <w:tcW w:w="3772" w:type="dxa"/>
+            <w:tcW w:w="3758" w:type="dxa"/>
           </w:tcPr>
           <w:p>
             <w:pPr>
@@ -6109,7 +6442,7 @@
                 <w:sz w:val="24"/>
                 <w:szCs w:val="24"/>
               </w:rPr>
-              <w:t xml:space="preserve">: 1 – HOT, 0 – COLD</w:t>
+              <w:t xml:space="preserve">, HOT или COLD</w:t>
             </w:r>
           </w:p>
         </w:tc>
@@ -6137,7 +6470,7 @@
         </w:tc>
         <w:tc>
           <w:tcPr>
-            <w:tcW w:w="2644" w:type="dxa"/>
+            <w:tcW w:w="2638" w:type="dxa"/>
           </w:tcPr>
           <w:p>
             <w:pPr>
@@ -6161,7 +6494,7 @@
       <w:tr>
         <w:tc>
           <w:tcPr>
-            <w:tcW w:w="1952" w:type="dxa"/>
+            <w:tcW w:w="1972" w:type="dxa"/>
           </w:tcPr>
           <w:p>
             <w:pPr>
@@ -6190,7 +6523,7 @@
         </w:tc>
         <w:tc>
           <w:tcPr>
-            <w:tcW w:w="3772" w:type="dxa"/>
+            <w:tcW w:w="3758" w:type="dxa"/>
           </w:tcPr>
           <w:p>
             <w:pPr>
@@ -6232,7 +6565,7 @@
                 <w:sz w:val="24"/>
                 <w:szCs w:val="24"/>
               </w:rPr>
-              <w:t xml:space="preserve">по плану: 1 – HOT, 0 – COLD</w:t>
+              <w:t xml:space="preserve">по плану, HOT или COLD</w:t>
             </w:r>
           </w:p>
         </w:tc>
@@ -6260,7 +6593,7 @@
         </w:tc>
         <w:tc>
           <w:tcPr>
-            <w:tcW w:w="2644" w:type="dxa"/>
+            <w:tcW w:w="2638" w:type="dxa"/>
           </w:tcPr>
           <w:p>
             <w:pPr>
@@ -6284,7 +6617,7 @@
       <w:tr>
         <w:tc>
           <w:tcPr>
-            <w:tcW w:w="1952" w:type="dxa"/>
+            <w:tcW w:w="1972" w:type="dxa"/>
           </w:tcPr>
           <w:p>
             <w:pPr>
@@ -6304,7 +6637,7 @@
         </w:tc>
         <w:tc>
           <w:tcPr>
-            <w:tcW w:w="3772" w:type="dxa"/>
+            <w:tcW w:w="3758" w:type="dxa"/>
           </w:tcPr>
           <w:p>
             <w:pPr>
@@ -6399,7 +6732,7 @@
         </w:tc>
         <w:tc>
           <w:tcPr>
-            <w:tcW w:w="2644" w:type="dxa"/>
+            <w:tcW w:w="2638" w:type="dxa"/>
           </w:tcPr>
           <w:p>
             <w:pPr>
@@ -6423,7 +6756,393 @@
       <w:tr>
         <w:tc>
           <w:tcPr>
-            <w:tcW w:w="1952" w:type="dxa"/>
+            <w:tcW w:w="1972" w:type="dxa"/>
+          </w:tcPr>
+          <w:p>
+            <w:pPr>
+              <w:pStyle w:val="Compact"/>
+              <w:spacing w:before="0" w:after="0" w:line="240" w:lineRule="auto"/>
+              <w:ind w:firstLine="0" w:left="0" w:right="0"/>
+              <w:jc w:val="left"/>
+              <w:keepNext w:val="0"/>
+              <w:pageBreakBefore w:val="0"/>
+            </w:pPr>
+            <m:oMath>
+              <m:sSub>
+                <m:e>
+                  <m:r>
+                    <m:t>I</m:t>
+                  </m:r>
+                </m:e>
+                <m:sub>
+                  <m:r>
+                    <m:rPr>
+                      <m:sty m:val="p"/>
+                    </m:rPr>
+                    <m:t>H</m:t>
+                  </m:r>
+                  <m:r>
+                    <m:rPr>
+                      <m:sty m:val="p"/>
+                    </m:rPr>
+                    <m:t>O</m:t>
+                  </m:r>
+                  <m:r>
+                    <m:rPr>
+                      <m:sty m:val="p"/>
+                    </m:rPr>
+                    <m:t>T</m:t>
+                  </m:r>
+                </m:sub>
+              </m:sSub>
+            </m:oMath>
+            <w:r>
+              <w:rPr>
+                <w:sz w:val="24"/>
+                <w:szCs w:val="24"/>
+              </w:rPr>
+              <w:t xml:space="preserve">,</w:t>
+            </w:r>
+            <w:r>
+              <w:rPr>
+                <w:sz w:val="24"/>
+                <w:szCs w:val="24"/>
+              </w:rPr>
+              <w:t xml:space="preserve"> </w:t>
+            </w:r>
+            <m:oMath>
+              <m:sSub>
+                <m:e>
+                  <m:r>
+                    <m:t>I</m:t>
+                  </m:r>
+                </m:e>
+                <m:sub>
+                  <m:r>
+                    <m:rPr>
+                      <m:sty m:val="p"/>
+                    </m:rPr>
+                    <m:t>C</m:t>
+                  </m:r>
+                  <m:r>
+                    <m:rPr>
+                      <m:sty m:val="p"/>
+                    </m:rPr>
+                    <m:t>O</m:t>
+                  </m:r>
+                  <m:r>
+                    <m:rPr>
+                      <m:sty m:val="p"/>
+                    </m:rPr>
+                    <m:t>L</m:t>
+                  </m:r>
+                  <m:r>
+                    <m:rPr>
+                      <m:sty m:val="p"/>
+                    </m:rPr>
+                    <m:t>D</m:t>
+                  </m:r>
+                </m:sub>
+              </m:sSub>
+            </m:oMath>
+          </w:p>
+        </w:tc>
+        <w:tc>
+          <w:tcPr>
+            <w:tcW w:w="3758" w:type="dxa"/>
+          </w:tcPr>
+          <w:p>
+            <w:pPr>
+              <w:pStyle w:val="Compact"/>
+              <w:spacing w:before="0" w:after="0" w:line="240" w:lineRule="auto"/>
+              <w:ind w:firstLine="0" w:left="0" w:right="0"/>
+              <w:jc w:val="left"/>
+              <w:keepNext w:val="0"/>
+              <w:pageBreakBefore w:val="0"/>
+            </w:pPr>
+            <w:r>
+              <w:rPr>
+                <w:sz w:val="24"/>
+                <w:szCs w:val="24"/>
+              </w:rPr>
+              <w:t xml:space="preserve">Множества объектов, размещённых по плану</w:t>
+            </w:r>
+            <w:r>
+              <w:rPr>
+                <w:sz w:val="24"/>
+                <w:szCs w:val="24"/>
+              </w:rPr>
+              <w:t xml:space="preserve"> </w:t>
+            </w:r>
+            <m:oMath>
+              <m:r>
+                <m:t>h</m:t>
+              </m:r>
+            </m:oMath>
+            <w:r>
+              <w:rPr>
+                <w:sz w:val="24"/>
+                <w:szCs w:val="24"/>
+              </w:rPr>
+              <w:t xml:space="preserve"> </w:t>
+            </w:r>
+            <w:r>
+              <w:rPr>
+                <w:sz w:val="24"/>
+                <w:szCs w:val="24"/>
+              </w:rPr>
+              <w:t xml:space="preserve">в HOT и COLD соответственно</w:t>
+            </w:r>
+          </w:p>
+        </w:tc>
+        <w:tc>
+          <w:tcPr>
+            <w:tcW w:w="1270" w:type="dxa"/>
+          </w:tcPr>
+          <w:p>
+            <w:pPr>
+              <w:pStyle w:val="Compact"/>
+              <w:spacing w:before="0" w:after="0" w:line="240" w:lineRule="auto"/>
+              <w:ind w:firstLine="0" w:left="0" w:right="0"/>
+              <w:jc w:val="left"/>
+              <w:keepNext w:val="0"/>
+              <w:pageBreakBefore w:val="0"/>
+            </w:pPr>
+            <w:r>
+              <w:rPr>
+                <w:sz w:val="24"/>
+                <w:szCs w:val="24"/>
+              </w:rPr>
+              <w:t xml:space="preserve">–</w:t>
+            </w:r>
+          </w:p>
+        </w:tc>
+        <w:tc>
+          <w:tcPr>
+            <w:tcW w:w="2638" w:type="dxa"/>
+          </w:tcPr>
+          <w:p>
+            <w:pPr>
+              <w:pStyle w:val="Compact"/>
+              <w:spacing w:before="0" w:after="0" w:line="240" w:lineRule="auto"/>
+              <w:ind w:firstLine="0" w:left="0" w:right="0"/>
+              <w:jc w:val="left"/>
+              <w:keepNext w:val="0"/>
+              <w:pageBreakBefore w:val="0"/>
+            </w:pPr>
+            <w:r>
+              <w:rPr>
+                <w:sz w:val="24"/>
+                <w:szCs w:val="24"/>
+              </w:rPr>
+              <w:t xml:space="preserve">Определяются планом</w:t>
+            </w:r>
+            <w:r>
+              <w:rPr>
+                <w:sz w:val="24"/>
+                <w:szCs w:val="24"/>
+              </w:rPr>
+              <w:t xml:space="preserve"> </w:t>
+            </w:r>
+            <m:oMath>
+              <m:r>
+                <m:t>h</m:t>
+              </m:r>
+            </m:oMath>
+          </w:p>
+        </w:tc>
+      </w:tr>
+      <w:tr>
+        <w:tc>
+          <w:tcPr>
+            <w:tcW w:w="1972" w:type="dxa"/>
+          </w:tcPr>
+          <w:p>
+            <w:pPr>
+              <w:pStyle w:val="Compact"/>
+              <w:spacing w:before="0" w:after="0" w:line="240" w:lineRule="auto"/>
+              <w:ind w:firstLine="0" w:left="0" w:right="0"/>
+              <w:jc w:val="left"/>
+              <w:keepNext w:val="0"/>
+              <w:pageBreakBefore w:val="0"/>
+            </w:pPr>
+            <m:oMath>
+              <m:sSub>
+                <m:e>
+                  <m:r>
+                    <m:t>I</m:t>
+                  </m:r>
+                </m:e>
+                <m:sub>
+                  <m:r>
+                    <m:rPr>
+                      <m:sty m:val="p"/>
+                    </m:rPr>
+                    <m:t>п</m:t>
+                  </m:r>
+                  <m:r>
+                    <m:rPr>
+                      <m:sty m:val="p"/>
+                    </m:rPr>
+                    <m:t>е</m:t>
+                  </m:r>
+                  <m:r>
+                    <m:rPr>
+                      <m:sty m:val="p"/>
+                    </m:rPr>
+                    <m:t>р</m:t>
+                  </m:r>
+                </m:sub>
+              </m:sSub>
+            </m:oMath>
+          </w:p>
+        </w:tc>
+        <w:tc>
+          <w:tcPr>
+            <w:tcW w:w="3758" w:type="dxa"/>
+          </w:tcPr>
+          <w:p>
+            <w:pPr>
+              <w:pStyle w:val="Compact"/>
+              <w:spacing w:before="0" w:after="0" w:line="240" w:lineRule="auto"/>
+              <w:ind w:firstLine="0" w:left="0" w:right="0"/>
+              <w:jc w:val="left"/>
+              <w:keepNext w:val="0"/>
+              <w:pageBreakBefore w:val="0"/>
+            </w:pPr>
+            <w:r>
+              <w:rPr>
+                <w:sz w:val="24"/>
+                <w:szCs w:val="24"/>
+              </w:rPr>
+              <w:t xml:space="preserve">Множество переносимых объектов, у которых</w:t>
+            </w:r>
+            <w:r>
+              <w:rPr>
+                <w:sz w:val="24"/>
+                <w:szCs w:val="24"/>
+              </w:rPr>
+              <w:t xml:space="preserve"> </w:t>
+            </w:r>
+            <m:oMath>
+              <m:sSub>
+                <m:e>
+                  <m:r>
+                    <m:t>h</m:t>
+                  </m:r>
+                </m:e>
+                <m:sub>
+                  <m:r>
+                    <m:t>i</m:t>
+                  </m:r>
+                </m:sub>
+              </m:sSub>
+              <m:r>
+                <m:rPr>
+                  <m:sty m:val="p"/>
+                </m:rPr>
+                <m:t>≠</m:t>
+              </m:r>
+              <m:sSub>
+                <m:e>
+                  <m:r>
+                    <m:t>h</m:t>
+                  </m:r>
+                </m:e>
+                <m:sub>
+                  <m:r>
+                    <m:t>i</m:t>
+                  </m:r>
+                  <m:r>
+                    <m:rPr>
+                      <m:sty m:val="p"/>
+                    </m:rPr>
+                    <m:t>,</m:t>
+                  </m:r>
+                  <m:r>
+                    <m:rPr>
+                      <m:sty m:val="p"/>
+                    </m:rPr>
+                    <m:t>т</m:t>
+                  </m:r>
+                  <m:r>
+                    <m:rPr>
+                      <m:sty m:val="p"/>
+                    </m:rPr>
+                    <m:t>е</m:t>
+                  </m:r>
+                  <m:r>
+                    <m:rPr>
+                      <m:sty m:val="p"/>
+                    </m:rPr>
+                    <m:t>к</m:t>
+                  </m:r>
+                </m:sub>
+              </m:sSub>
+            </m:oMath>
+          </w:p>
+        </w:tc>
+        <w:tc>
+          <w:tcPr>
+            <w:tcW w:w="1270" w:type="dxa"/>
+          </w:tcPr>
+          <w:p>
+            <w:pPr>
+              <w:pStyle w:val="Compact"/>
+              <w:spacing w:before="0" w:after="0" w:line="240" w:lineRule="auto"/>
+              <w:ind w:firstLine="0" w:left="0" w:right="0"/>
+              <w:jc w:val="left"/>
+              <w:keepNext w:val="0"/>
+              <w:pageBreakBefore w:val="0"/>
+            </w:pPr>
+            <w:r>
+              <w:rPr>
+                <w:sz w:val="24"/>
+                <w:szCs w:val="24"/>
+              </w:rPr>
+              <w:t xml:space="preserve">–</w:t>
+            </w:r>
+          </w:p>
+        </w:tc>
+        <w:tc>
+          <w:tcPr>
+            <w:tcW w:w="2638" w:type="dxa"/>
+          </w:tcPr>
+          <w:p>
+            <w:pPr>
+              <w:pStyle w:val="Compact"/>
+              <w:spacing w:before="0" w:after="0" w:line="240" w:lineRule="auto"/>
+              <w:ind w:firstLine="0" w:left="0" w:right="0"/>
+              <w:jc w:val="left"/>
+              <w:keepNext w:val="0"/>
+              <w:pageBreakBefore w:val="0"/>
+            </w:pPr>
+            <w:r>
+              <w:rPr>
+                <w:sz w:val="24"/>
+                <w:szCs w:val="24"/>
+              </w:rPr>
+              <w:t xml:space="preserve">Определяется планом</w:t>
+            </w:r>
+            <w:r>
+              <w:rPr>
+                <w:sz w:val="24"/>
+                <w:szCs w:val="24"/>
+              </w:rPr>
+              <w:t xml:space="preserve"> </w:t>
+            </w:r>
+            <m:oMath>
+              <m:r>
+                <m:t>h</m:t>
+              </m:r>
+            </m:oMath>
+          </w:p>
+        </w:tc>
+      </w:tr>
+      <w:tr>
+        <w:tc>
+          <w:tcPr>
+            <w:tcW w:w="1972" w:type="dxa"/>
           </w:tcPr>
           <w:p>
             <w:pPr>
@@ -6443,7 +7162,7 @@
         </w:tc>
         <w:tc>
           <w:tcPr>
-            <w:tcW w:w="3772" w:type="dxa"/>
+            <w:tcW w:w="3758" w:type="dxa"/>
           </w:tcPr>
           <w:p>
             <w:pPr>
@@ -6487,7 +7206,7 @@
         </w:tc>
         <w:tc>
           <w:tcPr>
-            <w:tcW w:w="2644" w:type="dxa"/>
+            <w:tcW w:w="2638" w:type="dxa"/>
           </w:tcPr>
           <w:p>
             <w:pPr>
@@ -6511,7 +7230,7 @@
       <w:tr>
         <w:tc>
           <w:tcPr>
-            <w:tcW w:w="1952" w:type="dxa"/>
+            <w:tcW w:w="1972" w:type="dxa"/>
           </w:tcPr>
           <w:p>
             <w:pPr>
@@ -6555,7 +7274,7 @@
         </w:tc>
         <w:tc>
           <w:tcPr>
-            <w:tcW w:w="3772" w:type="dxa"/>
+            <w:tcW w:w="3758" w:type="dxa"/>
           </w:tcPr>
           <w:p>
             <w:pPr>
@@ -6695,7 +7414,7 @@
         </w:tc>
         <w:tc>
           <w:tcPr>
-            <w:tcW w:w="2644" w:type="dxa"/>
+            <w:tcW w:w="2638" w:type="dxa"/>
           </w:tcPr>
           <w:p>
             <w:pPr>
@@ -6719,7 +7438,7 @@
       <w:tr>
         <w:tc>
           <w:tcPr>
-            <w:tcW w:w="1952" w:type="dxa"/>
+            <w:tcW w:w="1972" w:type="dxa"/>
           </w:tcPr>
           <w:p>
             <w:pPr>
@@ -6755,7 +7474,7 @@
         </w:tc>
         <w:tc>
           <w:tcPr>
-            <w:tcW w:w="3772" w:type="dxa"/>
+            <w:tcW w:w="3758" w:type="dxa"/>
           </w:tcPr>
           <w:p>
             <w:pPr>
@@ -6867,7 +7586,7 @@
         </w:tc>
         <w:tc>
           <w:tcPr>
-            <w:tcW w:w="2644" w:type="dxa"/>
+            <w:tcW w:w="2638" w:type="dxa"/>
           </w:tcPr>
           <w:p>
             <w:pPr>
@@ -6891,7 +7610,7 @@
       <w:tr>
         <w:tc>
           <w:tcPr>
-            <w:tcW w:w="1952" w:type="dxa"/>
+            <w:tcW w:w="1972" w:type="dxa"/>
           </w:tcPr>
           <w:p>
             <w:pPr>
@@ -6920,7 +7639,7 @@
         </w:tc>
         <w:tc>
           <w:tcPr>
-            <w:tcW w:w="3772" w:type="dxa"/>
+            <w:tcW w:w="3758" w:type="dxa"/>
           </w:tcPr>
           <w:p>
             <w:pPr>
@@ -6983,7 +7702,7 @@
         </w:tc>
         <w:tc>
           <w:tcPr>
-            <w:tcW w:w="2644" w:type="dxa"/>
+            <w:tcW w:w="2638" w:type="dxa"/>
           </w:tcPr>
           <w:p>
             <w:pPr>
@@ -7007,7 +7726,7 @@
       <w:tr>
         <w:tc>
           <w:tcPr>
-            <w:tcW w:w="1952" w:type="dxa"/>
+            <w:tcW w:w="1972" w:type="dxa"/>
           </w:tcPr>
           <w:p>
             <w:pPr>
@@ -7043,7 +7762,7 @@
         </w:tc>
         <w:tc>
           <w:tcPr>
-            <w:tcW w:w="3772" w:type="dxa"/>
+            <w:tcW w:w="3758" w:type="dxa"/>
           </w:tcPr>
           <w:p>
             <w:pPr>
@@ -7165,7 +7884,7 @@
         </w:tc>
         <w:tc>
           <w:tcPr>
-            <w:tcW w:w="2644" w:type="dxa"/>
+            <w:tcW w:w="2638" w:type="dxa"/>
           </w:tcPr>
           <w:p>
             <w:pPr>
@@ -7280,7 +7999,7 @@
       <w:tr>
         <w:tc>
           <w:tcPr>
-            <w:tcW w:w="1952" w:type="dxa"/>
+            <w:tcW w:w="1972" w:type="dxa"/>
           </w:tcPr>
           <w:p>
             <w:pPr>
@@ -7300,7 +8019,7 @@
         </w:tc>
         <w:tc>
           <w:tcPr>
-            <w:tcW w:w="3772" w:type="dxa"/>
+            <w:tcW w:w="3758" w:type="dxa"/>
           </w:tcPr>
           <w:p>
             <w:pPr>
@@ -7344,7 +8063,7 @@
         </w:tc>
         <w:tc>
           <w:tcPr>
-            <w:tcW w:w="2644" w:type="dxa"/>
+            <w:tcW w:w="2638" w:type="dxa"/>
           </w:tcPr>
           <w:p>
             <w:pPr>
@@ -7368,7 +8087,7 @@
       <w:tr>
         <w:tc>
           <w:tcPr>
-            <w:tcW w:w="1952" w:type="dxa"/>
+            <w:tcW w:w="1972" w:type="dxa"/>
           </w:tcPr>
           <w:p>
             <w:pPr>
@@ -7491,7 +8210,7 @@
         </w:tc>
         <w:tc>
           <w:tcPr>
-            <w:tcW w:w="3772" w:type="dxa"/>
+            <w:tcW w:w="3758" w:type="dxa"/>
           </w:tcPr>
           <w:p>
             <w:pPr>
@@ -7561,7 +8280,7 @@
         </w:tc>
         <w:tc>
           <w:tcPr>
-            <w:tcW w:w="2644" w:type="dxa"/>
+            <w:tcW w:w="2638" w:type="dxa"/>
           </w:tcPr>
           <w:p>
             <w:pPr>
@@ -7585,7 +8304,7 @@
       <w:tr>
         <w:tc>
           <w:tcPr>
-            <w:tcW w:w="1952" w:type="dxa"/>
+            <w:tcW w:w="1972" w:type="dxa"/>
           </w:tcPr>
           <w:p>
             <w:pPr>
@@ -7678,7 +8397,7 @@
         </w:tc>
         <w:tc>
           <w:tcPr>
-            <w:tcW w:w="3772" w:type="dxa"/>
+            <w:tcW w:w="3758" w:type="dxa"/>
           </w:tcPr>
           <w:p>
             <w:pPr>
@@ -7722,7 +8441,7 @@
         </w:tc>
         <w:tc>
           <w:tcPr>
-            <w:tcW w:w="2644" w:type="dxa"/>
+            <w:tcW w:w="2638" w:type="dxa"/>
           </w:tcPr>
           <w:p>
             <w:pPr>
@@ -7746,7 +8465,7 @@
       <w:tr>
         <w:tc>
           <w:tcPr>
-            <w:tcW w:w="1952" w:type="dxa"/>
+            <w:tcW w:w="1972" w:type="dxa"/>
           </w:tcPr>
           <w:p>
             <w:pPr>
@@ -7839,7 +8558,7 @@
         </w:tc>
         <w:tc>
           <w:tcPr>
-            <w:tcW w:w="3772" w:type="dxa"/>
+            <w:tcW w:w="3758" w:type="dxa"/>
           </w:tcPr>
           <w:p>
             <w:pPr>
@@ -7883,7 +8602,7 @@
         </w:tc>
         <w:tc>
           <w:tcPr>
-            <w:tcW w:w="2644" w:type="dxa"/>
+            <w:tcW w:w="2638" w:type="dxa"/>
           </w:tcPr>
           <w:p>
             <w:pPr>
@@ -7907,7 +8626,7 @@
       <w:tr>
         <w:tc>
           <w:tcPr>
-            <w:tcW w:w="1952" w:type="dxa"/>
+            <w:tcW w:w="1972" w:type="dxa"/>
           </w:tcPr>
           <w:p>
             <w:pPr>
@@ -7919,7 +8638,7 @@
               <w:pageBreakBefore w:val="0"/>
             </w:pPr>
             <m:oMath>
-              <m:sSubSup>
+              <m:sSub>
                 <m:e>
                   <m:r>
                     <m:t>L</m:t>
@@ -7929,8 +8648,12 @@
                   <m:r>
                     <m:t>i</m:t>
                   </m:r>
-                </m:sub>
-                <m:sup>
+                  <m:r>
+                    <m:rPr>
+                      <m:sty m:val="p"/>
+                    </m:rPr>
+                    <m:t>,</m:t>
+                  </m:r>
                   <m:r>
                     <m:rPr>
                       <m:sty m:val="p"/>
@@ -7949,8 +8672,8 @@
                     </m:rPr>
                     <m:t>T</m:t>
                   </m:r>
-                </m:sup>
-              </m:sSubSup>
+                </m:sub>
+              </m:sSub>
             </m:oMath>
             <w:r>
               <w:rPr>
@@ -7967,7 +8690,7 @@
               <w:t xml:space="preserve"> </w:t>
             </w:r>
             <m:oMath>
-              <m:sSubSup>
+              <m:sSub>
                 <m:e>
                   <m:r>
                     <m:t>L</m:t>
@@ -7977,8 +8700,12 @@
                   <m:r>
                     <m:t>i</m:t>
                   </m:r>
-                </m:sub>
-                <m:sup>
+                  <m:r>
+                    <m:rPr>
+                      <m:sty m:val="p"/>
+                    </m:rPr>
+                    <m:t>,</m:t>
+                  </m:r>
                   <m:r>
                     <m:rPr>
                       <m:sty m:val="p"/>
@@ -8003,14 +8730,14 @@
                     </m:rPr>
                     <m:t>D</m:t>
                   </m:r>
-                </m:sup>
-              </m:sSubSup>
+                </m:sub>
+              </m:sSub>
             </m:oMath>
           </w:p>
         </w:tc>
         <w:tc>
           <w:tcPr>
-            <w:tcW w:w="3772" w:type="dxa"/>
+            <w:tcW w:w="3758" w:type="dxa"/>
           </w:tcPr>
           <w:p>
             <w:pPr>
@@ -8080,7 +8807,7 @@
         </w:tc>
         <w:tc>
           <w:tcPr>
-            <w:tcW w:w="2644" w:type="dxa"/>
+            <w:tcW w:w="2638" w:type="dxa"/>
           </w:tcPr>
           <w:p>
             <w:pPr>
@@ -8104,7 +8831,7 @@
       <w:tr>
         <w:tc>
           <w:tcPr>
-            <w:tcW w:w="1952" w:type="dxa"/>
+            <w:tcW w:w="1972" w:type="dxa"/>
           </w:tcPr>
           <w:p>
             <w:pPr>
@@ -8136,7 +8863,7 @@
         </w:tc>
         <w:tc>
           <w:tcPr>
-            <w:tcW w:w="3772" w:type="dxa"/>
+            <w:tcW w:w="3758" w:type="dxa"/>
           </w:tcPr>
           <w:p>
             <w:pPr>
@@ -8206,7 +8933,7 @@
         </w:tc>
         <w:tc>
           <w:tcPr>
-            <w:tcW w:w="2644" w:type="dxa"/>
+            <w:tcW w:w="2638" w:type="dxa"/>
           </w:tcPr>
           <w:p>
             <w:pPr>
@@ -8230,7 +8957,7 @@
       <w:tr>
         <w:tc>
           <w:tcPr>
-            <w:tcW w:w="1952" w:type="dxa"/>
+            <w:tcW w:w="1972" w:type="dxa"/>
           </w:tcPr>
           <w:p>
             <w:pPr>
@@ -8265,7 +8992,7 @@
         </w:tc>
         <w:tc>
           <w:tcPr>
-            <w:tcW w:w="3772" w:type="dxa"/>
+            <w:tcW w:w="3758" w:type="dxa"/>
           </w:tcPr>
           <w:p>
             <w:pPr>
@@ -8335,7 +9062,7 @@
         </w:tc>
         <w:tc>
           <w:tcPr>
-            <w:tcW w:w="2644" w:type="dxa"/>
+            <w:tcW w:w="2638" w:type="dxa"/>
           </w:tcPr>
           <w:p>
             <w:pPr>
@@ -8359,7 +9086,7 @@
       <w:tr>
         <w:tc>
           <w:tcPr>
-            <w:tcW w:w="1952" w:type="dxa"/>
+            <w:tcW w:w="1972" w:type="dxa"/>
           </w:tcPr>
           <w:p>
             <w:pPr>
@@ -8452,7 +9179,7 @@
         </w:tc>
         <w:tc>
           <w:tcPr>
-            <w:tcW w:w="3772" w:type="dxa"/>
+            <w:tcW w:w="3758" w:type="dxa"/>
           </w:tcPr>
           <w:p>
             <w:pPr>
@@ -8496,7 +9223,7 @@
         </w:tc>
         <w:tc>
           <w:tcPr>
-            <w:tcW w:w="2644" w:type="dxa"/>
+            <w:tcW w:w="2638" w:type="dxa"/>
           </w:tcPr>
           <w:p>
             <w:pPr>
@@ -8520,7 +9247,7 @@
       <w:tr>
         <w:tc>
           <w:tcPr>
-            <w:tcW w:w="1952" w:type="dxa"/>
+            <w:tcW w:w="1972" w:type="dxa"/>
           </w:tcPr>
           <w:p>
             <w:pPr>
@@ -8613,7 +9340,7 @@
         </w:tc>
         <w:tc>
           <w:tcPr>
-            <w:tcW w:w="3772" w:type="dxa"/>
+            <w:tcW w:w="3758" w:type="dxa"/>
           </w:tcPr>
           <w:p>
             <w:pPr>
@@ -8657,7 +9384,7 @@
         </w:tc>
         <w:tc>
           <w:tcPr>
-            <w:tcW w:w="2644" w:type="dxa"/>
+            <w:tcW w:w="2638" w:type="dxa"/>
           </w:tcPr>
           <w:p>
             <w:pPr>
@@ -8681,7 +9408,7 @@
       <w:tr>
         <w:tc>
           <w:tcPr>
-            <w:tcW w:w="1952" w:type="dxa"/>
+            <w:tcW w:w="1972" w:type="dxa"/>
           </w:tcPr>
           <w:p>
             <w:pPr>
@@ -8693,13 +9420,37 @@
               <w:pageBreakBefore w:val="0"/>
             </w:pPr>
             <m:oMath>
-              <m:sSubSup>
+              <m:sSub>
                 <m:e>
                   <m:r>
                     <m:t>S</m:t>
                   </m:r>
                 </m:e>
                 <m:sub>
+                  <m:r>
+                    <m:rPr>
+                      <m:sty m:val="p"/>
+                    </m:rPr>
+                    <m:t>t</m:t>
+                  </m:r>
+                  <m:r>
+                    <m:rPr>
+                      <m:sty m:val="p"/>
+                    </m:rPr>
+                    <m:t>m</m:t>
+                  </m:r>
+                  <m:r>
+                    <m:rPr>
+                      <m:sty m:val="p"/>
+                    </m:rPr>
+                    <m:t>p</m:t>
+                  </m:r>
+                  <m:r>
+                    <m:rPr>
+                      <m:sty m:val="p"/>
+                    </m:rPr>
+                    <m:t>,</m:t>
+                  </m:r>
                   <m:r>
                     <m:rPr>
                       <m:sty m:val="p"/>
@@ -8719,7 +9470,30 @@
                     <m:t>T</m:t>
                   </m:r>
                 </m:sub>
-                <m:sup>
+              </m:sSub>
+            </m:oMath>
+            <w:r>
+              <w:rPr>
+                <w:sz w:val="24"/>
+                <w:szCs w:val="24"/>
+              </w:rPr>
+              <w:t xml:space="preserve">,</w:t>
+            </w:r>
+            <w:r>
+              <w:rPr>
+                <w:sz w:val="24"/>
+                <w:szCs w:val="24"/>
+              </w:rPr>
+              <w:t xml:space="preserve"> </w:t>
+            </w:r>
+            <m:oMath>
+              <m:sSub>
+                <m:e>
+                  <m:r>
+                    <m:t>S</m:t>
+                  </m:r>
+                </m:e>
+                <m:sub>
                   <m:r>
                     <m:rPr>
                       <m:sty m:val="p"/>
@@ -8738,31 +9512,12 @@
                     </m:rPr>
                     <m:t>p</m:t>
                   </m:r>
-                </m:sup>
-              </m:sSubSup>
-            </m:oMath>
-            <w:r>
-              <w:rPr>
-                <w:sz w:val="24"/>
-                <w:szCs w:val="24"/>
-              </w:rPr>
-              <w:t xml:space="preserve">,</w:t>
-            </w:r>
-            <w:r>
-              <w:rPr>
-                <w:sz w:val="24"/>
-                <w:szCs w:val="24"/>
-              </w:rPr>
-              <w:t xml:space="preserve"> </w:t>
-            </w:r>
-            <m:oMath>
-              <m:sSubSup>
-                <m:e>
                   <m:r>
-                    <m:t>S</m:t>
+                    <m:rPr>
+                      <m:sty m:val="p"/>
+                    </m:rPr>
+                    <m:t>,</m:t>
                   </m:r>
-                </m:e>
-                <m:sub>
                   <m:r>
                     <m:rPr>
                       <m:sty m:val="p"/>
@@ -8788,33 +9543,13 @@
                     <m:t>D</m:t>
                   </m:r>
                 </m:sub>
-                <m:sup>
-                  <m:r>
-                    <m:rPr>
-                      <m:sty m:val="p"/>
-                    </m:rPr>
-                    <m:t>t</m:t>
-                  </m:r>
-                  <m:r>
-                    <m:rPr>
-                      <m:sty m:val="p"/>
-                    </m:rPr>
-                    <m:t>m</m:t>
-                  </m:r>
-                  <m:r>
-                    <m:rPr>
-                      <m:sty m:val="p"/>
-                    </m:rPr>
-                    <m:t>p</m:t>
-                  </m:r>
-                </m:sup>
-              </m:sSubSup>
+              </m:sSub>
             </m:oMath>
           </w:p>
         </w:tc>
         <w:tc>
           <w:tcPr>
-            <w:tcW w:w="3772" w:type="dxa"/>
+            <w:tcW w:w="3758" w:type="dxa"/>
           </w:tcPr>
           <w:p>
             <w:pPr>
@@ -8858,7 +9593,7 @@
         </w:tc>
         <w:tc>
           <w:tcPr>
-            <w:tcW w:w="2644" w:type="dxa"/>
+            <w:tcW w:w="2638" w:type="dxa"/>
           </w:tcPr>
           <w:p>
             <w:pPr>
@@ -8882,7 +9617,7 @@
       <w:tr>
         <w:tc>
           <w:tcPr>
-            <w:tcW w:w="1952" w:type="dxa"/>
+            <w:tcW w:w="1972" w:type="dxa"/>
           </w:tcPr>
           <w:p>
             <w:pPr>
@@ -8894,13 +9629,37 @@
               <w:pageBreakBefore w:val="0"/>
             </w:pPr>
             <m:oMath>
-              <m:sSubSup>
+              <m:sSub>
                 <m:e>
                   <m:r>
                     <m:t>S</m:t>
                   </m:r>
                 </m:e>
                 <m:sub>
+                  <m:r>
+                    <m:rPr>
+                      <m:sty m:val="p"/>
+                    </m:rPr>
+                    <m:t>o</m:t>
+                  </m:r>
+                  <m:r>
+                    <m:rPr>
+                      <m:sty m:val="p"/>
+                    </m:rPr>
+                    <m:t>l</m:t>
+                  </m:r>
+                  <m:r>
+                    <m:rPr>
+                      <m:sty m:val="p"/>
+                    </m:rPr>
+                    <m:t>d</m:t>
+                  </m:r>
+                  <m:r>
+                    <m:rPr>
+                      <m:sty m:val="p"/>
+                    </m:rPr>
+                    <m:t>,</m:t>
+                  </m:r>
                   <m:r>
                     <m:rPr>
                       <m:sty m:val="p"/>
@@ -8920,7 +9679,30 @@
                     <m:t>T</m:t>
                   </m:r>
                 </m:sub>
-                <m:sup>
+              </m:sSub>
+            </m:oMath>
+            <w:r>
+              <w:rPr>
+                <w:sz w:val="24"/>
+                <w:szCs w:val="24"/>
+              </w:rPr>
+              <w:t xml:space="preserve">,</w:t>
+            </w:r>
+            <w:r>
+              <w:rPr>
+                <w:sz w:val="24"/>
+                <w:szCs w:val="24"/>
+              </w:rPr>
+              <w:t xml:space="preserve"> </w:t>
+            </w:r>
+            <m:oMath>
+              <m:sSub>
+                <m:e>
+                  <m:r>
+                    <m:t>S</m:t>
+                  </m:r>
+                </m:e>
+                <m:sub>
                   <m:r>
                     <m:rPr>
                       <m:sty m:val="p"/>
@@ -8939,31 +9721,12 @@
                     </m:rPr>
                     <m:t>d</m:t>
                   </m:r>
-                </m:sup>
-              </m:sSubSup>
-            </m:oMath>
-            <w:r>
-              <w:rPr>
-                <w:sz w:val="24"/>
-                <w:szCs w:val="24"/>
-              </w:rPr>
-              <w:t xml:space="preserve">,</w:t>
-            </w:r>
-            <w:r>
-              <w:rPr>
-                <w:sz w:val="24"/>
-                <w:szCs w:val="24"/>
-              </w:rPr>
-              <w:t xml:space="preserve"> </w:t>
-            </w:r>
-            <m:oMath>
-              <m:sSubSup>
-                <m:e>
                   <m:r>
-                    <m:t>S</m:t>
+                    <m:rPr>
+                      <m:sty m:val="p"/>
+                    </m:rPr>
+                    <m:t>,</m:t>
                   </m:r>
-                </m:e>
-                <m:sub>
                   <m:r>
                     <m:rPr>
                       <m:sty m:val="p"/>
@@ -8989,33 +9752,13 @@
                     <m:t>D</m:t>
                   </m:r>
                 </m:sub>
-                <m:sup>
-                  <m:r>
-                    <m:rPr>
-                      <m:sty m:val="p"/>
-                    </m:rPr>
-                    <m:t>o</m:t>
-                  </m:r>
-                  <m:r>
-                    <m:rPr>
-                      <m:sty m:val="p"/>
-                    </m:rPr>
-                    <m:t>l</m:t>
-                  </m:r>
-                  <m:r>
-                    <m:rPr>
-                      <m:sty m:val="p"/>
-                    </m:rPr>
-                    <m:t>d</m:t>
-                  </m:r>
-                </m:sup>
-              </m:sSubSup>
+              </m:sSub>
             </m:oMath>
           </w:p>
         </w:tc>
         <w:tc>
           <w:tcPr>
-            <w:tcW w:w="3772" w:type="dxa"/>
+            <w:tcW w:w="3758" w:type="dxa"/>
           </w:tcPr>
           <w:p>
             <w:pPr>
@@ -9059,7 +9802,7 @@
         </w:tc>
         <w:tc>
           <w:tcPr>
-            <w:tcW w:w="2644" w:type="dxa"/>
+            <w:tcW w:w="2638" w:type="dxa"/>
           </w:tcPr>
           <w:p>
             <w:pPr>
@@ -9083,7 +9826,7 @@
       <w:tr>
         <w:tc>
           <w:tcPr>
-            <w:tcW w:w="1952" w:type="dxa"/>
+            <w:tcW w:w="1972" w:type="dxa"/>
           </w:tcPr>
           <w:p>
             <w:pPr>
@@ -9103,7 +9846,7 @@
         </w:tc>
         <w:tc>
           <w:tcPr>
-            <w:tcW w:w="3772" w:type="dxa"/>
+            <w:tcW w:w="3758" w:type="dxa"/>
           </w:tcPr>
           <w:p>
             <w:pPr>
@@ -9147,7 +9890,7 @@
         </w:tc>
         <w:tc>
           <w:tcPr>
-            <w:tcW w:w="2644" w:type="dxa"/>
+            <w:tcW w:w="2638" w:type="dxa"/>
           </w:tcPr>
           <w:p>
             <w:pPr>
@@ -9171,7 +9914,7 @@
       <w:tr>
         <w:tc>
           <w:tcPr>
-            <w:tcW w:w="1952" w:type="dxa"/>
+            <w:tcW w:w="1972" w:type="dxa"/>
           </w:tcPr>
           <w:p>
             <w:pPr>
@@ -9191,7 +9934,7 @@
         </w:tc>
         <w:tc>
           <w:tcPr>
-            <w:tcW w:w="3772" w:type="dxa"/>
+            <w:tcW w:w="3758" w:type="dxa"/>
           </w:tcPr>
           <w:p>
             <w:pPr>
@@ -9235,7 +9978,7 @@
         </w:tc>
         <w:tc>
           <w:tcPr>
-            <w:tcW w:w="2644" w:type="dxa"/>
+            <w:tcW w:w="2638" w:type="dxa"/>
           </w:tcPr>
           <w:p>
             <w:pPr>
@@ -9259,7 +10002,7 @@
       <w:tr>
         <w:tc>
           <w:tcPr>
-            <w:tcW w:w="1952" w:type="dxa"/>
+            <w:tcW w:w="1972" w:type="dxa"/>
           </w:tcPr>
           <w:p>
             <w:pPr>
@@ -9294,7 +10037,7 @@
         </w:tc>
         <w:tc>
           <w:tcPr>
-            <w:tcW w:w="3772" w:type="dxa"/>
+            <w:tcW w:w="3758" w:type="dxa"/>
           </w:tcPr>
           <w:p>
             <w:pPr>
@@ -9338,7 +10081,7 @@
         </w:tc>
         <w:tc>
           <w:tcPr>
-            <w:tcW w:w="2644" w:type="dxa"/>
+            <w:tcW w:w="2638" w:type="dxa"/>
           </w:tcPr>
           <w:p>
             <w:pPr>
@@ -10153,7 +10896,7 @@
         <w:tab/>
       </w:r>
       <m:oMath>
-        <m:sSubSup>
+        <m:sSub>
           <m:e>
             <m:r>
               <m:t>L</m:t>
@@ -10163,8 +10906,12 @@
             <m:r>
               <m:t>i</m:t>
             </m:r>
-          </m:sub>
-          <m:sup>
+            <m:r>
+              <m:rPr>
+                <m:sty m:val="p"/>
+              </m:rPr>
+              <m:t>,</m:t>
+            </m:r>
             <m:r>
               <m:rPr>
                 <m:sty m:val="p"/>
@@ -10183,8 +10930,8 @@
               </m:rPr>
               <m:t>T</m:t>
             </m:r>
-          </m:sup>
-        </m:sSubSup>
+          </m:sub>
+        </m:sSub>
         <m:r>
           <m:rPr>
             <m:sty m:val="p"/>
@@ -10328,7 +11075,7 @@
         <w:t xml:space="preserve"> </w:t>
       </w:r>
       <m:oMath>
-        <m:sSubSup>
+        <m:sSub>
           <m:e>
             <m:r>
               <m:t>L</m:t>
@@ -10338,8 +11085,12 @@
             <m:r>
               <m:t>i</m:t>
             </m:r>
-          </m:sub>
-          <m:sup>
+            <m:r>
+              <m:rPr>
+                <m:sty m:val="p"/>
+              </m:rPr>
+              <m:t>,</m:t>
+            </m:r>
             <m:r>
               <m:rPr>
                 <m:sty m:val="p"/>
@@ -10358,8 +11109,8 @@
               </m:rPr>
               <m:t>T</m:t>
             </m:r>
-          </m:sup>
-        </m:sSubSup>
+          </m:sub>
+        </m:sSub>
       </m:oMath>
       <w:r>
         <w:t xml:space="preserve"> </w:t>
@@ -10471,7 +11222,7 @@
         <w:tab/>
       </w:r>
       <m:oMath>
-        <m:sSubSup>
+        <m:sSub>
           <m:e>
             <m:r>
               <m:t>L</m:t>
@@ -10481,8 +11232,12 @@
             <m:r>
               <m:t>i</m:t>
             </m:r>
-          </m:sub>
-          <m:sup>
+            <m:r>
+              <m:rPr>
+                <m:sty m:val="p"/>
+              </m:rPr>
+              <m:t>,</m:t>
+            </m:r>
             <m:r>
               <m:rPr>
                 <m:sty m:val="p"/>
@@ -10507,8 +11262,8 @@
               </m:rPr>
               <m:t>D</m:t>
             </m:r>
-          </m:sup>
-        </m:sSubSup>
+          </m:sub>
+        </m:sSub>
         <m:r>
           <m:rPr>
             <m:sty m:val="p"/>
@@ -10664,7 +11419,7 @@
         <w:t xml:space="preserve"> </w:t>
       </w:r>
       <m:oMath>
-        <m:sSubSup>
+        <m:sSub>
           <m:e>
             <m:r>
               <m:t>L</m:t>
@@ -10674,8 +11429,12 @@
             <m:r>
               <m:t>i</m:t>
             </m:r>
-          </m:sub>
-          <m:sup>
+            <m:r>
+              <m:rPr>
+                <m:sty m:val="p"/>
+              </m:rPr>
+              <m:t>,</m:t>
+            </m:r>
             <m:r>
               <m:rPr>
                 <m:sty m:val="p"/>
@@ -10700,8 +11459,8 @@
               </m:rPr>
               <m:t>D</m:t>
             </m:r>
-          </m:sup>
-        </m:sSubSup>
+          </m:sub>
+        </m:sSub>
       </m:oMath>
       <w:r>
         <w:t xml:space="preserve"> </w:t>
@@ -10770,7 +11529,7 @@
           </m:rPr>
           <m:t>=</m:t>
         </m:r>
-        <m:sSubSup>
+        <m:sSub>
           <m:e>
             <m:r>
               <m:t>L</m:t>
@@ -10780,8 +11539,12 @@
             <m:r>
               <m:t>i</m:t>
             </m:r>
-          </m:sub>
-          <m:sup>
+            <m:r>
+              <m:rPr>
+                <m:sty m:val="p"/>
+              </m:rPr>
+              <m:t>,</m:t>
+            </m:r>
             <m:r>
               <m:rPr>
                 <m:sty m:val="p"/>
@@ -10806,15 +11569,15 @@
               </m:rPr>
               <m:t>D</m:t>
             </m:r>
-          </m:sup>
-        </m:sSubSup>
+          </m:sub>
+        </m:sSub>
         <m:r>
           <m:rPr>
             <m:sty m:val="p"/>
           </m:rPr>
           <m:t>−</m:t>
         </m:r>
-        <m:sSubSup>
+        <m:sSub>
           <m:e>
             <m:r>
               <m:t>L</m:t>
@@ -10824,8 +11587,12 @@
             <m:r>
               <m:t>i</m:t>
             </m:r>
-          </m:sub>
-          <m:sup>
+            <m:r>
+              <m:rPr>
+                <m:sty m:val="p"/>
+              </m:rPr>
+              <m:t>,</m:t>
+            </m:r>
             <m:r>
               <m:rPr>
                 <m:sty m:val="p"/>
@@ -10844,8 +11611,8 @@
               </m:rPr>
               <m:t>T</m:t>
             </m:r>
-          </m:sup>
-        </m:sSubSup>
+          </m:sub>
+        </m:sSub>
       </m:oMath>
       <w:r>
         <w:tab/>
@@ -11073,9 +11840,33 @@
               </m:rPr>
               <m:t>∈</m:t>
             </m:r>
-            <m:r>
-              <m:t>I</m:t>
-            </m:r>
+            <m:sSub>
+              <m:e>
+                <m:r>
+                  <m:t>I</m:t>
+                </m:r>
+              </m:e>
+              <m:sub>
+                <m:r>
+                  <m:rPr>
+                    <m:sty m:val="p"/>
+                  </m:rPr>
+                  <m:t>H</m:t>
+                </m:r>
+                <m:r>
+                  <m:rPr>
+                    <m:sty m:val="p"/>
+                  </m:rPr>
+                  <m:t>O</m:t>
+                </m:r>
+                <m:r>
+                  <m:rPr>
+                    <m:sty m:val="p"/>
+                  </m:rPr>
+                  <m:t>T</m:t>
+                </m:r>
+              </m:sub>
+            </m:sSub>
           </m:sub>
           <m:sup>
             <m:r>
@@ -11086,7 +11877,10 @@
             <m:sSub>
               <m:e>
                 <m:r>
-                  <m:t>h</m:t>
+                  <m:rPr>
+                    <m:sty m:val="p"/>
+                  </m:rPr>
+                  <m:t>Δ</m:t>
                 </m:r>
               </m:e>
               <m:sub>
@@ -11097,21 +11891,6 @@
             </m:sSub>
           </m:e>
         </m:nary>
-        <m:sSub>
-          <m:e>
-            <m:r>
-              <m:rPr>
-                <m:sty m:val="p"/>
-              </m:rPr>
-              <m:t>Δ</m:t>
-            </m:r>
-          </m:e>
-          <m:sub>
-            <m:r>
-              <m:t>i</m:t>
-            </m:r>
-          </m:sub>
-        </m:sSub>
         <m:r>
           <m:rPr>
             <m:sty m:val="p"/>
@@ -11138,9 +11917,33 @@
               </m:rPr>
               <m:t>∈</m:t>
             </m:r>
-            <m:r>
-              <m:t>I</m:t>
-            </m:r>
+            <m:sSub>
+              <m:e>
+                <m:r>
+                  <m:t>I</m:t>
+                </m:r>
+              </m:e>
+              <m:sub>
+                <m:r>
+                  <m:rPr>
+                    <m:sty m:val="p"/>
+                  </m:rPr>
+                  <m:t>п</m:t>
+                </m:r>
+                <m:r>
+                  <m:rPr>
+                    <m:sty m:val="p"/>
+                  </m:rPr>
+                  <m:t>е</m:t>
+                </m:r>
+                <m:r>
+                  <m:rPr>
+                    <m:sty m:val="p"/>
+                  </m:rPr>
+                  <m:t>р</m:t>
+                </m:r>
+              </m:sub>
+            </m:sSub>
           </m:sub>
           <m:sup>
             <m:r>
@@ -11162,66 +11965,6 @@
             </m:sSub>
           </m:e>
         </m:nary>
-        <m:d>
-          <m:dPr>
-            <m:begChr m:val="|"/>
-            <m:sepChr m:val=""/>
-            <m:endChr m:val="|"/>
-            <m:grow/>
-          </m:dPr>
-          <m:e>
-            <m:sSub>
-              <m:e>
-                <m:r>
-                  <m:t>h</m:t>
-                </m:r>
-              </m:e>
-              <m:sub>
-                <m:r>
-                  <m:t>i</m:t>
-                </m:r>
-              </m:sub>
-            </m:sSub>
-            <m:r>
-              <m:rPr>
-                <m:sty m:val="p"/>
-              </m:rPr>
-              <m:t>−</m:t>
-            </m:r>
-            <m:sSubSup>
-              <m:e>
-                <m:r>
-                  <m:t>h</m:t>
-                </m:r>
-              </m:e>
-              <m:sub>
-                <m:r>
-                  <m:t>i</m:t>
-                </m:r>
-              </m:sub>
-              <m:sup>
-                <m:r>
-                  <m:rPr>
-                    <m:sty m:val="p"/>
-                  </m:rPr>
-                  <m:t>т</m:t>
-                </m:r>
-                <m:r>
-                  <m:rPr>
-                    <m:sty m:val="p"/>
-                  </m:rPr>
-                  <m:t>е</m:t>
-                </m:r>
-                <m:r>
-                  <m:rPr>
-                    <m:sty m:val="p"/>
-                  </m:rPr>
-                  <m:t>к</m:t>
-                </m:r>
-              </m:sup>
-            </m:sSubSup>
-          </m:e>
-        </m:d>
       </m:oMath>
       <w:r>
         <w:tab/>
@@ -11330,6 +12073,86 @@
         <w:pStyle w:val="Where"/>
       </w:pPr>
       <m:oMath>
+        <m:sSub>
+          <m:e>
+            <m:r>
+              <m:t>I</m:t>
+            </m:r>
+          </m:e>
+          <m:sub>
+            <m:r>
+              <m:rPr>
+                <m:sty m:val="p"/>
+              </m:rPr>
+              <m:t>H</m:t>
+            </m:r>
+            <m:r>
+              <m:rPr>
+                <m:sty m:val="p"/>
+              </m:rPr>
+              <m:t>O</m:t>
+            </m:r>
+            <m:r>
+              <m:rPr>
+                <m:sty m:val="p"/>
+              </m:rPr>
+              <m:t>T</m:t>
+            </m:r>
+          </m:sub>
+        </m:sSub>
+      </m:oMath>
+      <w:r>
+        <w:t xml:space="preserve"> </w:t>
+      </w:r>
+      <w:r>
+        <w:t xml:space="preserve">– множество объектов, размещённых по плану в HOT;</w:t>
+      </w:r>
+    </w:p>
+    <w:p>
+      <w:pPr>
+        <w:pStyle w:val="Where"/>
+      </w:pPr>
+      <m:oMath>
+        <m:sSub>
+          <m:e>
+            <m:r>
+              <m:t>I</m:t>
+            </m:r>
+          </m:e>
+          <m:sub>
+            <m:r>
+              <m:rPr>
+                <m:sty m:val="p"/>
+              </m:rPr>
+              <m:t>п</m:t>
+            </m:r>
+            <m:r>
+              <m:rPr>
+                <m:sty m:val="p"/>
+              </m:rPr>
+              <m:t>е</m:t>
+            </m:r>
+            <m:r>
+              <m:rPr>
+                <m:sty m:val="p"/>
+              </m:rPr>
+              <m:t>р</m:t>
+            </m:r>
+          </m:sub>
+        </m:sSub>
+      </m:oMath>
+      <w:r>
+        <w:t xml:space="preserve"> </w:t>
+      </w:r>
+      <w:r>
+        <w:t xml:space="preserve">– множество переносимых объектов;</w:t>
+      </w:r>
+    </w:p>
+    <w:p>
+      <w:pPr>
+        <w:pStyle w:val="Where"/>
+      </w:pPr>
+      <m:oMath>
         <m:r>
           <m:t>P</m:t>
         </m:r>
@@ -11346,7 +12169,7 @@
         <w:pStyle w:val="a2"/>
       </w:pPr>
       <w:r>
-        <w:t xml:space="preserve">Первая сумма – выигрыш объектов в HOT. Во второй сумме модуль разности равен 1 только у переносимых объектов, поэтому сумма равна объёму копирования, а вводимый в работе штраф</w:t>
+        <w:t xml:space="preserve">Первая сумма – выигрыш объектов в HOT. Вторая сумма – объём копирования переносимых объектов, а вводимый в работе штраф</w:t>
       </w:r>
       <w:r>
         <w:t xml:space="preserve"> </w:t>
@@ -11397,1010 +12220,33 @@
               </m:rPr>
               <m:t>∈</m:t>
             </m:r>
-            <m:r>
-              <m:t>I</m:t>
-            </m:r>
-          </m:sub>
-          <m:sup>
-            <m:r>
-              <m:t>​</m:t>
-            </m:r>
-          </m:sup>
-          <m:e>
             <m:sSub>
               <m:e>
                 <m:r>
-                  <m:t>h</m:t>
+                  <m:t>I</m:t>
                 </m:r>
               </m:e>
               <m:sub>
                 <m:r>
-                  <m:t>i</m:t>
+                  <m:rPr>
+                    <m:sty m:val="p"/>
+                  </m:rPr>
+                  <m:t>H</m:t>
+                </m:r>
+                <m:r>
+                  <m:rPr>
+                    <m:sty m:val="p"/>
+                  </m:rPr>
+                  <m:t>O</m:t>
+                </m:r>
+                <m:r>
+                  <m:rPr>
+                    <m:sty m:val="p"/>
+                  </m:rPr>
+                  <m:t>T</m:t>
                 </m:r>
               </m:sub>
             </m:sSub>
-          </m:e>
-        </m:nary>
-        <m:sSub>
-          <m:e>
-            <m:r>
-              <m:t>s</m:t>
-            </m:r>
-          </m:e>
-          <m:sub>
-            <m:r>
-              <m:t>i</m:t>
-            </m:r>
-          </m:sub>
-        </m:sSub>
-        <m:r>
-          <m:rPr>
-            <m:sty m:val="p"/>
-          </m:rPr>
-          <m:t>+</m:t>
-        </m:r>
-        <m:sSubSup>
-          <m:e>
-            <m:r>
-              <m:t>S</m:t>
-            </m:r>
-          </m:e>
-          <m:sub>
-            <m:r>
-              <m:rPr>
-                <m:sty m:val="p"/>
-              </m:rPr>
-              <m:t>H</m:t>
-            </m:r>
-            <m:r>
-              <m:rPr>
-                <m:sty m:val="p"/>
-              </m:rPr>
-              <m:t>O</m:t>
-            </m:r>
-            <m:r>
-              <m:rPr>
-                <m:sty m:val="p"/>
-              </m:rPr>
-              <m:t>T</m:t>
-            </m:r>
-          </m:sub>
-          <m:sup>
-            <m:r>
-              <m:rPr>
-                <m:sty m:val="p"/>
-              </m:rPr>
-              <m:t>t</m:t>
-            </m:r>
-            <m:r>
-              <m:rPr>
-                <m:sty m:val="p"/>
-              </m:rPr>
-              <m:t>m</m:t>
-            </m:r>
-            <m:r>
-              <m:rPr>
-                <m:sty m:val="p"/>
-              </m:rPr>
-              <m:t>p</m:t>
-            </m:r>
-          </m:sup>
-        </m:sSubSup>
-        <m:r>
-          <m:rPr>
-            <m:sty m:val="p"/>
-          </m:rPr>
-          <m:t>+</m:t>
-        </m:r>
-        <m:sSubSup>
-          <m:e>
-            <m:r>
-              <m:t>S</m:t>
-            </m:r>
-          </m:e>
-          <m:sub>
-            <m:r>
-              <m:rPr>
-                <m:sty m:val="p"/>
-              </m:rPr>
-              <m:t>H</m:t>
-            </m:r>
-            <m:r>
-              <m:rPr>
-                <m:sty m:val="p"/>
-              </m:rPr>
-              <m:t>O</m:t>
-            </m:r>
-            <m:r>
-              <m:rPr>
-                <m:sty m:val="p"/>
-              </m:rPr>
-              <m:t>T</m:t>
-            </m:r>
-          </m:sub>
-          <m:sup>
-            <m:r>
-              <m:rPr>
-                <m:sty m:val="p"/>
-              </m:rPr>
-              <m:t>o</m:t>
-            </m:r>
-            <m:r>
-              <m:rPr>
-                <m:sty m:val="p"/>
-              </m:rPr>
-              <m:t>l</m:t>
-            </m:r>
-            <m:r>
-              <m:rPr>
-                <m:sty m:val="p"/>
-              </m:rPr>
-              <m:t>d</m:t>
-            </m:r>
-          </m:sup>
-        </m:sSubSup>
-        <m:r>
-          <m:rPr>
-            <m:sty m:val="p"/>
-          </m:rPr>
-          <m:t>≤</m:t>
-        </m:r>
-        <m:sSub>
-          <m:e>
-            <m:r>
-              <m:t>u</m:t>
-            </m:r>
-          </m:e>
-          <m:sub>
-            <m:r>
-              <m:rPr>
-                <m:sty m:val="p"/>
-              </m:rPr>
-              <m:t>H</m:t>
-            </m:r>
-            <m:r>
-              <m:rPr>
-                <m:sty m:val="p"/>
-              </m:rPr>
-              <m:t>O</m:t>
-            </m:r>
-            <m:r>
-              <m:rPr>
-                <m:sty m:val="p"/>
-              </m:rPr>
-              <m:t>T</m:t>
-            </m:r>
-          </m:sub>
-        </m:sSub>
-        <m:sSub>
-          <m:e>
-            <m:r>
-              <m:t>C</m:t>
-            </m:r>
-          </m:e>
-          <m:sub>
-            <m:r>
-              <m:rPr>
-                <m:sty m:val="p"/>
-              </m:rPr>
-              <m:t>H</m:t>
-            </m:r>
-            <m:r>
-              <m:rPr>
-                <m:sty m:val="p"/>
-              </m:rPr>
-              <m:t>O</m:t>
-            </m:r>
-            <m:r>
-              <m:rPr>
-                <m:sty m:val="p"/>
-              </m:rPr>
-              <m:t>T</m:t>
-            </m:r>
-          </m:sub>
-        </m:sSub>
-      </m:oMath>
-      <w:r>
-        <w:tab/>
-      </w:r>
-      <w:r>
-        <w:rPr>
-          <w:rFonts w:ascii="Times New Roman" w:hAnsi="Times New Roman" w:cs="Times New Roman"/>
-          <w:sz w:val="28"/>
-          <w:szCs w:val="28"/>
-          <w:color w:val="000000"/>
-          <w:b w:val="0"/>
-          <w:i w:val="0"/>
-        </w:rPr>
-        <w:t>(2.7)</w:t>
-      </w:r>
-    </w:p>
-    <w:p>
-      <w:pPr>
-        <w:pStyle w:val="Where"/>
-      </w:pPr>
-      <w:r>
-        <w:t xml:space="preserve">где</w:t>
-      </w:r>
-      <w:r>
-        <w:t xml:space="preserve"> </w:t>
-      </w:r>
-      <m:oMath>
-        <m:sSubSup>
-          <m:e>
-            <m:r>
-              <m:t>S</m:t>
-            </m:r>
-          </m:e>
-          <m:sub>
-            <m:r>
-              <m:rPr>
-                <m:sty m:val="p"/>
-              </m:rPr>
-              <m:t>H</m:t>
-            </m:r>
-            <m:r>
-              <m:rPr>
-                <m:sty m:val="p"/>
-              </m:rPr>
-              <m:t>O</m:t>
-            </m:r>
-            <m:r>
-              <m:rPr>
-                <m:sty m:val="p"/>
-              </m:rPr>
-              <m:t>T</m:t>
-            </m:r>
-          </m:sub>
-          <m:sup>
-            <m:r>
-              <m:rPr>
-                <m:sty m:val="p"/>
-              </m:rPr>
-              <m:t>t</m:t>
-            </m:r>
-            <m:r>
-              <m:rPr>
-                <m:sty m:val="p"/>
-              </m:rPr>
-              <m:t>m</m:t>
-            </m:r>
-            <m:r>
-              <m:rPr>
-                <m:sty m:val="p"/>
-              </m:rPr>
-              <m:t>p</m:t>
-            </m:r>
-          </m:sup>
-        </m:sSubSup>
-      </m:oMath>
-      <w:r>
-        <w:t xml:space="preserve"> </w:t>
-      </w:r>
-      <w:r>
-        <w:t xml:space="preserve">– объём временных копий в HOT, МиБ;</w:t>
-      </w:r>
-    </w:p>
-    <w:p>
-      <w:pPr>
-        <w:pStyle w:val="Where"/>
-      </w:pPr>
-      <m:oMath>
-        <m:sSubSup>
-          <m:e>
-            <m:r>
-              <m:t>S</m:t>
-            </m:r>
-          </m:e>
-          <m:sub>
-            <m:r>
-              <m:rPr>
-                <m:sty m:val="p"/>
-              </m:rPr>
-              <m:t>H</m:t>
-            </m:r>
-            <m:r>
-              <m:rPr>
-                <m:sty m:val="p"/>
-              </m:rPr>
-              <m:t>O</m:t>
-            </m:r>
-            <m:r>
-              <m:rPr>
-                <m:sty m:val="p"/>
-              </m:rPr>
-              <m:t>T</m:t>
-            </m:r>
-          </m:sub>
-          <m:sup>
-            <m:r>
-              <m:rPr>
-                <m:sty m:val="p"/>
-              </m:rPr>
-              <m:t>o</m:t>
-            </m:r>
-            <m:r>
-              <m:rPr>
-                <m:sty m:val="p"/>
-              </m:rPr>
-              <m:t>l</m:t>
-            </m:r>
-            <m:r>
-              <m:rPr>
-                <m:sty m:val="p"/>
-              </m:rPr>
-              <m:t>d</m:t>
-            </m:r>
-          </m:sup>
-        </m:sSubSup>
-      </m:oMath>
-      <w:r>
-        <w:t xml:space="preserve"> </w:t>
-      </w:r>
-      <w:r>
-        <w:t xml:space="preserve">– объём предыдущих версий в HOT, МиБ;</w:t>
-      </w:r>
-    </w:p>
-    <w:p>
-      <w:pPr>
-        <w:pStyle w:val="Where"/>
-      </w:pPr>
-      <m:oMath>
-        <m:sSub>
-          <m:e>
-            <m:r>
-              <m:t>u</m:t>
-            </m:r>
-          </m:e>
-          <m:sub>
-            <m:r>
-              <m:rPr>
-                <m:sty m:val="p"/>
-              </m:rPr>
-              <m:t>H</m:t>
-            </m:r>
-            <m:r>
-              <m:rPr>
-                <m:sty m:val="p"/>
-              </m:rPr>
-              <m:t>O</m:t>
-            </m:r>
-            <m:r>
-              <m:rPr>
-                <m:sty m:val="p"/>
-              </m:rPr>
-              <m:t>T</m:t>
-            </m:r>
-          </m:sub>
-        </m:sSub>
-      </m:oMath>
-      <w:r>
-        <w:t xml:space="preserve"> </w:t>
-      </w:r>
-      <w:r>
-        <w:t xml:space="preserve">– допустимая доля занятости HOT;</w:t>
-      </w:r>
-    </w:p>
-    <w:p>
-      <w:pPr>
-        <w:pStyle w:val="Where"/>
-      </w:pPr>
-      <m:oMath>
-        <m:sSub>
-          <m:e>
-            <m:r>
-              <m:t>C</m:t>
-            </m:r>
-          </m:e>
-          <m:sub>
-            <m:r>
-              <m:rPr>
-                <m:sty m:val="p"/>
-              </m:rPr>
-              <m:t>H</m:t>
-            </m:r>
-            <m:r>
-              <m:rPr>
-                <m:sty m:val="p"/>
-              </m:rPr>
-              <m:t>O</m:t>
-            </m:r>
-            <m:r>
-              <m:rPr>
-                <m:sty m:val="p"/>
-              </m:rPr>
-              <m:t>T</m:t>
-            </m:r>
-          </m:sub>
-        </m:sSub>
-      </m:oMath>
-      <w:r>
-        <w:t xml:space="preserve"> </w:t>
-      </w:r>
-      <w:r>
-        <w:t xml:space="preserve">– ёмкость HOT, МиБ.</w:t>
-      </w:r>
-    </w:p>
-    <w:p>
-      <w:pPr>
-        <w:pStyle w:val="a2"/>
-      </w:pPr>
-      <w:r>
-        <w:t xml:space="preserve">Временные копии – это целевые копии выполняемых переносов, источники до удаления и неудалённые копии, учтённые в Metadata. Для COLD действует условие (2.8).</w:t>
-      </w:r>
-    </w:p>
-    <w:p>
-      <w:pPr>
-        <w:pStyle w:val="a2"/>
-        <w:spacing w:before="480" w:after="480" w:line="360" w:lineRule="auto"/>
-        <w:ind w:left="0" w:right="0" w:firstLine="0"/>
-        <w:jc w:val="left"/>
-        <w:keepNext w:val="1"/>
-        <w:pageBreakBefore w:val="0"/>
-        <w:tabs>
-          <w:tab w:val="center" w:pos="4819"/>
-          <w:tab w:val="right" w:pos="9638"/>
-        </w:tabs>
-      </w:pPr>
-      <w:r>
-        <w:tab/>
-      </w:r>
-      <m:oMath>
-        <m:nary>
-          <m:naryPr>
-            <m:chr m:val="∑"/>
-            <m:limLoc m:val="undOvr"/>
-            <m:subHide m:val="off"/>
-            <m:supHide m:val="on"/>
-          </m:naryPr>
-          <m:sub>
-            <m:r>
-              <m:t>i</m:t>
-            </m:r>
-            <m:r>
-              <m:rPr>
-                <m:sty m:val="p"/>
-              </m:rPr>
-              <m:t>∈</m:t>
-            </m:r>
-            <m:r>
-              <m:t>I</m:t>
-            </m:r>
-          </m:sub>
-          <m:sup>
-            <m:r>
-              <m:t>​</m:t>
-            </m:r>
-          </m:sup>
-          <m:e>
-            <m:r>
-              <m:rPr>
-                <m:sty m:val="p"/>
-              </m:rPr>
-              <m:t>(</m:t>
-            </m:r>
-          </m:e>
-        </m:nary>
-        <m:r>
-          <m:t>1</m:t>
-        </m:r>
-        <m:r>
-          <m:rPr>
-            <m:sty m:val="p"/>
-          </m:rPr>
-          <m:t>−</m:t>
-        </m:r>
-        <m:sSub>
-          <m:e>
-            <m:r>
-              <m:t>h</m:t>
-            </m:r>
-          </m:e>
-          <m:sub>
-            <m:r>
-              <m:t>i</m:t>
-            </m:r>
-          </m:sub>
-        </m:sSub>
-        <m:r>
-          <m:rPr>
-            <m:sty m:val="p"/>
-          </m:rPr>
-          <m:t>)</m:t>
-        </m:r>
-        <m:sSub>
-          <m:e>
-            <m:r>
-              <m:t>s</m:t>
-            </m:r>
-          </m:e>
-          <m:sub>
-            <m:r>
-              <m:t>i</m:t>
-            </m:r>
-          </m:sub>
-        </m:sSub>
-        <m:r>
-          <m:rPr>
-            <m:sty m:val="p"/>
-          </m:rPr>
-          <m:t>+</m:t>
-        </m:r>
-        <m:sSubSup>
-          <m:e>
-            <m:r>
-              <m:t>S</m:t>
-            </m:r>
-          </m:e>
-          <m:sub>
-            <m:r>
-              <m:rPr>
-                <m:sty m:val="p"/>
-              </m:rPr>
-              <m:t>C</m:t>
-            </m:r>
-            <m:r>
-              <m:rPr>
-                <m:sty m:val="p"/>
-              </m:rPr>
-              <m:t>O</m:t>
-            </m:r>
-            <m:r>
-              <m:rPr>
-                <m:sty m:val="p"/>
-              </m:rPr>
-              <m:t>L</m:t>
-            </m:r>
-            <m:r>
-              <m:rPr>
-                <m:sty m:val="p"/>
-              </m:rPr>
-              <m:t>D</m:t>
-            </m:r>
-          </m:sub>
-          <m:sup>
-            <m:r>
-              <m:rPr>
-                <m:sty m:val="p"/>
-              </m:rPr>
-              <m:t>t</m:t>
-            </m:r>
-            <m:r>
-              <m:rPr>
-                <m:sty m:val="p"/>
-              </m:rPr>
-              <m:t>m</m:t>
-            </m:r>
-            <m:r>
-              <m:rPr>
-                <m:sty m:val="p"/>
-              </m:rPr>
-              <m:t>p</m:t>
-            </m:r>
-          </m:sup>
-        </m:sSubSup>
-        <m:r>
-          <m:rPr>
-            <m:sty m:val="p"/>
-          </m:rPr>
-          <m:t>+</m:t>
-        </m:r>
-        <m:sSubSup>
-          <m:e>
-            <m:r>
-              <m:t>S</m:t>
-            </m:r>
-          </m:e>
-          <m:sub>
-            <m:r>
-              <m:rPr>
-                <m:sty m:val="p"/>
-              </m:rPr>
-              <m:t>C</m:t>
-            </m:r>
-            <m:r>
-              <m:rPr>
-                <m:sty m:val="p"/>
-              </m:rPr>
-              <m:t>O</m:t>
-            </m:r>
-            <m:r>
-              <m:rPr>
-                <m:sty m:val="p"/>
-              </m:rPr>
-              <m:t>L</m:t>
-            </m:r>
-            <m:r>
-              <m:rPr>
-                <m:sty m:val="p"/>
-              </m:rPr>
-              <m:t>D</m:t>
-            </m:r>
-          </m:sub>
-          <m:sup>
-            <m:r>
-              <m:rPr>
-                <m:sty m:val="p"/>
-              </m:rPr>
-              <m:t>o</m:t>
-            </m:r>
-            <m:r>
-              <m:rPr>
-                <m:sty m:val="p"/>
-              </m:rPr>
-              <m:t>l</m:t>
-            </m:r>
-            <m:r>
-              <m:rPr>
-                <m:sty m:val="p"/>
-              </m:rPr>
-              <m:t>d</m:t>
-            </m:r>
-          </m:sup>
-        </m:sSubSup>
-        <m:r>
-          <m:rPr>
-            <m:sty m:val="p"/>
-          </m:rPr>
-          <m:t>≤</m:t>
-        </m:r>
-        <m:sSub>
-          <m:e>
-            <m:r>
-              <m:t>u</m:t>
-            </m:r>
-          </m:e>
-          <m:sub>
-            <m:r>
-              <m:rPr>
-                <m:sty m:val="p"/>
-              </m:rPr>
-              <m:t>C</m:t>
-            </m:r>
-            <m:r>
-              <m:rPr>
-                <m:sty m:val="p"/>
-              </m:rPr>
-              <m:t>O</m:t>
-            </m:r>
-            <m:r>
-              <m:rPr>
-                <m:sty m:val="p"/>
-              </m:rPr>
-              <m:t>L</m:t>
-            </m:r>
-            <m:r>
-              <m:rPr>
-                <m:sty m:val="p"/>
-              </m:rPr>
-              <m:t>D</m:t>
-            </m:r>
-          </m:sub>
-        </m:sSub>
-        <m:sSub>
-          <m:e>
-            <m:r>
-              <m:t>C</m:t>
-            </m:r>
-          </m:e>
-          <m:sub>
-            <m:r>
-              <m:rPr>
-                <m:sty m:val="p"/>
-              </m:rPr>
-              <m:t>C</m:t>
-            </m:r>
-            <m:r>
-              <m:rPr>
-                <m:sty m:val="p"/>
-              </m:rPr>
-              <m:t>O</m:t>
-            </m:r>
-            <m:r>
-              <m:rPr>
-                <m:sty m:val="p"/>
-              </m:rPr>
-              <m:t>L</m:t>
-            </m:r>
-            <m:r>
-              <m:rPr>
-                <m:sty m:val="p"/>
-              </m:rPr>
-              <m:t>D</m:t>
-            </m:r>
-          </m:sub>
-        </m:sSub>
-      </m:oMath>
-      <w:r>
-        <w:tab/>
-      </w:r>
-      <w:r>
-        <w:rPr>
-          <w:rFonts w:ascii="Times New Roman" w:hAnsi="Times New Roman" w:cs="Times New Roman"/>
-          <w:sz w:val="28"/>
-          <w:szCs w:val="28"/>
-          <w:color w:val="000000"/>
-          <w:b w:val="0"/>
-          <w:i w:val="0"/>
-        </w:rPr>
-        <w:t>(2.8)</w:t>
-      </w:r>
-    </w:p>
-    <w:p>
-      <w:pPr>
-        <w:pStyle w:val="Where"/>
-      </w:pPr>
-      <w:r>
-        <w:t xml:space="preserve">где</w:t>
-      </w:r>
-      <w:r>
-        <w:t xml:space="preserve"> </w:t>
-      </w:r>
-      <m:oMath>
-        <m:sSubSup>
-          <m:e>
-            <m:r>
-              <m:t>S</m:t>
-            </m:r>
-          </m:e>
-          <m:sub>
-            <m:r>
-              <m:rPr>
-                <m:sty m:val="p"/>
-              </m:rPr>
-              <m:t>C</m:t>
-            </m:r>
-            <m:r>
-              <m:rPr>
-                <m:sty m:val="p"/>
-              </m:rPr>
-              <m:t>O</m:t>
-            </m:r>
-            <m:r>
-              <m:rPr>
-                <m:sty m:val="p"/>
-              </m:rPr>
-              <m:t>L</m:t>
-            </m:r>
-            <m:r>
-              <m:rPr>
-                <m:sty m:val="p"/>
-              </m:rPr>
-              <m:t>D</m:t>
-            </m:r>
-          </m:sub>
-          <m:sup>
-            <m:r>
-              <m:rPr>
-                <m:sty m:val="p"/>
-              </m:rPr>
-              <m:t>t</m:t>
-            </m:r>
-            <m:r>
-              <m:rPr>
-                <m:sty m:val="p"/>
-              </m:rPr>
-              <m:t>m</m:t>
-            </m:r>
-            <m:r>
-              <m:rPr>
-                <m:sty m:val="p"/>
-              </m:rPr>
-              <m:t>p</m:t>
-            </m:r>
-          </m:sup>
-        </m:sSubSup>
-      </m:oMath>
-      <w:r>
-        <w:t xml:space="preserve"> </w:t>
-      </w:r>
-      <w:r>
-        <w:t xml:space="preserve">– объём временных копий в COLD, МиБ;</w:t>
-      </w:r>
-    </w:p>
-    <w:p>
-      <w:pPr>
-        <w:pStyle w:val="Where"/>
-      </w:pPr>
-      <m:oMath>
-        <m:sSubSup>
-          <m:e>
-            <m:r>
-              <m:t>S</m:t>
-            </m:r>
-          </m:e>
-          <m:sub>
-            <m:r>
-              <m:rPr>
-                <m:sty m:val="p"/>
-              </m:rPr>
-              <m:t>C</m:t>
-            </m:r>
-            <m:r>
-              <m:rPr>
-                <m:sty m:val="p"/>
-              </m:rPr>
-              <m:t>O</m:t>
-            </m:r>
-            <m:r>
-              <m:rPr>
-                <m:sty m:val="p"/>
-              </m:rPr>
-              <m:t>L</m:t>
-            </m:r>
-            <m:r>
-              <m:rPr>
-                <m:sty m:val="p"/>
-              </m:rPr>
-              <m:t>D</m:t>
-            </m:r>
-          </m:sub>
-          <m:sup>
-            <m:r>
-              <m:rPr>
-                <m:sty m:val="p"/>
-              </m:rPr>
-              <m:t>o</m:t>
-            </m:r>
-            <m:r>
-              <m:rPr>
-                <m:sty m:val="p"/>
-              </m:rPr>
-              <m:t>l</m:t>
-            </m:r>
-            <m:r>
-              <m:rPr>
-                <m:sty m:val="p"/>
-              </m:rPr>
-              <m:t>d</m:t>
-            </m:r>
-          </m:sup>
-        </m:sSubSup>
-      </m:oMath>
-      <w:r>
-        <w:t xml:space="preserve"> </w:t>
-      </w:r>
-      <w:r>
-        <w:t xml:space="preserve">– объём предыдущих версий в COLD, МиБ;</w:t>
-      </w:r>
-    </w:p>
-    <w:p>
-      <w:pPr>
-        <w:pStyle w:val="Where"/>
-      </w:pPr>
-      <m:oMath>
-        <m:sSub>
-          <m:e>
-            <m:r>
-              <m:t>u</m:t>
-            </m:r>
-          </m:e>
-          <m:sub>
-            <m:r>
-              <m:rPr>
-                <m:sty m:val="p"/>
-              </m:rPr>
-              <m:t>C</m:t>
-            </m:r>
-            <m:r>
-              <m:rPr>
-                <m:sty m:val="p"/>
-              </m:rPr>
-              <m:t>O</m:t>
-            </m:r>
-            <m:r>
-              <m:rPr>
-                <m:sty m:val="p"/>
-              </m:rPr>
-              <m:t>L</m:t>
-            </m:r>
-            <m:r>
-              <m:rPr>
-                <m:sty m:val="p"/>
-              </m:rPr>
-              <m:t>D</m:t>
-            </m:r>
-          </m:sub>
-        </m:sSub>
-      </m:oMath>
-      <w:r>
-        <w:t xml:space="preserve"> </w:t>
-      </w:r>
-      <w:r>
-        <w:t xml:space="preserve">– допустимая доля занятости COLD;</w:t>
-      </w:r>
-    </w:p>
-    <w:p>
-      <w:pPr>
-        <w:pStyle w:val="Where"/>
-      </w:pPr>
-      <m:oMath>
-        <m:sSub>
-          <m:e>
-            <m:r>
-              <m:t>C</m:t>
-            </m:r>
-          </m:e>
-          <m:sub>
-            <m:r>
-              <m:rPr>
-                <m:sty m:val="p"/>
-              </m:rPr>
-              <m:t>C</m:t>
-            </m:r>
-            <m:r>
-              <m:rPr>
-                <m:sty m:val="p"/>
-              </m:rPr>
-              <m:t>O</m:t>
-            </m:r>
-            <m:r>
-              <m:rPr>
-                <m:sty m:val="p"/>
-              </m:rPr>
-              <m:t>L</m:t>
-            </m:r>
-            <m:r>
-              <m:rPr>
-                <m:sty m:val="p"/>
-              </m:rPr>
-              <m:t>D</m:t>
-            </m:r>
-          </m:sub>
-        </m:sSub>
-      </m:oMath>
-      <w:r>
-        <w:t xml:space="preserve"> </w:t>
-      </w:r>
-      <w:r>
-        <w:t xml:space="preserve">– ёмкость COLD, МиБ.</w:t>
-      </w:r>
-    </w:p>
-    <w:p>
-      <w:pPr>
-        <w:pStyle w:val="a2"/>
-      </w:pPr>
-      <w:r>
-        <w:t xml:space="preserve">Объём копирования за цикл ограничен бюджетом из раздела 1.3.5 пояснительной записки по условию (2.9).</w:t>
-      </w:r>
-    </w:p>
-    <w:p>
-      <w:pPr>
-        <w:pStyle w:val="a2"/>
-        <w:spacing w:before="480" w:after="480" w:line="360" w:lineRule="auto"/>
-        <w:ind w:left="0" w:right="0" w:firstLine="0"/>
-        <w:jc w:val="left"/>
-        <w:keepNext w:val="1"/>
-        <w:pageBreakBefore w:val="0"/>
-        <w:tabs>
-          <w:tab w:val="center" w:pos="4819"/>
-          <w:tab w:val="right" w:pos="9638"/>
-        </w:tabs>
-      </w:pPr>
-      <w:r>
-        <w:tab/>
-      </w:r>
-      <m:oMath>
-        <m:nary>
-          <m:naryPr>
-            <m:chr m:val="∑"/>
-            <m:limLoc m:val="undOvr"/>
-            <m:subHide m:val="off"/>
-            <m:supHide m:val="on"/>
-          </m:naryPr>
-          <m:sub>
-            <m:r>
-              <m:t>i</m:t>
-            </m:r>
-            <m:r>
-              <m:rPr>
-                <m:sty m:val="p"/>
-              </m:rPr>
-              <m:t>∈</m:t>
-            </m:r>
-            <m:r>
-              <m:t>I</m:t>
-            </m:r>
           </m:sub>
           <m:sup>
             <m:r>
@@ -12422,18 +12268,496 @@
             </m:sSub>
           </m:e>
         </m:nary>
-        <m:d>
-          <m:dPr>
-            <m:begChr m:val="|"/>
-            <m:sepChr m:val=""/>
-            <m:endChr m:val="|"/>
-            <m:grow/>
-          </m:dPr>
+        <m:r>
+          <m:rPr>
+            <m:sty m:val="p"/>
+          </m:rPr>
+          <m:t>+</m:t>
+        </m:r>
+        <m:sSub>
+          <m:e>
+            <m:r>
+              <m:t>S</m:t>
+            </m:r>
+          </m:e>
+          <m:sub>
+            <m:r>
+              <m:rPr>
+                <m:sty m:val="p"/>
+              </m:rPr>
+              <m:t>t</m:t>
+            </m:r>
+            <m:r>
+              <m:rPr>
+                <m:sty m:val="p"/>
+              </m:rPr>
+              <m:t>m</m:t>
+            </m:r>
+            <m:r>
+              <m:rPr>
+                <m:sty m:val="p"/>
+              </m:rPr>
+              <m:t>p</m:t>
+            </m:r>
+            <m:r>
+              <m:rPr>
+                <m:sty m:val="p"/>
+              </m:rPr>
+              <m:t>,</m:t>
+            </m:r>
+            <m:r>
+              <m:rPr>
+                <m:sty m:val="p"/>
+              </m:rPr>
+              <m:t>H</m:t>
+            </m:r>
+            <m:r>
+              <m:rPr>
+                <m:sty m:val="p"/>
+              </m:rPr>
+              <m:t>O</m:t>
+            </m:r>
+            <m:r>
+              <m:rPr>
+                <m:sty m:val="p"/>
+              </m:rPr>
+              <m:t>T</m:t>
+            </m:r>
+          </m:sub>
+        </m:sSub>
+        <m:r>
+          <m:rPr>
+            <m:sty m:val="p"/>
+          </m:rPr>
+          <m:t>+</m:t>
+        </m:r>
+        <m:sSub>
+          <m:e>
+            <m:r>
+              <m:t>S</m:t>
+            </m:r>
+          </m:e>
+          <m:sub>
+            <m:r>
+              <m:rPr>
+                <m:sty m:val="p"/>
+              </m:rPr>
+              <m:t>o</m:t>
+            </m:r>
+            <m:r>
+              <m:rPr>
+                <m:sty m:val="p"/>
+              </m:rPr>
+              <m:t>l</m:t>
+            </m:r>
+            <m:r>
+              <m:rPr>
+                <m:sty m:val="p"/>
+              </m:rPr>
+              <m:t>d</m:t>
+            </m:r>
+            <m:r>
+              <m:rPr>
+                <m:sty m:val="p"/>
+              </m:rPr>
+              <m:t>,</m:t>
+            </m:r>
+            <m:r>
+              <m:rPr>
+                <m:sty m:val="p"/>
+              </m:rPr>
+              <m:t>H</m:t>
+            </m:r>
+            <m:r>
+              <m:rPr>
+                <m:sty m:val="p"/>
+              </m:rPr>
+              <m:t>O</m:t>
+            </m:r>
+            <m:r>
+              <m:rPr>
+                <m:sty m:val="p"/>
+              </m:rPr>
+              <m:t>T</m:t>
+            </m:r>
+          </m:sub>
+        </m:sSub>
+        <m:r>
+          <m:rPr>
+            <m:sty m:val="p"/>
+          </m:rPr>
+          <m:t>≤</m:t>
+        </m:r>
+        <m:sSub>
+          <m:e>
+            <m:r>
+              <m:t>u</m:t>
+            </m:r>
+          </m:e>
+          <m:sub>
+            <m:r>
+              <m:rPr>
+                <m:sty m:val="p"/>
+              </m:rPr>
+              <m:t>H</m:t>
+            </m:r>
+            <m:r>
+              <m:rPr>
+                <m:sty m:val="p"/>
+              </m:rPr>
+              <m:t>O</m:t>
+            </m:r>
+            <m:r>
+              <m:rPr>
+                <m:sty m:val="p"/>
+              </m:rPr>
+              <m:t>T</m:t>
+            </m:r>
+          </m:sub>
+        </m:sSub>
+        <m:sSub>
+          <m:e>
+            <m:r>
+              <m:t>C</m:t>
+            </m:r>
+          </m:e>
+          <m:sub>
+            <m:r>
+              <m:rPr>
+                <m:sty m:val="p"/>
+              </m:rPr>
+              <m:t>H</m:t>
+            </m:r>
+            <m:r>
+              <m:rPr>
+                <m:sty m:val="p"/>
+              </m:rPr>
+              <m:t>O</m:t>
+            </m:r>
+            <m:r>
+              <m:rPr>
+                <m:sty m:val="p"/>
+              </m:rPr>
+              <m:t>T</m:t>
+            </m:r>
+          </m:sub>
+        </m:sSub>
+      </m:oMath>
+      <w:r>
+        <w:tab/>
+      </w:r>
+      <w:r>
+        <w:rPr>
+          <w:rFonts w:ascii="Times New Roman" w:hAnsi="Times New Roman" w:cs="Times New Roman"/>
+          <w:sz w:val="28"/>
+          <w:szCs w:val="28"/>
+          <w:color w:val="000000"/>
+          <w:b w:val="0"/>
+          <w:i w:val="0"/>
+        </w:rPr>
+        <w:t>(2.7)</w:t>
+      </w:r>
+    </w:p>
+    <w:p>
+      <w:pPr>
+        <w:pStyle w:val="Where"/>
+      </w:pPr>
+      <w:r>
+        <w:t xml:space="preserve">где</w:t>
+      </w:r>
+      <w:r>
+        <w:t xml:space="preserve"> </w:t>
+      </w:r>
+      <m:oMath>
+        <m:sSub>
+          <m:e>
+            <m:r>
+              <m:t>S</m:t>
+            </m:r>
+          </m:e>
+          <m:sub>
+            <m:r>
+              <m:rPr>
+                <m:sty m:val="p"/>
+              </m:rPr>
+              <m:t>t</m:t>
+            </m:r>
+            <m:r>
+              <m:rPr>
+                <m:sty m:val="p"/>
+              </m:rPr>
+              <m:t>m</m:t>
+            </m:r>
+            <m:r>
+              <m:rPr>
+                <m:sty m:val="p"/>
+              </m:rPr>
+              <m:t>p</m:t>
+            </m:r>
+            <m:r>
+              <m:rPr>
+                <m:sty m:val="p"/>
+              </m:rPr>
+              <m:t>,</m:t>
+            </m:r>
+            <m:r>
+              <m:rPr>
+                <m:sty m:val="p"/>
+              </m:rPr>
+              <m:t>H</m:t>
+            </m:r>
+            <m:r>
+              <m:rPr>
+                <m:sty m:val="p"/>
+              </m:rPr>
+              <m:t>O</m:t>
+            </m:r>
+            <m:r>
+              <m:rPr>
+                <m:sty m:val="p"/>
+              </m:rPr>
+              <m:t>T</m:t>
+            </m:r>
+          </m:sub>
+        </m:sSub>
+      </m:oMath>
+      <w:r>
+        <w:t xml:space="preserve"> </w:t>
+      </w:r>
+      <w:r>
+        <w:t xml:space="preserve">– объём временных копий в HOT, МиБ;</w:t>
+      </w:r>
+    </w:p>
+    <w:p>
+      <w:pPr>
+        <w:pStyle w:val="Where"/>
+      </w:pPr>
+      <m:oMath>
+        <m:sSub>
+          <m:e>
+            <m:r>
+              <m:t>S</m:t>
+            </m:r>
+          </m:e>
+          <m:sub>
+            <m:r>
+              <m:rPr>
+                <m:sty m:val="p"/>
+              </m:rPr>
+              <m:t>o</m:t>
+            </m:r>
+            <m:r>
+              <m:rPr>
+                <m:sty m:val="p"/>
+              </m:rPr>
+              <m:t>l</m:t>
+            </m:r>
+            <m:r>
+              <m:rPr>
+                <m:sty m:val="p"/>
+              </m:rPr>
+              <m:t>d</m:t>
+            </m:r>
+            <m:r>
+              <m:rPr>
+                <m:sty m:val="p"/>
+              </m:rPr>
+              <m:t>,</m:t>
+            </m:r>
+            <m:r>
+              <m:rPr>
+                <m:sty m:val="p"/>
+              </m:rPr>
+              <m:t>H</m:t>
+            </m:r>
+            <m:r>
+              <m:rPr>
+                <m:sty m:val="p"/>
+              </m:rPr>
+              <m:t>O</m:t>
+            </m:r>
+            <m:r>
+              <m:rPr>
+                <m:sty m:val="p"/>
+              </m:rPr>
+              <m:t>T</m:t>
+            </m:r>
+          </m:sub>
+        </m:sSub>
+      </m:oMath>
+      <w:r>
+        <w:t xml:space="preserve"> </w:t>
+      </w:r>
+      <w:r>
+        <w:t xml:space="preserve">– объём предыдущих версий в HOT, МиБ;</w:t>
+      </w:r>
+    </w:p>
+    <w:p>
+      <w:pPr>
+        <w:pStyle w:val="Where"/>
+      </w:pPr>
+      <m:oMath>
+        <m:sSub>
+          <m:e>
+            <m:r>
+              <m:t>u</m:t>
+            </m:r>
+          </m:e>
+          <m:sub>
+            <m:r>
+              <m:rPr>
+                <m:sty m:val="p"/>
+              </m:rPr>
+              <m:t>H</m:t>
+            </m:r>
+            <m:r>
+              <m:rPr>
+                <m:sty m:val="p"/>
+              </m:rPr>
+              <m:t>O</m:t>
+            </m:r>
+            <m:r>
+              <m:rPr>
+                <m:sty m:val="p"/>
+              </m:rPr>
+              <m:t>T</m:t>
+            </m:r>
+          </m:sub>
+        </m:sSub>
+      </m:oMath>
+      <w:r>
+        <w:t xml:space="preserve"> </w:t>
+      </w:r>
+      <w:r>
+        <w:t xml:space="preserve">– допустимая доля занятости HOT;</w:t>
+      </w:r>
+    </w:p>
+    <w:p>
+      <w:pPr>
+        <w:pStyle w:val="Where"/>
+      </w:pPr>
+      <m:oMath>
+        <m:sSub>
+          <m:e>
+            <m:r>
+              <m:t>C</m:t>
+            </m:r>
+          </m:e>
+          <m:sub>
+            <m:r>
+              <m:rPr>
+                <m:sty m:val="p"/>
+              </m:rPr>
+              <m:t>H</m:t>
+            </m:r>
+            <m:r>
+              <m:rPr>
+                <m:sty m:val="p"/>
+              </m:rPr>
+              <m:t>O</m:t>
+            </m:r>
+            <m:r>
+              <m:rPr>
+                <m:sty m:val="p"/>
+              </m:rPr>
+              <m:t>T</m:t>
+            </m:r>
+          </m:sub>
+        </m:sSub>
+      </m:oMath>
+      <w:r>
+        <w:t xml:space="preserve"> </w:t>
+      </w:r>
+      <w:r>
+        <w:t xml:space="preserve">– ёмкость HOT, МиБ.</w:t>
+      </w:r>
+    </w:p>
+    <w:p>
+      <w:pPr>
+        <w:pStyle w:val="a2"/>
+      </w:pPr>
+      <w:r>
+        <w:t xml:space="preserve">Временные копии – это целевые копии выполняемых переносов, источники до удаления и неудалённые копии, учтённые в Metadata. Для COLD действует условие (2.8).</w:t>
+      </w:r>
+    </w:p>
+    <w:p>
+      <w:pPr>
+        <w:pStyle w:val="a2"/>
+        <w:spacing w:before="480" w:after="480" w:line="360" w:lineRule="auto"/>
+        <w:ind w:left="0" w:right="0" w:firstLine="0"/>
+        <w:jc w:val="left"/>
+        <w:keepNext w:val="1"/>
+        <w:pageBreakBefore w:val="0"/>
+        <w:tabs>
+          <w:tab w:val="center" w:pos="4819"/>
+          <w:tab w:val="right" w:pos="9638"/>
+        </w:tabs>
+      </w:pPr>
+      <w:r>
+        <w:tab/>
+      </w:r>
+      <m:oMath>
+        <m:nary>
+          <m:naryPr>
+            <m:chr m:val="∑"/>
+            <m:limLoc m:val="undOvr"/>
+            <m:subHide m:val="off"/>
+            <m:supHide m:val="on"/>
+          </m:naryPr>
+          <m:sub>
+            <m:r>
+              <m:t>i</m:t>
+            </m:r>
+            <m:r>
+              <m:rPr>
+                <m:sty m:val="p"/>
+              </m:rPr>
+              <m:t>∈</m:t>
+            </m:r>
+            <m:sSub>
+              <m:e>
+                <m:r>
+                  <m:t>I</m:t>
+                </m:r>
+              </m:e>
+              <m:sub>
+                <m:r>
+                  <m:rPr>
+                    <m:sty m:val="p"/>
+                  </m:rPr>
+                  <m:t>C</m:t>
+                </m:r>
+                <m:r>
+                  <m:rPr>
+                    <m:sty m:val="p"/>
+                  </m:rPr>
+                  <m:t>O</m:t>
+                </m:r>
+                <m:r>
+                  <m:rPr>
+                    <m:sty m:val="p"/>
+                  </m:rPr>
+                  <m:t>L</m:t>
+                </m:r>
+                <m:r>
+                  <m:rPr>
+                    <m:sty m:val="p"/>
+                  </m:rPr>
+                  <m:t>D</m:t>
+                </m:r>
+              </m:sub>
+            </m:sSub>
+          </m:sub>
+          <m:sup>
+            <m:r>
+              <m:t>​</m:t>
+            </m:r>
+          </m:sup>
           <m:e>
             <m:sSub>
               <m:e>
                 <m:r>
-                  <m:t>h</m:t>
+                  <m:t>s</m:t>
                 </m:r>
               </m:e>
               <m:sub>
@@ -12442,29 +12766,560 @@
                 </m:r>
               </m:sub>
             </m:sSub>
+          </m:e>
+        </m:nary>
+        <m:r>
+          <m:rPr>
+            <m:sty m:val="p"/>
+          </m:rPr>
+          <m:t>+</m:t>
+        </m:r>
+        <m:sSub>
+          <m:e>
+            <m:r>
+              <m:t>S</m:t>
+            </m:r>
+          </m:e>
+          <m:sub>
             <m:r>
               <m:rPr>
                 <m:sty m:val="p"/>
               </m:rPr>
-              <m:t>−</m:t>
-            </m:r>
-            <m:sSubSup>
+              <m:t>t</m:t>
+            </m:r>
+            <m:r>
+              <m:rPr>
+                <m:sty m:val="p"/>
+              </m:rPr>
+              <m:t>m</m:t>
+            </m:r>
+            <m:r>
+              <m:rPr>
+                <m:sty m:val="p"/>
+              </m:rPr>
+              <m:t>p</m:t>
+            </m:r>
+            <m:r>
+              <m:rPr>
+                <m:sty m:val="p"/>
+              </m:rPr>
+              <m:t>,</m:t>
+            </m:r>
+            <m:r>
+              <m:rPr>
+                <m:sty m:val="p"/>
+              </m:rPr>
+              <m:t>C</m:t>
+            </m:r>
+            <m:r>
+              <m:rPr>
+                <m:sty m:val="p"/>
+              </m:rPr>
+              <m:t>O</m:t>
+            </m:r>
+            <m:r>
+              <m:rPr>
+                <m:sty m:val="p"/>
+              </m:rPr>
+              <m:t>L</m:t>
+            </m:r>
+            <m:r>
+              <m:rPr>
+                <m:sty m:val="p"/>
+              </m:rPr>
+              <m:t>D</m:t>
+            </m:r>
+          </m:sub>
+        </m:sSub>
+        <m:r>
+          <m:rPr>
+            <m:sty m:val="p"/>
+          </m:rPr>
+          <m:t>+</m:t>
+        </m:r>
+        <m:sSub>
+          <m:e>
+            <m:r>
+              <m:t>S</m:t>
+            </m:r>
+          </m:e>
+          <m:sub>
+            <m:r>
+              <m:rPr>
+                <m:sty m:val="p"/>
+              </m:rPr>
+              <m:t>o</m:t>
+            </m:r>
+            <m:r>
+              <m:rPr>
+                <m:sty m:val="p"/>
+              </m:rPr>
+              <m:t>l</m:t>
+            </m:r>
+            <m:r>
+              <m:rPr>
+                <m:sty m:val="p"/>
+              </m:rPr>
+              <m:t>d</m:t>
+            </m:r>
+            <m:r>
+              <m:rPr>
+                <m:sty m:val="p"/>
+              </m:rPr>
+              <m:t>,</m:t>
+            </m:r>
+            <m:r>
+              <m:rPr>
+                <m:sty m:val="p"/>
+              </m:rPr>
+              <m:t>C</m:t>
+            </m:r>
+            <m:r>
+              <m:rPr>
+                <m:sty m:val="p"/>
+              </m:rPr>
+              <m:t>O</m:t>
+            </m:r>
+            <m:r>
+              <m:rPr>
+                <m:sty m:val="p"/>
+              </m:rPr>
+              <m:t>L</m:t>
+            </m:r>
+            <m:r>
+              <m:rPr>
+                <m:sty m:val="p"/>
+              </m:rPr>
+              <m:t>D</m:t>
+            </m:r>
+          </m:sub>
+        </m:sSub>
+        <m:r>
+          <m:rPr>
+            <m:sty m:val="p"/>
+          </m:rPr>
+          <m:t>≤</m:t>
+        </m:r>
+        <m:sSub>
+          <m:e>
+            <m:r>
+              <m:t>u</m:t>
+            </m:r>
+          </m:e>
+          <m:sub>
+            <m:r>
+              <m:rPr>
+                <m:sty m:val="p"/>
+              </m:rPr>
+              <m:t>C</m:t>
+            </m:r>
+            <m:r>
+              <m:rPr>
+                <m:sty m:val="p"/>
+              </m:rPr>
+              <m:t>O</m:t>
+            </m:r>
+            <m:r>
+              <m:rPr>
+                <m:sty m:val="p"/>
+              </m:rPr>
+              <m:t>L</m:t>
+            </m:r>
+            <m:r>
+              <m:rPr>
+                <m:sty m:val="p"/>
+              </m:rPr>
+              <m:t>D</m:t>
+            </m:r>
+          </m:sub>
+        </m:sSub>
+        <m:sSub>
+          <m:e>
+            <m:r>
+              <m:t>C</m:t>
+            </m:r>
+          </m:e>
+          <m:sub>
+            <m:r>
+              <m:rPr>
+                <m:sty m:val="p"/>
+              </m:rPr>
+              <m:t>C</m:t>
+            </m:r>
+            <m:r>
+              <m:rPr>
+                <m:sty m:val="p"/>
+              </m:rPr>
+              <m:t>O</m:t>
+            </m:r>
+            <m:r>
+              <m:rPr>
+                <m:sty m:val="p"/>
+              </m:rPr>
+              <m:t>L</m:t>
+            </m:r>
+            <m:r>
+              <m:rPr>
+                <m:sty m:val="p"/>
+              </m:rPr>
+              <m:t>D</m:t>
+            </m:r>
+          </m:sub>
+        </m:sSub>
+      </m:oMath>
+      <w:r>
+        <w:tab/>
+      </w:r>
+      <w:r>
+        <w:rPr>
+          <w:rFonts w:ascii="Times New Roman" w:hAnsi="Times New Roman" w:cs="Times New Roman"/>
+          <w:sz w:val="28"/>
+          <w:szCs w:val="28"/>
+          <w:color w:val="000000"/>
+          <w:b w:val="0"/>
+          <w:i w:val="0"/>
+        </w:rPr>
+        <w:t>(2.8)</w:t>
+      </w:r>
+    </w:p>
+    <w:p>
+      <w:pPr>
+        <w:pStyle w:val="Where"/>
+      </w:pPr>
+      <w:r>
+        <w:t xml:space="preserve">где</w:t>
+      </w:r>
+      <w:r>
+        <w:t xml:space="preserve"> </w:t>
+      </w:r>
+      <m:oMath>
+        <m:sSub>
+          <m:e>
+            <m:r>
+              <m:t>I</m:t>
+            </m:r>
+          </m:e>
+          <m:sub>
+            <m:r>
+              <m:rPr>
+                <m:sty m:val="p"/>
+              </m:rPr>
+              <m:t>C</m:t>
+            </m:r>
+            <m:r>
+              <m:rPr>
+                <m:sty m:val="p"/>
+              </m:rPr>
+              <m:t>O</m:t>
+            </m:r>
+            <m:r>
+              <m:rPr>
+                <m:sty m:val="p"/>
+              </m:rPr>
+              <m:t>L</m:t>
+            </m:r>
+            <m:r>
+              <m:rPr>
+                <m:sty m:val="p"/>
+              </m:rPr>
+              <m:t>D</m:t>
+            </m:r>
+          </m:sub>
+        </m:sSub>
+      </m:oMath>
+      <w:r>
+        <w:t xml:space="preserve"> </w:t>
+      </w:r>
+      <w:r>
+        <w:t xml:space="preserve">– множество объектов, размещённых по плану в COLD;</w:t>
+      </w:r>
+    </w:p>
+    <w:p>
+      <w:pPr>
+        <w:pStyle w:val="Where"/>
+      </w:pPr>
+      <m:oMath>
+        <m:sSub>
+          <m:e>
+            <m:r>
+              <m:t>S</m:t>
+            </m:r>
+          </m:e>
+          <m:sub>
+            <m:r>
+              <m:rPr>
+                <m:sty m:val="p"/>
+              </m:rPr>
+              <m:t>t</m:t>
+            </m:r>
+            <m:r>
+              <m:rPr>
+                <m:sty m:val="p"/>
+              </m:rPr>
+              <m:t>m</m:t>
+            </m:r>
+            <m:r>
+              <m:rPr>
+                <m:sty m:val="p"/>
+              </m:rPr>
+              <m:t>p</m:t>
+            </m:r>
+            <m:r>
+              <m:rPr>
+                <m:sty m:val="p"/>
+              </m:rPr>
+              <m:t>,</m:t>
+            </m:r>
+            <m:r>
+              <m:rPr>
+                <m:sty m:val="p"/>
+              </m:rPr>
+              <m:t>C</m:t>
+            </m:r>
+            <m:r>
+              <m:rPr>
+                <m:sty m:val="p"/>
+              </m:rPr>
+              <m:t>O</m:t>
+            </m:r>
+            <m:r>
+              <m:rPr>
+                <m:sty m:val="p"/>
+              </m:rPr>
+              <m:t>L</m:t>
+            </m:r>
+            <m:r>
+              <m:rPr>
+                <m:sty m:val="p"/>
+              </m:rPr>
+              <m:t>D</m:t>
+            </m:r>
+          </m:sub>
+        </m:sSub>
+      </m:oMath>
+      <w:r>
+        <w:t xml:space="preserve"> </w:t>
+      </w:r>
+      <w:r>
+        <w:t xml:space="preserve">– объём временных копий в COLD, МиБ;</w:t>
+      </w:r>
+    </w:p>
+    <w:p>
+      <w:pPr>
+        <w:pStyle w:val="Where"/>
+      </w:pPr>
+      <m:oMath>
+        <m:sSub>
+          <m:e>
+            <m:r>
+              <m:t>S</m:t>
+            </m:r>
+          </m:e>
+          <m:sub>
+            <m:r>
+              <m:rPr>
+                <m:sty m:val="p"/>
+              </m:rPr>
+              <m:t>o</m:t>
+            </m:r>
+            <m:r>
+              <m:rPr>
+                <m:sty m:val="p"/>
+              </m:rPr>
+              <m:t>l</m:t>
+            </m:r>
+            <m:r>
+              <m:rPr>
+                <m:sty m:val="p"/>
+              </m:rPr>
+              <m:t>d</m:t>
+            </m:r>
+            <m:r>
+              <m:rPr>
+                <m:sty m:val="p"/>
+              </m:rPr>
+              <m:t>,</m:t>
+            </m:r>
+            <m:r>
+              <m:rPr>
+                <m:sty m:val="p"/>
+              </m:rPr>
+              <m:t>C</m:t>
+            </m:r>
+            <m:r>
+              <m:rPr>
+                <m:sty m:val="p"/>
+              </m:rPr>
+              <m:t>O</m:t>
+            </m:r>
+            <m:r>
+              <m:rPr>
+                <m:sty m:val="p"/>
+              </m:rPr>
+              <m:t>L</m:t>
+            </m:r>
+            <m:r>
+              <m:rPr>
+                <m:sty m:val="p"/>
+              </m:rPr>
+              <m:t>D</m:t>
+            </m:r>
+          </m:sub>
+        </m:sSub>
+      </m:oMath>
+      <w:r>
+        <w:t xml:space="preserve"> </w:t>
+      </w:r>
+      <w:r>
+        <w:t xml:space="preserve">– объём предыдущих версий в COLD, МиБ;</w:t>
+      </w:r>
+    </w:p>
+    <w:p>
+      <w:pPr>
+        <w:pStyle w:val="Where"/>
+      </w:pPr>
+      <m:oMath>
+        <m:sSub>
+          <m:e>
+            <m:r>
+              <m:t>u</m:t>
+            </m:r>
+          </m:e>
+          <m:sub>
+            <m:r>
+              <m:rPr>
+                <m:sty m:val="p"/>
+              </m:rPr>
+              <m:t>C</m:t>
+            </m:r>
+            <m:r>
+              <m:rPr>
+                <m:sty m:val="p"/>
+              </m:rPr>
+              <m:t>O</m:t>
+            </m:r>
+            <m:r>
+              <m:rPr>
+                <m:sty m:val="p"/>
+              </m:rPr>
+              <m:t>L</m:t>
+            </m:r>
+            <m:r>
+              <m:rPr>
+                <m:sty m:val="p"/>
+              </m:rPr>
+              <m:t>D</m:t>
+            </m:r>
+          </m:sub>
+        </m:sSub>
+      </m:oMath>
+      <w:r>
+        <w:t xml:space="preserve"> </w:t>
+      </w:r>
+      <w:r>
+        <w:t xml:space="preserve">– допустимая доля занятости COLD;</w:t>
+      </w:r>
+    </w:p>
+    <w:p>
+      <w:pPr>
+        <w:pStyle w:val="Where"/>
+      </w:pPr>
+      <m:oMath>
+        <m:sSub>
+          <m:e>
+            <m:r>
+              <m:t>C</m:t>
+            </m:r>
+          </m:e>
+          <m:sub>
+            <m:r>
+              <m:rPr>
+                <m:sty m:val="p"/>
+              </m:rPr>
+              <m:t>C</m:t>
+            </m:r>
+            <m:r>
+              <m:rPr>
+                <m:sty m:val="p"/>
+              </m:rPr>
+              <m:t>O</m:t>
+            </m:r>
+            <m:r>
+              <m:rPr>
+                <m:sty m:val="p"/>
+              </m:rPr>
+              <m:t>L</m:t>
+            </m:r>
+            <m:r>
+              <m:rPr>
+                <m:sty m:val="p"/>
+              </m:rPr>
+              <m:t>D</m:t>
+            </m:r>
+          </m:sub>
+        </m:sSub>
+      </m:oMath>
+      <w:r>
+        <w:t xml:space="preserve"> </w:t>
+      </w:r>
+      <w:r>
+        <w:t xml:space="preserve">– ёмкость COLD, МиБ.</w:t>
+      </w:r>
+    </w:p>
+    <w:p>
+      <w:pPr>
+        <w:pStyle w:val="a2"/>
+      </w:pPr>
+      <w:r>
+        <w:t xml:space="preserve">Объём копирования за цикл ограничен бюджетом из раздела 1.3.5 пояснительной записки по условию (2.9).</w:t>
+      </w:r>
+    </w:p>
+    <w:p>
+      <w:pPr>
+        <w:pStyle w:val="a2"/>
+        <w:spacing w:before="480" w:after="480" w:line="360" w:lineRule="auto"/>
+        <w:ind w:left="0" w:right="0" w:firstLine="0"/>
+        <w:jc w:val="left"/>
+        <w:keepNext w:val="1"/>
+        <w:pageBreakBefore w:val="0"/>
+        <w:tabs>
+          <w:tab w:val="center" w:pos="4819"/>
+          <w:tab w:val="right" w:pos="9638"/>
+        </w:tabs>
+      </w:pPr>
+      <w:r>
+        <w:tab/>
+      </w:r>
+      <m:oMath>
+        <m:nary>
+          <m:naryPr>
+            <m:chr m:val="∑"/>
+            <m:limLoc m:val="undOvr"/>
+            <m:subHide m:val="off"/>
+            <m:supHide m:val="on"/>
+          </m:naryPr>
+          <m:sub>
+            <m:r>
+              <m:t>i</m:t>
+            </m:r>
+            <m:r>
+              <m:rPr>
+                <m:sty m:val="p"/>
+              </m:rPr>
+              <m:t>∈</m:t>
+            </m:r>
+            <m:sSub>
               <m:e>
                 <m:r>
-                  <m:t>h</m:t>
+                  <m:t>I</m:t>
                 </m:r>
               </m:e>
               <m:sub>
                 <m:r>
-                  <m:t>i</m:t>
-                </m:r>
-              </m:sub>
-              <m:sup>
-                <m:r>
                   <m:rPr>
                     <m:sty m:val="p"/>
                   </m:rPr>
-                  <m:t>т</m:t>
+                  <m:t>п</m:t>
                 </m:r>
                 <m:r>
                   <m:rPr>
@@ -12476,12 +13331,31 @@
                   <m:rPr>
                     <m:sty m:val="p"/>
                   </m:rPr>
-                  <m:t>к</m:t>
+                  <m:t>р</m:t>
                 </m:r>
-              </m:sup>
-            </m:sSubSup>
+              </m:sub>
+            </m:sSub>
+          </m:sub>
+          <m:sup>
+            <m:r>
+              <m:t>​</m:t>
+            </m:r>
+          </m:sup>
+          <m:e>
+            <m:sSub>
+              <m:e>
+                <m:r>
+                  <m:t>s</m:t>
+                </m:r>
+              </m:e>
+              <m:sub>
+                <m:r>
+                  <m:t>i</m:t>
+                </m:r>
+              </m:sub>
+            </m:sSub>
           </m:e>
-        </m:d>
+        </m:nary>
         <m:r>
           <m:rPr>
             <m:sty m:val="p"/>

</xml_diff>

<commit_message>
Replace double indices in thesis formulas with single-index notation
</commit_message>
<xml_diff>
--- a/40 - Projects/Диплом/Диплом_ГОСТ.docx
+++ b/40 - Projects/Диплом/Диплом_ГОСТ.docx
@@ -5289,24 +5289,320 @@
         <m:sSub>
           <m:e>
             <m:r>
-              <m:t>h</m:t>
+              <m:t>g</m:t>
             </m:r>
           </m:e>
           <m:sub>
             <m:r>
               <m:t>i</m:t>
             </m:r>
+          </m:sub>
+        </m:sSub>
+      </m:oMath>
+      <w:r>
+        <w:t xml:space="preserve"> </w:t>
+      </w:r>
+      <w:r>
+        <w:t xml:space="preserve">– класс HOT или COLD, в котором объект хранится в момент</w:t>
+      </w:r>
+      <w:r>
+        <w:t xml:space="preserve"> </w:t>
+      </w:r>
+      <m:oMath>
+        <m:r>
+          <m:t>T</m:t>
+        </m:r>
+      </m:oMath>
+      <w:r>
+        <w:t xml:space="preserve">. Переменная решения</w:t>
+      </w:r>
+      <w:r>
+        <w:t xml:space="preserve"> </w:t>
+      </w:r>
+      <m:oMath>
+        <m:sSub>
+          <m:e>
+            <m:r>
+              <m:t>h</m:t>
+            </m:r>
+          </m:e>
+          <m:sub>
+            <m:r>
+              <m:t>i</m:t>
+            </m:r>
+          </m:sub>
+        </m:sSub>
+      </m:oMath>
+      <w:r>
+        <w:t xml:space="preserve"> </w:t>
+      </w:r>
+      <w:r>
+        <w:t xml:space="preserve">– класс, в котором объект будет храниться по плану. План</w:t>
+      </w:r>
+      <w:r>
+        <w:t xml:space="preserve"> </w:t>
+      </w:r>
+      <m:oMath>
+        <m:r>
+          <m:t>h</m:t>
+        </m:r>
+      </m:oMath>
+      <w:r>
+        <w:t xml:space="preserve"> </w:t>
+      </w:r>
+      <w:r>
+        <w:t xml:space="preserve">делит</w:t>
+      </w:r>
+      <w:r>
+        <w:t xml:space="preserve"> </w:t>
+      </w:r>
+      <m:oMath>
+        <m:r>
+          <m:t>I</m:t>
+        </m:r>
+      </m:oMath>
+      <w:r>
+        <w:t xml:space="preserve"> </w:t>
+      </w:r>
+      <w:r>
+        <w:t xml:space="preserve">на множество</w:t>
+      </w:r>
+      <w:r>
+        <w:t xml:space="preserve"> </w:t>
+      </w:r>
+      <m:oMath>
+        <m:sSub>
+          <m:e>
+            <m:r>
+              <m:t>I</m:t>
+            </m:r>
+          </m:e>
+          <m:sub>
             <m:r>
               <m:rPr>
                 <m:sty m:val="p"/>
               </m:rPr>
-              <m:t>,</m:t>
+              <m:t>H</m:t>
             </m:r>
             <m:r>
               <m:rPr>
                 <m:sty m:val="p"/>
               </m:rPr>
-              <m:t>т</m:t>
+              <m:t>O</m:t>
+            </m:r>
+            <m:r>
+              <m:rPr>
+                <m:sty m:val="p"/>
+              </m:rPr>
+              <m:t>T</m:t>
+            </m:r>
+          </m:sub>
+        </m:sSub>
+      </m:oMath>
+      <w:r>
+        <w:t xml:space="preserve"> </w:t>
+      </w:r>
+      <w:r>
+        <w:t xml:space="preserve">объектов с</w:t>
+      </w:r>
+      <w:r>
+        <w:t xml:space="preserve"> </w:t>
+      </w:r>
+      <m:oMath>
+        <m:sSub>
+          <m:e>
+            <m:r>
+              <m:t>h</m:t>
+            </m:r>
+          </m:e>
+          <m:sub>
+            <m:r>
+              <m:t>i</m:t>
+            </m:r>
+          </m:sub>
+        </m:sSub>
+        <m:r>
+          <m:rPr>
+            <m:sty m:val="p"/>
+          </m:rPr>
+          <m:t>=</m:t>
+        </m:r>
+        <m:r>
+          <m:rPr>
+            <m:sty m:val="p"/>
+          </m:rPr>
+          <m:t>H</m:t>
+        </m:r>
+        <m:r>
+          <m:rPr>
+            <m:sty m:val="p"/>
+          </m:rPr>
+          <m:t>O</m:t>
+        </m:r>
+        <m:r>
+          <m:rPr>
+            <m:sty m:val="p"/>
+          </m:rPr>
+          <m:t>T</m:t>
+        </m:r>
+      </m:oMath>
+      <w:r>
+        <w:t xml:space="preserve"> </w:t>
+      </w:r>
+      <w:r>
+        <w:t xml:space="preserve">и множество</w:t>
+      </w:r>
+      <w:r>
+        <w:t xml:space="preserve"> </w:t>
+      </w:r>
+      <m:oMath>
+        <m:sSub>
+          <m:e>
+            <m:r>
+              <m:t>I</m:t>
+            </m:r>
+          </m:e>
+          <m:sub>
+            <m:r>
+              <m:rPr>
+                <m:sty m:val="p"/>
+              </m:rPr>
+              <m:t>C</m:t>
+            </m:r>
+            <m:r>
+              <m:rPr>
+                <m:sty m:val="p"/>
+              </m:rPr>
+              <m:t>O</m:t>
+            </m:r>
+            <m:r>
+              <m:rPr>
+                <m:sty m:val="p"/>
+              </m:rPr>
+              <m:t>L</m:t>
+            </m:r>
+            <m:r>
+              <m:rPr>
+                <m:sty m:val="p"/>
+              </m:rPr>
+              <m:t>D</m:t>
+            </m:r>
+          </m:sub>
+        </m:sSub>
+      </m:oMath>
+      <w:r>
+        <w:t xml:space="preserve"> </w:t>
+      </w:r>
+      <w:r>
+        <w:t xml:space="preserve">объектов с</w:t>
+      </w:r>
+      <w:r>
+        <w:t xml:space="preserve"> </w:t>
+      </w:r>
+      <m:oMath>
+        <m:sSub>
+          <m:e>
+            <m:r>
+              <m:t>h</m:t>
+            </m:r>
+          </m:e>
+          <m:sub>
+            <m:r>
+              <m:t>i</m:t>
+            </m:r>
+          </m:sub>
+        </m:sSub>
+        <m:r>
+          <m:rPr>
+            <m:sty m:val="p"/>
+          </m:rPr>
+          <m:t>=</m:t>
+        </m:r>
+        <m:r>
+          <m:rPr>
+            <m:sty m:val="p"/>
+          </m:rPr>
+          <m:t>C</m:t>
+        </m:r>
+        <m:r>
+          <m:rPr>
+            <m:sty m:val="p"/>
+          </m:rPr>
+          <m:t>O</m:t>
+        </m:r>
+        <m:r>
+          <m:rPr>
+            <m:sty m:val="p"/>
+          </m:rPr>
+          <m:t>L</m:t>
+        </m:r>
+        <m:r>
+          <m:rPr>
+            <m:sty m:val="p"/>
+          </m:rPr>
+          <m:t>D</m:t>
+        </m:r>
+      </m:oMath>
+      <w:r>
+        <w:t xml:space="preserve">, а объекты с</w:t>
+      </w:r>
+      <w:r>
+        <w:t xml:space="preserve"> </w:t>
+      </w:r>
+      <m:oMath>
+        <m:sSub>
+          <m:e>
+            <m:r>
+              <m:t>h</m:t>
+            </m:r>
+          </m:e>
+          <m:sub>
+            <m:r>
+              <m:t>i</m:t>
+            </m:r>
+          </m:sub>
+        </m:sSub>
+        <m:r>
+          <m:rPr>
+            <m:sty m:val="p"/>
+          </m:rPr>
+          <m:t>≠</m:t>
+        </m:r>
+        <m:sSub>
+          <m:e>
+            <m:r>
+              <m:t>g</m:t>
+            </m:r>
+          </m:e>
+          <m:sub>
+            <m:r>
+              <m:t>i</m:t>
+            </m:r>
+          </m:sub>
+        </m:sSub>
+      </m:oMath>
+      <w:r>
+        <w:t xml:space="preserve"> </w:t>
+      </w:r>
+      <w:r>
+        <w:t xml:space="preserve">образуют множество переносимых объектов</w:t>
+      </w:r>
+      <w:r>
+        <w:t xml:space="preserve"> </w:t>
+      </w:r>
+      <m:oMath>
+        <m:sSub>
+          <m:e>
+            <m:r>
+              <m:t>I</m:t>
+            </m:r>
+          </m:e>
+          <m:sub>
+            <m:r>
+              <m:rPr>
+                <m:sty m:val="p"/>
+              </m:rPr>
+              <m:t>п</m:t>
             </m:r>
             <m:r>
               <m:rPr>
@@ -5318,27 +5614,33 @@
               <m:rPr>
                 <m:sty m:val="p"/>
               </m:rPr>
-              <m:t>к</m:t>
+              <m:t>р</m:t>
             </m:r>
           </m:sub>
         </m:sSub>
       </m:oMath>
       <w:r>
-        <w:t xml:space="preserve"> </w:t>
-      </w:r>
-      <w:r>
-        <w:t xml:space="preserve">– класс HOT или COLD, в котором объект хранится в момент</w:t>
+        <w:t xml:space="preserve">.</w:t>
+      </w:r>
+    </w:p>
+    <w:p>
+      <w:pPr>
+        <w:pStyle w:val="a2"/>
+        <w:keepNext w:val="1"/>
+      </w:pPr>
+      <w:r>
+        <w:t xml:space="preserve">Закреплёнными называются объекты с запретом переноса, участвующие в выполняемом переносе или перенесённые раньше минимального интервала. Они входят в</w:t>
       </w:r>
       <w:r>
         <w:t xml:space="preserve"> </w:t>
       </w:r>
       <m:oMath>
         <m:r>
-          <m:t>T</m:t>
+          <m:t>I</m:t>
         </m:r>
       </m:oMath>
       <w:r>
-        <w:t xml:space="preserve">. Переменная решения</w:t>
+        <w:t xml:space="preserve">, но для них</w:t>
       </w:r>
       <w:r>
         <w:t xml:space="preserve"> </w:t>
@@ -5356,40 +5658,44 @@
             </m:r>
           </m:sub>
         </m:sSub>
+        <m:r>
+          <m:rPr>
+            <m:sty m:val="p"/>
+          </m:rPr>
+          <m:t>=</m:t>
+        </m:r>
+        <m:sSub>
+          <m:e>
+            <m:r>
+              <m:t>g</m:t>
+            </m:r>
+          </m:e>
+          <m:sub>
+            <m:r>
+              <m:t>i</m:t>
+            </m:r>
+          </m:sub>
+        </m:sSub>
       </m:oMath>
       <w:r>
         <w:t xml:space="preserve"> </w:t>
       </w:r>
       <w:r>
-        <w:t xml:space="preserve">– класс, в котором объект будет храниться по плану. План</w:t>
+        <w:t xml:space="preserve">(требование F-05). Предыдущие версии объектов в</w:t>
       </w:r>
       <w:r>
         <w:t xml:space="preserve"> </w:t>
       </w:r>
       <m:oMath>
         <m:r>
-          <m:t>h</m:t>
+          <m:t>I</m:t>
         </m:r>
       </m:oMath>
       <w:r>
         <w:t xml:space="preserve"> </w:t>
       </w:r>
       <w:r>
-        <w:t xml:space="preserve">делит</w:t>
-      </w:r>
-      <w:r>
-        <w:t xml:space="preserve"> </w:t>
-      </w:r>
-      <m:oMath>
-        <m:r>
-          <m:t>I</m:t>
-        </m:r>
-      </m:oMath>
-      <w:r>
-        <w:t xml:space="preserve"> </w:t>
-      </w:r>
-      <w:r>
-        <w:t xml:space="preserve">на множество</w:t>
+        <w:t xml:space="preserve">не входят, но занимаемое ими место учитывается в ограничениях ёмкости как объём предыдущих версий</w:t>
       </w:r>
       <w:r>
         <w:t xml:space="preserve"> </w:t>
@@ -5398,7 +5704,7 @@
         <m:sSub>
           <m:e>
             <m:r>
-              <m:t>I</m:t>
+              <m:t>V</m:t>
             </m:r>
           </m:e>
           <m:sub>
@@ -5427,7 +5733,7 @@
         <w:t xml:space="preserve"> </w:t>
       </w:r>
       <w:r>
-        <w:t xml:space="preserve">объектов с</w:t>
+        <w:t xml:space="preserve">и</w:t>
       </w:r>
       <w:r>
         <w:t xml:space="preserve"> </w:t>
@@ -5436,54 +5742,7 @@
         <m:sSub>
           <m:e>
             <m:r>
-              <m:t>h</m:t>
-            </m:r>
-          </m:e>
-          <m:sub>
-            <m:r>
-              <m:t>i</m:t>
-            </m:r>
-          </m:sub>
-        </m:sSub>
-        <m:r>
-          <m:rPr>
-            <m:sty m:val="p"/>
-          </m:rPr>
-          <m:t>=</m:t>
-        </m:r>
-        <m:r>
-          <m:rPr>
-            <m:sty m:val="p"/>
-          </m:rPr>
-          <m:t>H</m:t>
-        </m:r>
-        <m:r>
-          <m:rPr>
-            <m:sty m:val="p"/>
-          </m:rPr>
-          <m:t>O</m:t>
-        </m:r>
-        <m:r>
-          <m:rPr>
-            <m:sty m:val="p"/>
-          </m:rPr>
-          <m:t>T</m:t>
-        </m:r>
-      </m:oMath>
-      <w:r>
-        <w:t xml:space="preserve"> </w:t>
-      </w:r>
-      <w:r>
-        <w:t xml:space="preserve">и множество</w:t>
-      </w:r>
-      <w:r>
-        <w:t xml:space="preserve"> </w:t>
-      </w:r>
-      <m:oMath>
-        <m:sSub>
-          <m:e>
-            <m:r>
-              <m:t>I</m:t>
+              <m:t>V</m:t>
             </m:r>
           </m:e>
           <m:sub>
@@ -5518,294 +5777,7 @@
         <w:t xml:space="preserve"> </w:t>
       </w:r>
       <w:r>
-        <w:t xml:space="preserve">объектов с</w:t>
-      </w:r>
-      <w:r>
-        <w:t xml:space="preserve"> </w:t>
-      </w:r>
-      <m:oMath>
-        <m:sSub>
-          <m:e>
-            <m:r>
-              <m:t>h</m:t>
-            </m:r>
-          </m:e>
-          <m:sub>
-            <m:r>
-              <m:t>i</m:t>
-            </m:r>
-          </m:sub>
-        </m:sSub>
-        <m:r>
-          <m:rPr>
-            <m:sty m:val="p"/>
-          </m:rPr>
-          <m:t>=</m:t>
-        </m:r>
-        <m:r>
-          <m:rPr>
-            <m:sty m:val="p"/>
-          </m:rPr>
-          <m:t>C</m:t>
-        </m:r>
-        <m:r>
-          <m:rPr>
-            <m:sty m:val="p"/>
-          </m:rPr>
-          <m:t>O</m:t>
-        </m:r>
-        <m:r>
-          <m:rPr>
-            <m:sty m:val="p"/>
-          </m:rPr>
-          <m:t>L</m:t>
-        </m:r>
-        <m:r>
-          <m:rPr>
-            <m:sty m:val="p"/>
-          </m:rPr>
-          <m:t>D</m:t>
-        </m:r>
-      </m:oMath>
-      <w:r>
-        <w:t xml:space="preserve">, а объекты с</w:t>
-      </w:r>
-      <w:r>
-        <w:t xml:space="preserve"> </w:t>
-      </w:r>
-      <m:oMath>
-        <m:sSub>
-          <m:e>
-            <m:r>
-              <m:t>h</m:t>
-            </m:r>
-          </m:e>
-          <m:sub>
-            <m:r>
-              <m:t>i</m:t>
-            </m:r>
-          </m:sub>
-        </m:sSub>
-        <m:r>
-          <m:rPr>
-            <m:sty m:val="p"/>
-          </m:rPr>
-          <m:t>≠</m:t>
-        </m:r>
-        <m:sSub>
-          <m:e>
-            <m:r>
-              <m:t>h</m:t>
-            </m:r>
-          </m:e>
-          <m:sub>
-            <m:r>
-              <m:t>i</m:t>
-            </m:r>
-            <m:r>
-              <m:rPr>
-                <m:sty m:val="p"/>
-              </m:rPr>
-              <m:t>,</m:t>
-            </m:r>
-            <m:r>
-              <m:rPr>
-                <m:sty m:val="p"/>
-              </m:rPr>
-              <m:t>т</m:t>
-            </m:r>
-            <m:r>
-              <m:rPr>
-                <m:sty m:val="p"/>
-              </m:rPr>
-              <m:t>е</m:t>
-            </m:r>
-            <m:r>
-              <m:rPr>
-                <m:sty m:val="p"/>
-              </m:rPr>
-              <m:t>к</m:t>
-            </m:r>
-          </m:sub>
-        </m:sSub>
-      </m:oMath>
-      <w:r>
-        <w:t xml:space="preserve"> </w:t>
-      </w:r>
-      <w:r>
-        <w:t xml:space="preserve">образуют множество переносимых объектов</w:t>
-      </w:r>
-      <w:r>
-        <w:t xml:space="preserve"> </w:t>
-      </w:r>
-      <m:oMath>
-        <m:sSub>
-          <m:e>
-            <m:r>
-              <m:t>I</m:t>
-            </m:r>
-          </m:e>
-          <m:sub>
-            <m:r>
-              <m:rPr>
-                <m:sty m:val="p"/>
-              </m:rPr>
-              <m:t>п</m:t>
-            </m:r>
-            <m:r>
-              <m:rPr>
-                <m:sty m:val="p"/>
-              </m:rPr>
-              <m:t>е</m:t>
-            </m:r>
-            <m:r>
-              <m:rPr>
-                <m:sty m:val="p"/>
-              </m:rPr>
-              <m:t>р</m:t>
-            </m:r>
-          </m:sub>
-        </m:sSub>
-      </m:oMath>
-      <w:r>
-        <w:t xml:space="preserve">.</w:t>
-      </w:r>
-    </w:p>
-    <w:p>
-      <w:pPr>
-        <w:pStyle w:val="a2"/>
-        <w:keepNext w:val="1"/>
-      </w:pPr>
-      <w:r>
-        <w:t xml:space="preserve">Закреплёнными называются объекты с запретом переноса, участвующие в выполняемом переносе или перенесённые раньше минимального интервала. Они входят в</w:t>
-      </w:r>
-      <w:r>
-        <w:t xml:space="preserve"> </w:t>
-      </w:r>
-      <m:oMath>
-        <m:r>
-          <m:t>I</m:t>
-        </m:r>
-      </m:oMath>
-      <w:r>
-        <w:t xml:space="preserve">, но для них</w:t>
-      </w:r>
-      <w:r>
-        <w:t xml:space="preserve"> </w:t>
-      </w:r>
-      <m:oMath>
-        <m:sSub>
-          <m:e>
-            <m:r>
-              <m:t>h</m:t>
-            </m:r>
-          </m:e>
-          <m:sub>
-            <m:r>
-              <m:t>i</m:t>
-            </m:r>
-          </m:sub>
-        </m:sSub>
-        <m:r>
-          <m:rPr>
-            <m:sty m:val="p"/>
-          </m:rPr>
-          <m:t>=</m:t>
-        </m:r>
-        <m:sSub>
-          <m:e>
-            <m:r>
-              <m:t>h</m:t>
-            </m:r>
-          </m:e>
-          <m:sub>
-            <m:r>
-              <m:t>i</m:t>
-            </m:r>
-            <m:r>
-              <m:rPr>
-                <m:sty m:val="p"/>
-              </m:rPr>
-              <m:t>,</m:t>
-            </m:r>
-            <m:r>
-              <m:rPr>
-                <m:sty m:val="p"/>
-              </m:rPr>
-              <m:t>т</m:t>
-            </m:r>
-            <m:r>
-              <m:rPr>
-                <m:sty m:val="p"/>
-              </m:rPr>
-              <m:t>е</m:t>
-            </m:r>
-            <m:r>
-              <m:rPr>
-                <m:sty m:val="p"/>
-              </m:rPr>
-              <m:t>к</m:t>
-            </m:r>
-          </m:sub>
-        </m:sSub>
-      </m:oMath>
-      <w:r>
-        <w:t xml:space="preserve"> </w:t>
-      </w:r>
-      <w:r>
-        <w:t xml:space="preserve">(требование F-05). Предыдущие версии объектов в</w:t>
-      </w:r>
-      <w:r>
-        <w:t xml:space="preserve"> </w:t>
-      </w:r>
-      <m:oMath>
-        <m:r>
-          <m:t>I</m:t>
-        </m:r>
-      </m:oMath>
-      <w:r>
-        <w:t xml:space="preserve"> </w:t>
-      </w:r>
-      <w:r>
-        <w:t xml:space="preserve">не входят, но занимаемое ими место учитывается в ограничениях ёмкости как объём предыдущих версий</w:t>
-      </w:r>
-      <w:r>
-        <w:t xml:space="preserve"> </w:t>
-      </w:r>
-      <m:oMath>
-        <m:sSub>
-          <m:e>
-            <m:r>
-              <m:t>S</m:t>
-            </m:r>
-          </m:e>
-          <m:sub>
-            <m:r>
-              <m:rPr>
-                <m:sty m:val="p"/>
-              </m:rPr>
-              <m:t>o</m:t>
-            </m:r>
-            <m:r>
-              <m:rPr>
-                <m:sty m:val="p"/>
-              </m:rPr>
-              <m:t>l</m:t>
-            </m:r>
-            <m:r>
-              <m:rPr>
-                <m:sty m:val="p"/>
-              </m:rPr>
-              <m:t>d</m:t>
-            </m:r>
-          </m:sub>
-        </m:sSub>
-      </m:oMath>
-      <w:r>
-        <w:t xml:space="preserve"> </w:t>
-      </w:r>
-      <w:r>
-        <w:t xml:space="preserve">в классе. Все обозначения модели размещения с единицами и источниками значений приведены в Таблице 2.1.</w:t>
+        <w:t xml:space="preserve">в классах. Все обозначения модели размещения с единицами и источниками значений приведены в Таблице 2.1.</w:t>
       </w:r>
     </w:p>
     <w:bookmarkStart w:id="55" w:name="gost-tbl:notation"/>
@@ -5840,10 +5812,10 @@
         <w:tblCaption w:val="Таблица 2.1 – Обозначения модели размещения"/>
       </w:tblPr>
       <w:tblGrid>
-        <w:gridCol w:w="1972"/>
-        <w:gridCol w:w="3758"/>
+        <w:gridCol w:w="1909"/>
+        <w:gridCol w:w="3803"/>
         <w:gridCol w:w="1270"/>
-        <w:gridCol w:w="2638"/>
+        <w:gridCol w:w="2656"/>
       </w:tblGrid>
       <w:tr>
         <w:trPr>
@@ -5851,7 +5823,7 @@
         </w:trPr>
         <w:tc>
           <w:tcPr>
-            <w:tcW w:w="1972" w:type="dxa"/>
+            <w:tcW w:w="1909" w:type="dxa"/>
           </w:tcPr>
           <w:p>
             <w:pPr>
@@ -5874,7 +5846,7 @@
         </w:tc>
         <w:tc>
           <w:tcPr>
-            <w:tcW w:w="3758" w:type="dxa"/>
+            <w:tcW w:w="3803" w:type="dxa"/>
           </w:tcPr>
           <w:p>
             <w:pPr>
@@ -5920,7 +5892,7 @@
         </w:tc>
         <w:tc>
           <w:tcPr>
-            <w:tcW w:w="2638" w:type="dxa"/>
+            <w:tcW w:w="2656" w:type="dxa"/>
           </w:tcPr>
           <w:p>
             <w:pPr>
@@ -5945,7 +5917,7 @@
       <w:tr>
         <w:tc>
           <w:tcPr>
-            <w:tcW w:w="1972" w:type="dxa"/>
+            <w:tcW w:w="1909" w:type="dxa"/>
           </w:tcPr>
           <w:p>
             <w:pPr>
@@ -5965,7 +5937,7 @@
         </w:tc>
         <w:tc>
           <w:tcPr>
-            <w:tcW w:w="3758" w:type="dxa"/>
+            <w:tcW w:w="3803" w:type="dxa"/>
           </w:tcPr>
           <w:p>
             <w:pPr>
@@ -6009,7 +5981,7 @@
         </w:tc>
         <w:tc>
           <w:tcPr>
-            <w:tcW w:w="2638" w:type="dxa"/>
+            <w:tcW w:w="2656" w:type="dxa"/>
           </w:tcPr>
           <w:p>
             <w:pPr>
@@ -6033,7 +6005,7 @@
       <w:tr>
         <w:tc>
           <w:tcPr>
-            <w:tcW w:w="1972" w:type="dxa"/>
+            <w:tcW w:w="1909" w:type="dxa"/>
           </w:tcPr>
           <w:p>
             <w:pPr>
@@ -6053,7 +6025,7 @@
         </w:tc>
         <w:tc>
           <w:tcPr>
-            <w:tcW w:w="3758" w:type="dxa"/>
+            <w:tcW w:w="3803" w:type="dxa"/>
           </w:tcPr>
           <w:p>
             <w:pPr>
@@ -6109,7 +6081,7 @@
         </w:tc>
         <w:tc>
           <w:tcPr>
-            <w:tcW w:w="2638" w:type="dxa"/>
+            <w:tcW w:w="2656" w:type="dxa"/>
           </w:tcPr>
           <w:p>
             <w:pPr>
@@ -6133,7 +6105,7 @@
       <w:tr>
         <w:tc>
           <w:tcPr>
-            <w:tcW w:w="1972" w:type="dxa"/>
+            <w:tcW w:w="1909" w:type="dxa"/>
           </w:tcPr>
           <w:p>
             <w:pPr>
@@ -6153,7 +6125,7 @@
         </w:tc>
         <w:tc>
           <w:tcPr>
-            <w:tcW w:w="3758" w:type="dxa"/>
+            <w:tcW w:w="3803" w:type="dxa"/>
           </w:tcPr>
           <w:p>
             <w:pPr>
@@ -6209,7 +6181,7 @@
         </w:tc>
         <w:tc>
           <w:tcPr>
-            <w:tcW w:w="2638" w:type="dxa"/>
+            <w:tcW w:w="2656" w:type="dxa"/>
           </w:tcPr>
           <w:p>
             <w:pPr>
@@ -6245,7 +6217,7 @@
       <w:tr>
         <w:tc>
           <w:tcPr>
-            <w:tcW w:w="1972" w:type="dxa"/>
+            <w:tcW w:w="1909" w:type="dxa"/>
           </w:tcPr>
           <w:p>
             <w:pPr>
@@ -6274,7 +6246,7 @@
         </w:tc>
         <w:tc>
           <w:tcPr>
-            <w:tcW w:w="3758" w:type="dxa"/>
+            <w:tcW w:w="3803" w:type="dxa"/>
           </w:tcPr>
           <w:p>
             <w:pPr>
@@ -6330,7 +6302,7 @@
         </w:tc>
         <w:tc>
           <w:tcPr>
-            <w:tcW w:w="2638" w:type="dxa"/>
+            <w:tcW w:w="2656" w:type="dxa"/>
           </w:tcPr>
           <w:p>
             <w:pPr>
@@ -6354,7 +6326,7 @@
       <w:tr>
         <w:tc>
           <w:tcPr>
-            <w:tcW w:w="1972" w:type="dxa"/>
+            <w:tcW w:w="1909" w:type="dxa"/>
           </w:tcPr>
           <w:p>
             <w:pPr>
@@ -6369,37 +6341,13 @@
               <m:sSub>
                 <m:e>
                   <m:r>
-                    <m:t>h</m:t>
+                    <m:t>g</m:t>
                   </m:r>
                 </m:e>
                 <m:sub>
                   <m:r>
                     <m:t>i</m:t>
                   </m:r>
-                  <m:r>
-                    <m:rPr>
-                      <m:sty m:val="p"/>
-                    </m:rPr>
-                    <m:t>,</m:t>
-                  </m:r>
-                  <m:r>
-                    <m:rPr>
-                      <m:sty m:val="p"/>
-                    </m:rPr>
-                    <m:t>т</m:t>
-                  </m:r>
-                  <m:r>
-                    <m:rPr>
-                      <m:sty m:val="p"/>
-                    </m:rPr>
-                    <m:t>е</m:t>
-                  </m:r>
-                  <m:r>
-                    <m:rPr>
-                      <m:sty m:val="p"/>
-                    </m:rPr>
-                    <m:t>к</m:t>
-                  </m:r>
                 </m:sub>
               </m:sSub>
             </m:oMath>
@@ -6407,7 +6355,7 @@
         </w:tc>
         <w:tc>
           <w:tcPr>
-            <w:tcW w:w="3758" w:type="dxa"/>
+            <w:tcW w:w="3803" w:type="dxa"/>
           </w:tcPr>
           <w:p>
             <w:pPr>
@@ -6470,7 +6418,7 @@
         </w:tc>
         <w:tc>
           <w:tcPr>
-            <w:tcW w:w="2638" w:type="dxa"/>
+            <w:tcW w:w="2656" w:type="dxa"/>
           </w:tcPr>
           <w:p>
             <w:pPr>
@@ -6494,7 +6442,7 @@
       <w:tr>
         <w:tc>
           <w:tcPr>
-            <w:tcW w:w="1972" w:type="dxa"/>
+            <w:tcW w:w="1909" w:type="dxa"/>
           </w:tcPr>
           <w:p>
             <w:pPr>
@@ -6523,7 +6471,7 @@
         </w:tc>
         <w:tc>
           <w:tcPr>
-            <w:tcW w:w="3758" w:type="dxa"/>
+            <w:tcW w:w="3803" w:type="dxa"/>
           </w:tcPr>
           <w:p>
             <w:pPr>
@@ -6593,7 +6541,7 @@
         </w:tc>
         <w:tc>
           <w:tcPr>
-            <w:tcW w:w="2638" w:type="dxa"/>
+            <w:tcW w:w="2656" w:type="dxa"/>
           </w:tcPr>
           <w:p>
             <w:pPr>
@@ -6617,7 +6565,7 @@
       <w:tr>
         <w:tc>
           <w:tcPr>
-            <w:tcW w:w="1972" w:type="dxa"/>
+            <w:tcW w:w="1909" w:type="dxa"/>
           </w:tcPr>
           <w:p>
             <w:pPr>
@@ -6637,7 +6585,7 @@
         </w:tc>
         <w:tc>
           <w:tcPr>
-            <w:tcW w:w="3758" w:type="dxa"/>
+            <w:tcW w:w="3803" w:type="dxa"/>
           </w:tcPr>
           <w:p>
             <w:pPr>
@@ -6732,7 +6680,7 @@
         </w:tc>
         <w:tc>
           <w:tcPr>
-            <w:tcW w:w="2638" w:type="dxa"/>
+            <w:tcW w:w="2656" w:type="dxa"/>
           </w:tcPr>
           <w:p>
             <w:pPr>
@@ -6756,7 +6704,7 @@
       <w:tr>
         <w:tc>
           <w:tcPr>
-            <w:tcW w:w="1972" w:type="dxa"/>
+            <w:tcW w:w="1909" w:type="dxa"/>
           </w:tcPr>
           <w:p>
             <w:pPr>
@@ -6849,7 +6797,7 @@
         </w:tc>
         <w:tc>
           <w:tcPr>
-            <w:tcW w:w="3758" w:type="dxa"/>
+            <w:tcW w:w="3803" w:type="dxa"/>
           </w:tcPr>
           <w:p>
             <w:pPr>
@@ -6919,7 +6867,7 @@
         </w:tc>
         <w:tc>
           <w:tcPr>
-            <w:tcW w:w="2638" w:type="dxa"/>
+            <w:tcW w:w="2656" w:type="dxa"/>
           </w:tcPr>
           <w:p>
             <w:pPr>
@@ -6955,7 +6903,7 @@
       <w:tr>
         <w:tc>
           <w:tcPr>
-            <w:tcW w:w="1972" w:type="dxa"/>
+            <w:tcW w:w="1909" w:type="dxa"/>
           </w:tcPr>
           <w:p>
             <w:pPr>
@@ -6999,7 +6947,7 @@
         </w:tc>
         <w:tc>
           <w:tcPr>
-            <w:tcW w:w="3758" w:type="dxa"/>
+            <w:tcW w:w="3803" w:type="dxa"/>
           </w:tcPr>
           <w:p>
             <w:pPr>
@@ -7046,37 +6994,13 @@
               <m:sSub>
                 <m:e>
                   <m:r>
-                    <m:t>h</m:t>
+                    <m:t>g</m:t>
                   </m:r>
                 </m:e>
                 <m:sub>
                   <m:r>
                     <m:t>i</m:t>
                   </m:r>
-                  <m:r>
-                    <m:rPr>
-                      <m:sty m:val="p"/>
-                    </m:rPr>
-                    <m:t>,</m:t>
-                  </m:r>
-                  <m:r>
-                    <m:rPr>
-                      <m:sty m:val="p"/>
-                    </m:rPr>
-                    <m:t>т</m:t>
-                  </m:r>
-                  <m:r>
-                    <m:rPr>
-                      <m:sty m:val="p"/>
-                    </m:rPr>
-                    <m:t>е</m:t>
-                  </m:r>
-                  <m:r>
-                    <m:rPr>
-                      <m:sty m:val="p"/>
-                    </m:rPr>
-                    <m:t>к</m:t>
-                  </m:r>
                 </m:sub>
               </m:sSub>
             </m:oMath>
@@ -7106,7 +7030,7 @@
         </w:tc>
         <w:tc>
           <w:tcPr>
-            <w:tcW w:w="2638" w:type="dxa"/>
+            <w:tcW w:w="2656" w:type="dxa"/>
           </w:tcPr>
           <w:p>
             <w:pPr>
@@ -7142,7 +7066,7 @@
       <w:tr>
         <w:tc>
           <w:tcPr>
-            <w:tcW w:w="1972" w:type="dxa"/>
+            <w:tcW w:w="1909" w:type="dxa"/>
           </w:tcPr>
           <w:p>
             <w:pPr>
@@ -7162,7 +7086,7 @@
         </w:tc>
         <w:tc>
           <w:tcPr>
-            <w:tcW w:w="3758" w:type="dxa"/>
+            <w:tcW w:w="3803" w:type="dxa"/>
           </w:tcPr>
           <w:p>
             <w:pPr>
@@ -7206,7 +7130,7 @@
         </w:tc>
         <w:tc>
           <w:tcPr>
-            <w:tcW w:w="2638" w:type="dxa"/>
+            <w:tcW w:w="2656" w:type="dxa"/>
           </w:tcPr>
           <w:p>
             <w:pPr>
@@ -7230,7 +7154,7 @@
       <w:tr>
         <w:tc>
           <w:tcPr>
-            <w:tcW w:w="1972" w:type="dxa"/>
+            <w:tcW w:w="1909" w:type="dxa"/>
           </w:tcPr>
           <w:p>
             <w:pPr>
@@ -7274,7 +7198,7 @@
         </w:tc>
         <w:tc>
           <w:tcPr>
-            <w:tcW w:w="3758" w:type="dxa"/>
+            <w:tcW w:w="3803" w:type="dxa"/>
           </w:tcPr>
           <w:p>
             <w:pPr>
@@ -7414,7 +7338,7 @@
         </w:tc>
         <w:tc>
           <w:tcPr>
-            <w:tcW w:w="2638" w:type="dxa"/>
+            <w:tcW w:w="2656" w:type="dxa"/>
           </w:tcPr>
           <w:p>
             <w:pPr>
@@ -7438,7 +7362,7 @@
       <w:tr>
         <w:tc>
           <w:tcPr>
-            <w:tcW w:w="1972" w:type="dxa"/>
+            <w:tcW w:w="1909" w:type="dxa"/>
           </w:tcPr>
           <w:p>
             <w:pPr>
@@ -7474,7 +7398,7 @@
         </w:tc>
         <w:tc>
           <w:tcPr>
-            <w:tcW w:w="3758" w:type="dxa"/>
+            <w:tcW w:w="3803" w:type="dxa"/>
           </w:tcPr>
           <w:p>
             <w:pPr>
@@ -7586,7 +7510,7 @@
         </w:tc>
         <w:tc>
           <w:tcPr>
-            <w:tcW w:w="2638" w:type="dxa"/>
+            <w:tcW w:w="2656" w:type="dxa"/>
           </w:tcPr>
           <w:p>
             <w:pPr>
@@ -7610,7 +7534,7 @@
       <w:tr>
         <w:tc>
           <w:tcPr>
-            <w:tcW w:w="1972" w:type="dxa"/>
+            <w:tcW w:w="1909" w:type="dxa"/>
           </w:tcPr>
           <w:p>
             <w:pPr>
@@ -7639,7 +7563,7 @@
         </w:tc>
         <w:tc>
           <w:tcPr>
-            <w:tcW w:w="3758" w:type="dxa"/>
+            <w:tcW w:w="3803" w:type="dxa"/>
           </w:tcPr>
           <w:p>
             <w:pPr>
@@ -7702,7 +7626,7 @@
         </w:tc>
         <w:tc>
           <w:tcPr>
-            <w:tcW w:w="2638" w:type="dxa"/>
+            <w:tcW w:w="2656" w:type="dxa"/>
           </w:tcPr>
           <w:p>
             <w:pPr>
@@ -7726,7 +7650,7 @@
       <w:tr>
         <w:tc>
           <w:tcPr>
-            <w:tcW w:w="1972" w:type="dxa"/>
+            <w:tcW w:w="1909" w:type="dxa"/>
           </w:tcPr>
           <w:p>
             <w:pPr>
@@ -7762,7 +7686,7 @@
         </w:tc>
         <w:tc>
           <w:tcPr>
-            <w:tcW w:w="3758" w:type="dxa"/>
+            <w:tcW w:w="3803" w:type="dxa"/>
           </w:tcPr>
           <w:p>
             <w:pPr>
@@ -7884,7 +7808,7 @@
         </w:tc>
         <w:tc>
           <w:tcPr>
-            <w:tcW w:w="2638" w:type="dxa"/>
+            <w:tcW w:w="2656" w:type="dxa"/>
           </w:tcPr>
           <w:p>
             <w:pPr>
@@ -7999,7 +7923,7 @@
       <w:tr>
         <w:tc>
           <w:tcPr>
-            <w:tcW w:w="1972" w:type="dxa"/>
+            <w:tcW w:w="1909" w:type="dxa"/>
           </w:tcPr>
           <w:p>
             <w:pPr>
@@ -8019,7 +7943,7 @@
         </w:tc>
         <w:tc>
           <w:tcPr>
-            <w:tcW w:w="3758" w:type="dxa"/>
+            <w:tcW w:w="3803" w:type="dxa"/>
           </w:tcPr>
           <w:p>
             <w:pPr>
@@ -8063,7 +7987,7 @@
         </w:tc>
         <w:tc>
           <w:tcPr>
-            <w:tcW w:w="2638" w:type="dxa"/>
+            <w:tcW w:w="2656" w:type="dxa"/>
           </w:tcPr>
           <w:p>
             <w:pPr>
@@ -8087,7 +8011,7 @@
       <w:tr>
         <w:tc>
           <w:tcPr>
-            <w:tcW w:w="1972" w:type="dxa"/>
+            <w:tcW w:w="1909" w:type="dxa"/>
           </w:tcPr>
           <w:p>
             <w:pPr>
@@ -8210,7 +8134,7 @@
         </w:tc>
         <w:tc>
           <w:tcPr>
-            <w:tcW w:w="3758" w:type="dxa"/>
+            <w:tcW w:w="3803" w:type="dxa"/>
           </w:tcPr>
           <w:p>
             <w:pPr>
@@ -8280,7 +8204,7 @@
         </w:tc>
         <w:tc>
           <w:tcPr>
-            <w:tcW w:w="2638" w:type="dxa"/>
+            <w:tcW w:w="2656" w:type="dxa"/>
           </w:tcPr>
           <w:p>
             <w:pPr>
@@ -8304,7 +8228,7 @@
       <w:tr>
         <w:tc>
           <w:tcPr>
-            <w:tcW w:w="1972" w:type="dxa"/>
+            <w:tcW w:w="1909" w:type="dxa"/>
           </w:tcPr>
           <w:p>
             <w:pPr>
@@ -8397,7 +8321,7 @@
         </w:tc>
         <w:tc>
           <w:tcPr>
-            <w:tcW w:w="3758" w:type="dxa"/>
+            <w:tcW w:w="3803" w:type="dxa"/>
           </w:tcPr>
           <w:p>
             <w:pPr>
@@ -8441,7 +8365,7 @@
         </w:tc>
         <w:tc>
           <w:tcPr>
-            <w:tcW w:w="2638" w:type="dxa"/>
+            <w:tcW w:w="2656" w:type="dxa"/>
           </w:tcPr>
           <w:p>
             <w:pPr>
@@ -8465,7 +8389,7 @@
       <w:tr>
         <w:tc>
           <w:tcPr>
-            <w:tcW w:w="1972" w:type="dxa"/>
+            <w:tcW w:w="1909" w:type="dxa"/>
           </w:tcPr>
           <w:p>
             <w:pPr>
@@ -8558,7 +8482,7 @@
         </w:tc>
         <w:tc>
           <w:tcPr>
-            <w:tcW w:w="3758" w:type="dxa"/>
+            <w:tcW w:w="3803" w:type="dxa"/>
           </w:tcPr>
           <w:p>
             <w:pPr>
@@ -8602,7 +8526,7 @@
         </w:tc>
         <w:tc>
           <w:tcPr>
-            <w:tcW w:w="2638" w:type="dxa"/>
+            <w:tcW w:w="2656" w:type="dxa"/>
           </w:tcPr>
           <w:p>
             <w:pPr>
@@ -8626,7 +8550,7 @@
       <w:tr>
         <w:tc>
           <w:tcPr>
-            <w:tcW w:w="1972" w:type="dxa"/>
+            <w:tcW w:w="1909" w:type="dxa"/>
           </w:tcPr>
           <w:p>
             <w:pPr>
@@ -8645,15 +8569,6 @@
                   </m:r>
                 </m:e>
                 <m:sub>
-                  <m:r>
-                    <m:t>i</m:t>
-                  </m:r>
-                  <m:r>
-                    <m:rPr>
-                      <m:sty m:val="p"/>
-                    </m:rPr>
-                    <m:t>,</m:t>
-                  </m:r>
                   <m:r>
                     <m:rPr>
                       <m:sty m:val="p"/>
@@ -8674,6 +8589,21 @@
                   </m:r>
                 </m:sub>
               </m:sSub>
+              <m:r>
+                <m:rPr>
+                  <m:sty m:val="p"/>
+                </m:rPr>
+                <m:t>(</m:t>
+              </m:r>
+              <m:r>
+                <m:t>i</m:t>
+              </m:r>
+              <m:r>
+                <m:rPr>
+                  <m:sty m:val="p"/>
+                </m:rPr>
+                <m:t>)</m:t>
+              </m:r>
             </m:oMath>
             <w:r>
               <w:rPr>
@@ -8697,15 +8627,6 @@
                   </m:r>
                 </m:e>
                 <m:sub>
-                  <m:r>
-                    <m:t>i</m:t>
-                  </m:r>
-                  <m:r>
-                    <m:rPr>
-                      <m:sty m:val="p"/>
-                    </m:rPr>
-                    <m:t>,</m:t>
-                  </m:r>
                   <m:r>
                     <m:rPr>
                       <m:sty m:val="p"/>
@@ -8732,12 +8653,27 @@
                   </m:r>
                 </m:sub>
               </m:sSub>
+              <m:r>
+                <m:rPr>
+                  <m:sty m:val="p"/>
+                </m:rPr>
+                <m:t>(</m:t>
+              </m:r>
+              <m:r>
+                <m:t>i</m:t>
+              </m:r>
+              <m:r>
+                <m:rPr>
+                  <m:sty m:val="p"/>
+                </m:rPr>
+                <m:t>)</m:t>
+              </m:r>
             </m:oMath>
           </w:p>
         </w:tc>
         <w:tc>
           <w:tcPr>
-            <w:tcW w:w="3758" w:type="dxa"/>
+            <w:tcW w:w="3803" w:type="dxa"/>
           </w:tcPr>
           <w:p>
             <w:pPr>
@@ -8807,7 +8743,7 @@
         </w:tc>
         <w:tc>
           <w:tcPr>
-            <w:tcW w:w="2638" w:type="dxa"/>
+            <w:tcW w:w="2656" w:type="dxa"/>
           </w:tcPr>
           <w:p>
             <w:pPr>
@@ -8831,7 +8767,7 @@
       <w:tr>
         <w:tc>
           <w:tcPr>
-            <w:tcW w:w="1972" w:type="dxa"/>
+            <w:tcW w:w="1909" w:type="dxa"/>
           </w:tcPr>
           <w:p>
             <w:pPr>
@@ -8863,7 +8799,7 @@
         </w:tc>
         <w:tc>
           <w:tcPr>
-            <w:tcW w:w="3758" w:type="dxa"/>
+            <w:tcW w:w="3803" w:type="dxa"/>
           </w:tcPr>
           <w:p>
             <w:pPr>
@@ -8933,7 +8869,7 @@
         </w:tc>
         <w:tc>
           <w:tcPr>
-            <w:tcW w:w="2638" w:type="dxa"/>
+            <w:tcW w:w="2656" w:type="dxa"/>
           </w:tcPr>
           <w:p>
             <w:pPr>
@@ -8957,7 +8893,7 @@
       <w:tr>
         <w:tc>
           <w:tcPr>
-            <w:tcW w:w="1972" w:type="dxa"/>
+            <w:tcW w:w="1909" w:type="dxa"/>
           </w:tcPr>
           <w:p>
             <w:pPr>
@@ -8992,7 +8928,7 @@
         </w:tc>
         <w:tc>
           <w:tcPr>
-            <w:tcW w:w="3758" w:type="dxa"/>
+            <w:tcW w:w="3803" w:type="dxa"/>
           </w:tcPr>
           <w:p>
             <w:pPr>
@@ -9062,7 +8998,7 @@
         </w:tc>
         <w:tc>
           <w:tcPr>
-            <w:tcW w:w="2638" w:type="dxa"/>
+            <w:tcW w:w="2656" w:type="dxa"/>
           </w:tcPr>
           <w:p>
             <w:pPr>
@@ -9086,7 +9022,7 @@
       <w:tr>
         <w:tc>
           <w:tcPr>
-            <w:tcW w:w="1972" w:type="dxa"/>
+            <w:tcW w:w="1909" w:type="dxa"/>
           </w:tcPr>
           <w:p>
             <w:pPr>
@@ -9179,7 +9115,7 @@
         </w:tc>
         <w:tc>
           <w:tcPr>
-            <w:tcW w:w="3758" w:type="dxa"/>
+            <w:tcW w:w="3803" w:type="dxa"/>
           </w:tcPr>
           <w:p>
             <w:pPr>
@@ -9223,7 +9159,7 @@
         </w:tc>
         <w:tc>
           <w:tcPr>
-            <w:tcW w:w="2638" w:type="dxa"/>
+            <w:tcW w:w="2656" w:type="dxa"/>
           </w:tcPr>
           <w:p>
             <w:pPr>
@@ -9247,7 +9183,7 @@
       <w:tr>
         <w:tc>
           <w:tcPr>
-            <w:tcW w:w="1972" w:type="dxa"/>
+            <w:tcW w:w="1909" w:type="dxa"/>
           </w:tcPr>
           <w:p>
             <w:pPr>
@@ -9340,7 +9276,7 @@
         </w:tc>
         <w:tc>
           <w:tcPr>
-            <w:tcW w:w="3758" w:type="dxa"/>
+            <w:tcW w:w="3803" w:type="dxa"/>
           </w:tcPr>
           <w:p>
             <w:pPr>
@@ -9384,7 +9320,7 @@
         </w:tc>
         <w:tc>
           <w:tcPr>
-            <w:tcW w:w="2638" w:type="dxa"/>
+            <w:tcW w:w="2656" w:type="dxa"/>
           </w:tcPr>
           <w:p>
             <w:pPr>
@@ -9408,7 +9344,7 @@
       <w:tr>
         <w:tc>
           <w:tcPr>
-            <w:tcW w:w="1972" w:type="dxa"/>
+            <w:tcW w:w="1909" w:type="dxa"/>
           </w:tcPr>
           <w:p>
             <w:pPr>
@@ -9423,34 +9359,10 @@
               <m:sSub>
                 <m:e>
                   <m:r>
-                    <m:t>S</m:t>
+                    <m:t>Q</m:t>
                   </m:r>
                 </m:e>
                 <m:sub>
-                  <m:r>
-                    <m:rPr>
-                      <m:sty m:val="p"/>
-                    </m:rPr>
-                    <m:t>t</m:t>
-                  </m:r>
-                  <m:r>
-                    <m:rPr>
-                      <m:sty m:val="p"/>
-                    </m:rPr>
-                    <m:t>m</m:t>
-                  </m:r>
-                  <m:r>
-                    <m:rPr>
-                      <m:sty m:val="p"/>
-                    </m:rPr>
-                    <m:t>p</m:t>
-                  </m:r>
-                  <m:r>
-                    <m:rPr>
-                      <m:sty m:val="p"/>
-                    </m:rPr>
-                    <m:t>,</m:t>
-                  </m:r>
                   <m:r>
                     <m:rPr>
                       <m:sty m:val="p"/>
@@ -9490,34 +9402,10 @@
               <m:sSub>
                 <m:e>
                   <m:r>
-                    <m:t>S</m:t>
+                    <m:t>Q</m:t>
                   </m:r>
                 </m:e>
                 <m:sub>
-                  <m:r>
-                    <m:rPr>
-                      <m:sty m:val="p"/>
-                    </m:rPr>
-                    <m:t>t</m:t>
-                  </m:r>
-                  <m:r>
-                    <m:rPr>
-                      <m:sty m:val="p"/>
-                    </m:rPr>
-                    <m:t>m</m:t>
-                  </m:r>
-                  <m:r>
-                    <m:rPr>
-                      <m:sty m:val="p"/>
-                    </m:rPr>
-                    <m:t>p</m:t>
-                  </m:r>
-                  <m:r>
-                    <m:rPr>
-                      <m:sty m:val="p"/>
-                    </m:rPr>
-                    <m:t>,</m:t>
-                  </m:r>
                   <m:r>
                     <m:rPr>
                       <m:sty m:val="p"/>
@@ -9549,7 +9437,7 @@
         </w:tc>
         <w:tc>
           <w:tcPr>
-            <w:tcW w:w="3758" w:type="dxa"/>
+            <w:tcW w:w="3803" w:type="dxa"/>
           </w:tcPr>
           <w:p>
             <w:pPr>
@@ -9593,7 +9481,7 @@
         </w:tc>
         <w:tc>
           <w:tcPr>
-            <w:tcW w:w="2638" w:type="dxa"/>
+            <w:tcW w:w="2656" w:type="dxa"/>
           </w:tcPr>
           <w:p>
             <w:pPr>
@@ -9617,7 +9505,7 @@
       <w:tr>
         <w:tc>
           <w:tcPr>
-            <w:tcW w:w="1972" w:type="dxa"/>
+            <w:tcW w:w="1909" w:type="dxa"/>
           </w:tcPr>
           <w:p>
             <w:pPr>
@@ -9632,34 +9520,10 @@
               <m:sSub>
                 <m:e>
                   <m:r>
-                    <m:t>S</m:t>
+                    <m:t>V</m:t>
                   </m:r>
                 </m:e>
                 <m:sub>
-                  <m:r>
-                    <m:rPr>
-                      <m:sty m:val="p"/>
-                    </m:rPr>
-                    <m:t>o</m:t>
-                  </m:r>
-                  <m:r>
-                    <m:rPr>
-                      <m:sty m:val="p"/>
-                    </m:rPr>
-                    <m:t>l</m:t>
-                  </m:r>
-                  <m:r>
-                    <m:rPr>
-                      <m:sty m:val="p"/>
-                    </m:rPr>
-                    <m:t>d</m:t>
-                  </m:r>
-                  <m:r>
-                    <m:rPr>
-                      <m:sty m:val="p"/>
-                    </m:rPr>
-                    <m:t>,</m:t>
-                  </m:r>
                   <m:r>
                     <m:rPr>
                       <m:sty m:val="p"/>
@@ -9699,34 +9563,10 @@
               <m:sSub>
                 <m:e>
                   <m:r>
-                    <m:t>S</m:t>
+                    <m:t>V</m:t>
                   </m:r>
                 </m:e>
                 <m:sub>
-                  <m:r>
-                    <m:rPr>
-                      <m:sty m:val="p"/>
-                    </m:rPr>
-                    <m:t>o</m:t>
-                  </m:r>
-                  <m:r>
-                    <m:rPr>
-                      <m:sty m:val="p"/>
-                    </m:rPr>
-                    <m:t>l</m:t>
-                  </m:r>
-                  <m:r>
-                    <m:rPr>
-                      <m:sty m:val="p"/>
-                    </m:rPr>
-                    <m:t>d</m:t>
-                  </m:r>
-                  <m:r>
-                    <m:rPr>
-                      <m:sty m:val="p"/>
-                    </m:rPr>
-                    <m:t>,</m:t>
-                  </m:r>
                   <m:r>
                     <m:rPr>
                       <m:sty m:val="p"/>
@@ -9758,7 +9598,7 @@
         </w:tc>
         <w:tc>
           <w:tcPr>
-            <w:tcW w:w="3758" w:type="dxa"/>
+            <w:tcW w:w="3803" w:type="dxa"/>
           </w:tcPr>
           <w:p>
             <w:pPr>
@@ -9802,7 +9642,7 @@
         </w:tc>
         <w:tc>
           <w:tcPr>
-            <w:tcW w:w="2638" w:type="dxa"/>
+            <w:tcW w:w="2656" w:type="dxa"/>
           </w:tcPr>
           <w:p>
             <w:pPr>
@@ -9826,7 +9666,7 @@
       <w:tr>
         <w:tc>
           <w:tcPr>
-            <w:tcW w:w="1972" w:type="dxa"/>
+            <w:tcW w:w="1909" w:type="dxa"/>
           </w:tcPr>
           <w:p>
             <w:pPr>
@@ -9846,7 +9686,7 @@
         </w:tc>
         <w:tc>
           <w:tcPr>
-            <w:tcW w:w="3758" w:type="dxa"/>
+            <w:tcW w:w="3803" w:type="dxa"/>
           </w:tcPr>
           <w:p>
             <w:pPr>
@@ -9890,7 +9730,7 @@
         </w:tc>
         <w:tc>
           <w:tcPr>
-            <w:tcW w:w="2638" w:type="dxa"/>
+            <w:tcW w:w="2656" w:type="dxa"/>
           </w:tcPr>
           <w:p>
             <w:pPr>
@@ -9914,7 +9754,7 @@
       <w:tr>
         <w:tc>
           <w:tcPr>
-            <w:tcW w:w="1972" w:type="dxa"/>
+            <w:tcW w:w="1909" w:type="dxa"/>
           </w:tcPr>
           <w:p>
             <w:pPr>
@@ -9934,7 +9774,7 @@
         </w:tc>
         <w:tc>
           <w:tcPr>
-            <w:tcW w:w="3758" w:type="dxa"/>
+            <w:tcW w:w="3803" w:type="dxa"/>
           </w:tcPr>
           <w:p>
             <w:pPr>
@@ -9978,7 +9818,7 @@
         </w:tc>
         <w:tc>
           <w:tcPr>
-            <w:tcW w:w="2638" w:type="dxa"/>
+            <w:tcW w:w="2656" w:type="dxa"/>
           </w:tcPr>
           <w:p>
             <w:pPr>
@@ -10002,7 +9842,7 @@
       <w:tr>
         <w:tc>
           <w:tcPr>
-            <w:tcW w:w="1972" w:type="dxa"/>
+            <w:tcW w:w="1909" w:type="dxa"/>
           </w:tcPr>
           <w:p>
             <w:pPr>
@@ -10037,7 +9877,7 @@
         </w:tc>
         <w:tc>
           <w:tcPr>
-            <w:tcW w:w="3758" w:type="dxa"/>
+            <w:tcW w:w="3803" w:type="dxa"/>
           </w:tcPr>
           <w:p>
             <w:pPr>
@@ -10081,7 +9921,7 @@
         </w:tc>
         <w:tc>
           <w:tcPr>
-            <w:tcW w:w="2638" w:type="dxa"/>
+            <w:tcW w:w="2656" w:type="dxa"/>
           </w:tcPr>
           <w:p>
             <w:pPr>
@@ -10904,15 +10744,6 @@
           </m:e>
           <m:sub>
             <m:r>
-              <m:t>i</m:t>
-            </m:r>
-            <m:r>
-              <m:rPr>
-                <m:sty m:val="p"/>
-              </m:rPr>
-              <m:t>,</m:t>
-            </m:r>
-            <m:r>
               <m:rPr>
                 <m:sty m:val="p"/>
               </m:rPr>
@@ -10932,6 +10763,21 @@
             </m:r>
           </m:sub>
         </m:sSub>
+        <m:r>
+          <m:rPr>
+            <m:sty m:val="p"/>
+          </m:rPr>
+          <m:t>(</m:t>
+        </m:r>
+        <m:r>
+          <m:t>i</m:t>
+        </m:r>
+        <m:r>
+          <m:rPr>
+            <m:sty m:val="p"/>
+          </m:rPr>
+          <m:t>)</m:t>
+        </m:r>
         <m:r>
           <m:rPr>
             <m:sty m:val="p"/>
@@ -11083,15 +10929,6 @@
           </m:e>
           <m:sub>
             <m:r>
-              <m:t>i</m:t>
-            </m:r>
-            <m:r>
-              <m:rPr>
-                <m:sty m:val="p"/>
-              </m:rPr>
-              <m:t>,</m:t>
-            </m:r>
-            <m:r>
               <m:rPr>
                 <m:sty m:val="p"/>
               </m:rPr>
@@ -11111,6 +10948,21 @@
             </m:r>
           </m:sub>
         </m:sSub>
+        <m:r>
+          <m:rPr>
+            <m:sty m:val="p"/>
+          </m:rPr>
+          <m:t>(</m:t>
+        </m:r>
+        <m:r>
+          <m:t>i</m:t>
+        </m:r>
+        <m:r>
+          <m:rPr>
+            <m:sty m:val="p"/>
+          </m:rPr>
+          <m:t>)</m:t>
+        </m:r>
       </m:oMath>
       <w:r>
         <w:t xml:space="preserve"> </w:t>
@@ -11230,15 +11082,6 @@
           </m:e>
           <m:sub>
             <m:r>
-              <m:t>i</m:t>
-            </m:r>
-            <m:r>
-              <m:rPr>
-                <m:sty m:val="p"/>
-              </m:rPr>
-              <m:t>,</m:t>
-            </m:r>
-            <m:r>
               <m:rPr>
                 <m:sty m:val="p"/>
               </m:rPr>
@@ -11264,6 +11107,21 @@
             </m:r>
           </m:sub>
         </m:sSub>
+        <m:r>
+          <m:rPr>
+            <m:sty m:val="p"/>
+          </m:rPr>
+          <m:t>(</m:t>
+        </m:r>
+        <m:r>
+          <m:t>i</m:t>
+        </m:r>
+        <m:r>
+          <m:rPr>
+            <m:sty m:val="p"/>
+          </m:rPr>
+          <m:t>)</m:t>
+        </m:r>
         <m:r>
           <m:rPr>
             <m:sty m:val="p"/>
@@ -11427,15 +11285,6 @@
           </m:e>
           <m:sub>
             <m:r>
-              <m:t>i</m:t>
-            </m:r>
-            <m:r>
-              <m:rPr>
-                <m:sty m:val="p"/>
-              </m:rPr>
-              <m:t>,</m:t>
-            </m:r>
-            <m:r>
               <m:rPr>
                 <m:sty m:val="p"/>
               </m:rPr>
@@ -11461,6 +11310,21 @@
             </m:r>
           </m:sub>
         </m:sSub>
+        <m:r>
+          <m:rPr>
+            <m:sty m:val="p"/>
+          </m:rPr>
+          <m:t>(</m:t>
+        </m:r>
+        <m:r>
+          <m:t>i</m:t>
+        </m:r>
+        <m:r>
+          <m:rPr>
+            <m:sty m:val="p"/>
+          </m:rPr>
+          <m:t>)</m:t>
+        </m:r>
       </m:oMath>
       <w:r>
         <w:t xml:space="preserve"> </w:t>
@@ -11537,15 +11401,6 @@
           </m:e>
           <m:sub>
             <m:r>
-              <m:t>i</m:t>
-            </m:r>
-            <m:r>
-              <m:rPr>
-                <m:sty m:val="p"/>
-              </m:rPr>
-              <m:t>,</m:t>
-            </m:r>
-            <m:r>
               <m:rPr>
                 <m:sty m:val="p"/>
               </m:rPr>
@@ -11575,6 +11430,21 @@
           <m:rPr>
             <m:sty m:val="p"/>
           </m:rPr>
+          <m:t>(</m:t>
+        </m:r>
+        <m:r>
+          <m:t>i</m:t>
+        </m:r>
+        <m:r>
+          <m:rPr>
+            <m:sty m:val="p"/>
+          </m:rPr>
+          <m:t>)</m:t>
+        </m:r>
+        <m:r>
+          <m:rPr>
+            <m:sty m:val="p"/>
+          </m:rPr>
           <m:t>−</m:t>
         </m:r>
         <m:sSub>
@@ -11584,15 +11454,6 @@
             </m:r>
           </m:e>
           <m:sub>
-            <m:r>
-              <m:t>i</m:t>
-            </m:r>
-            <m:r>
-              <m:rPr>
-                <m:sty m:val="p"/>
-              </m:rPr>
-              <m:t>,</m:t>
-            </m:r>
             <m:r>
               <m:rPr>
                 <m:sty m:val="p"/>
@@ -11613,6 +11474,21 @@
             </m:r>
           </m:sub>
         </m:sSub>
+        <m:r>
+          <m:rPr>
+            <m:sty m:val="p"/>
+          </m:rPr>
+          <m:t>(</m:t>
+        </m:r>
+        <m:r>
+          <m:t>i</m:t>
+        </m:r>
+        <m:r>
+          <m:rPr>
+            <m:sty m:val="p"/>
+          </m:rPr>
+          <m:t>)</m:t>
+        </m:r>
       </m:oMath>
       <w:r>
         <w:tab/>
@@ -12277,34 +12153,10 @@
         <m:sSub>
           <m:e>
             <m:r>
-              <m:t>S</m:t>
+              <m:t>Q</m:t>
             </m:r>
           </m:e>
           <m:sub>
-            <m:r>
-              <m:rPr>
-                <m:sty m:val="p"/>
-              </m:rPr>
-              <m:t>t</m:t>
-            </m:r>
-            <m:r>
-              <m:rPr>
-                <m:sty m:val="p"/>
-              </m:rPr>
-              <m:t>m</m:t>
-            </m:r>
-            <m:r>
-              <m:rPr>
-                <m:sty m:val="p"/>
-              </m:rPr>
-              <m:t>p</m:t>
-            </m:r>
-            <m:r>
-              <m:rPr>
-                <m:sty m:val="p"/>
-              </m:rPr>
-              <m:t>,</m:t>
-            </m:r>
             <m:r>
               <m:rPr>
                 <m:sty m:val="p"/>
@@ -12334,34 +12186,10 @@
         <m:sSub>
           <m:e>
             <m:r>
-              <m:t>S</m:t>
+              <m:t>V</m:t>
             </m:r>
           </m:e>
           <m:sub>
-            <m:r>
-              <m:rPr>
-                <m:sty m:val="p"/>
-              </m:rPr>
-              <m:t>o</m:t>
-            </m:r>
-            <m:r>
-              <m:rPr>
-                <m:sty m:val="p"/>
-              </m:rPr>
-              <m:t>l</m:t>
-            </m:r>
-            <m:r>
-              <m:rPr>
-                <m:sty m:val="p"/>
-              </m:rPr>
-              <m:t>d</m:t>
-            </m:r>
-            <m:r>
-              <m:rPr>
-                <m:sty m:val="p"/>
-              </m:rPr>
-              <m:t>,</m:t>
-            </m:r>
             <m:r>
               <m:rPr>
                 <m:sty m:val="p"/>
@@ -12472,34 +12300,10 @@
         <m:sSub>
           <m:e>
             <m:r>
-              <m:t>S</m:t>
+              <m:t>Q</m:t>
             </m:r>
           </m:e>
           <m:sub>
-            <m:r>
-              <m:rPr>
-                <m:sty m:val="p"/>
-              </m:rPr>
-              <m:t>t</m:t>
-            </m:r>
-            <m:r>
-              <m:rPr>
-                <m:sty m:val="p"/>
-              </m:rPr>
-              <m:t>m</m:t>
-            </m:r>
-            <m:r>
-              <m:rPr>
-                <m:sty m:val="p"/>
-              </m:rPr>
-              <m:t>p</m:t>
-            </m:r>
-            <m:r>
-              <m:rPr>
-                <m:sty m:val="p"/>
-              </m:rPr>
-              <m:t>,</m:t>
-            </m:r>
             <m:r>
               <m:rPr>
                 <m:sty m:val="p"/>
@@ -12536,34 +12340,10 @@
         <m:sSub>
           <m:e>
             <m:r>
-              <m:t>S</m:t>
+              <m:t>V</m:t>
             </m:r>
           </m:e>
           <m:sub>
-            <m:r>
-              <m:rPr>
-                <m:sty m:val="p"/>
-              </m:rPr>
-              <m:t>o</m:t>
-            </m:r>
-            <m:r>
-              <m:rPr>
-                <m:sty m:val="p"/>
-              </m:rPr>
-              <m:t>l</m:t>
-            </m:r>
-            <m:r>
-              <m:rPr>
-                <m:sty m:val="p"/>
-              </m:rPr>
-              <m:t>d</m:t>
-            </m:r>
-            <m:r>
-              <m:rPr>
-                <m:sty m:val="p"/>
-              </m:rPr>
-              <m:t>,</m:t>
-            </m:r>
             <m:r>
               <m:rPr>
                 <m:sty m:val="p"/>
@@ -12777,34 +12557,10 @@
         <m:sSub>
           <m:e>
             <m:r>
-              <m:t>S</m:t>
+              <m:t>Q</m:t>
             </m:r>
           </m:e>
           <m:sub>
-            <m:r>
-              <m:rPr>
-                <m:sty m:val="p"/>
-              </m:rPr>
-              <m:t>t</m:t>
-            </m:r>
-            <m:r>
-              <m:rPr>
-                <m:sty m:val="p"/>
-              </m:rPr>
-              <m:t>m</m:t>
-            </m:r>
-            <m:r>
-              <m:rPr>
-                <m:sty m:val="p"/>
-              </m:rPr>
-              <m:t>p</m:t>
-            </m:r>
-            <m:r>
-              <m:rPr>
-                <m:sty m:val="p"/>
-              </m:rPr>
-              <m:t>,</m:t>
-            </m:r>
             <m:r>
               <m:rPr>
                 <m:sty m:val="p"/>
@@ -12840,34 +12596,10 @@
         <m:sSub>
           <m:e>
             <m:r>
-              <m:t>S</m:t>
+              <m:t>V</m:t>
             </m:r>
           </m:e>
           <m:sub>
-            <m:r>
-              <m:rPr>
-                <m:sty m:val="p"/>
-              </m:rPr>
-              <m:t>o</m:t>
-            </m:r>
-            <m:r>
-              <m:rPr>
-                <m:sty m:val="p"/>
-              </m:rPr>
-              <m:t>l</m:t>
-            </m:r>
-            <m:r>
-              <m:rPr>
-                <m:sty m:val="p"/>
-              </m:rPr>
-              <m:t>d</m:t>
-            </m:r>
-            <m:r>
-              <m:rPr>
-                <m:sty m:val="p"/>
-              </m:rPr>
-              <m:t>,</m:t>
-            </m:r>
             <m:r>
               <m:rPr>
                 <m:sty m:val="p"/>
@@ -13042,34 +12774,10 @@
         <m:sSub>
           <m:e>
             <m:r>
-              <m:t>S</m:t>
+              <m:t>Q</m:t>
             </m:r>
           </m:e>
           <m:sub>
-            <m:r>
-              <m:rPr>
-                <m:sty m:val="p"/>
-              </m:rPr>
-              <m:t>t</m:t>
-            </m:r>
-            <m:r>
-              <m:rPr>
-                <m:sty m:val="p"/>
-              </m:rPr>
-              <m:t>m</m:t>
-            </m:r>
-            <m:r>
-              <m:rPr>
-                <m:sty m:val="p"/>
-              </m:rPr>
-              <m:t>p</m:t>
-            </m:r>
-            <m:r>
-              <m:rPr>
-                <m:sty m:val="p"/>
-              </m:rPr>
-              <m:t>,</m:t>
-            </m:r>
             <m:r>
               <m:rPr>
                 <m:sty m:val="p"/>
@@ -13112,34 +12820,10 @@
         <m:sSub>
           <m:e>
             <m:r>
-              <m:t>S</m:t>
+              <m:t>V</m:t>
             </m:r>
           </m:e>
           <m:sub>
-            <m:r>
-              <m:rPr>
-                <m:sty m:val="p"/>
-              </m:rPr>
-              <m:t>o</m:t>
-            </m:r>
-            <m:r>
-              <m:rPr>
-                <m:sty m:val="p"/>
-              </m:rPr>
-              <m:t>l</m:t>
-            </m:r>
-            <m:r>
-              <m:rPr>
-                <m:sty m:val="p"/>
-              </m:rPr>
-              <m:t>d</m:t>
-            </m:r>
-            <m:r>
-              <m:rPr>
-                <m:sty m:val="p"/>
-              </m:rPr>
-              <m:t>,</m:t>
-            </m:r>
             <m:r>
               <m:rPr>
                 <m:sty m:val="p"/>

</xml_diff>

<commit_message>
Split object index and class qualifiers between superscripts and subscripts
</commit_message>
<xml_diff>
--- a/40 - Projects/Диплом/Диплом_ГОСТ.docx
+++ b/40 - Projects/Диплом/Диплом_ГОСТ.docx
@@ -5286,18 +5286,38 @@
         <w:t xml:space="preserve"> </w:t>
       </w:r>
       <m:oMath>
-        <m:sSub>
+        <m:sSubSup>
           <m:e>
             <m:r>
-              <m:t>g</m:t>
+              <m:t>h</m:t>
             </m:r>
           </m:e>
           <m:sub>
             <m:r>
+              <m:rPr>
+                <m:sty m:val="p"/>
+              </m:rPr>
+              <m:t>т</m:t>
+            </m:r>
+            <m:r>
+              <m:rPr>
+                <m:sty m:val="p"/>
+              </m:rPr>
+              <m:t>е</m:t>
+            </m:r>
+            <m:r>
+              <m:rPr>
+                <m:sty m:val="p"/>
+              </m:rPr>
+              <m:t>к</m:t>
+            </m:r>
+          </m:sub>
+          <m:sup>
+            <m:r>
               <m:t>i</m:t>
             </m:r>
-          </m:sub>
-        </m:sSub>
+          </m:sup>
+        </m:sSubSup>
       </m:oMath>
       <w:r>
         <w:t xml:space="preserve"> </w:t>
@@ -5568,18 +5588,38 @@
           </m:rPr>
           <m:t>≠</m:t>
         </m:r>
-        <m:sSub>
+        <m:sSubSup>
           <m:e>
             <m:r>
-              <m:t>g</m:t>
+              <m:t>h</m:t>
             </m:r>
           </m:e>
           <m:sub>
             <m:r>
+              <m:rPr>
+                <m:sty m:val="p"/>
+              </m:rPr>
+              <m:t>т</m:t>
+            </m:r>
+            <m:r>
+              <m:rPr>
+                <m:sty m:val="p"/>
+              </m:rPr>
+              <m:t>е</m:t>
+            </m:r>
+            <m:r>
+              <m:rPr>
+                <m:sty m:val="p"/>
+              </m:rPr>
+              <m:t>к</m:t>
+            </m:r>
+          </m:sub>
+          <m:sup>
+            <m:r>
               <m:t>i</m:t>
             </m:r>
-          </m:sub>
-        </m:sSub>
+          </m:sup>
+        </m:sSubSup>
       </m:oMath>
       <w:r>
         <w:t xml:space="preserve"> </w:t>
@@ -5664,18 +5704,38 @@
           </m:rPr>
           <m:t>=</m:t>
         </m:r>
-        <m:sSub>
+        <m:sSubSup>
           <m:e>
             <m:r>
-              <m:t>g</m:t>
+              <m:t>h</m:t>
             </m:r>
           </m:e>
           <m:sub>
             <m:r>
+              <m:rPr>
+                <m:sty m:val="p"/>
+              </m:rPr>
+              <m:t>т</m:t>
+            </m:r>
+            <m:r>
+              <m:rPr>
+                <m:sty m:val="p"/>
+              </m:rPr>
+              <m:t>е</m:t>
+            </m:r>
+            <m:r>
+              <m:rPr>
+                <m:sty m:val="p"/>
+              </m:rPr>
+              <m:t>к</m:t>
+            </m:r>
+          </m:sub>
+          <m:sup>
+            <m:r>
               <m:t>i</m:t>
             </m:r>
-          </m:sub>
-        </m:sSub>
+          </m:sup>
+        </m:sSubSup>
       </m:oMath>
       <w:r>
         <w:t xml:space="preserve"> </w:t>
@@ -5701,10 +5761,10 @@
         <w:t xml:space="preserve"> </w:t>
       </w:r>
       <m:oMath>
-        <m:sSub>
+        <m:sSubSup>
           <m:e>
             <m:r>
-              <m:t>V</m:t>
+              <m:t>S</m:t>
             </m:r>
           </m:e>
           <m:sub>
@@ -5727,7 +5787,27 @@
               <m:t>T</m:t>
             </m:r>
           </m:sub>
-        </m:sSub>
+          <m:sup>
+            <m:r>
+              <m:rPr>
+                <m:sty m:val="p"/>
+              </m:rPr>
+              <m:t>o</m:t>
+            </m:r>
+            <m:r>
+              <m:rPr>
+                <m:sty m:val="p"/>
+              </m:rPr>
+              <m:t>l</m:t>
+            </m:r>
+            <m:r>
+              <m:rPr>
+                <m:sty m:val="p"/>
+              </m:rPr>
+              <m:t>d</m:t>
+            </m:r>
+          </m:sup>
+        </m:sSubSup>
       </m:oMath>
       <w:r>
         <w:t xml:space="preserve"> </w:t>
@@ -5739,10 +5819,10 @@
         <w:t xml:space="preserve"> </w:t>
       </w:r>
       <m:oMath>
-        <m:sSub>
+        <m:sSubSup>
           <m:e>
             <m:r>
-              <m:t>V</m:t>
+              <m:t>S</m:t>
             </m:r>
           </m:e>
           <m:sub>
@@ -5771,7 +5851,27 @@
               <m:t>D</m:t>
             </m:r>
           </m:sub>
-        </m:sSub>
+          <m:sup>
+            <m:r>
+              <m:rPr>
+                <m:sty m:val="p"/>
+              </m:rPr>
+              <m:t>o</m:t>
+            </m:r>
+            <m:r>
+              <m:rPr>
+                <m:sty m:val="p"/>
+              </m:rPr>
+              <m:t>l</m:t>
+            </m:r>
+            <m:r>
+              <m:rPr>
+                <m:sty m:val="p"/>
+              </m:rPr>
+              <m:t>d</m:t>
+            </m:r>
+          </m:sup>
+        </m:sSubSup>
       </m:oMath>
       <w:r>
         <w:t xml:space="preserve"> </w:t>
@@ -5812,10 +5912,10 @@
         <w:tblCaption w:val="Таблица 2.1 – Обозначения модели размещения"/>
       </w:tblPr>
       <w:tblGrid>
-        <w:gridCol w:w="1909"/>
-        <w:gridCol w:w="3803"/>
+        <w:gridCol w:w="1952"/>
+        <w:gridCol w:w="3772"/>
         <w:gridCol w:w="1270"/>
-        <w:gridCol w:w="2656"/>
+        <w:gridCol w:w="2644"/>
       </w:tblGrid>
       <w:tr>
         <w:trPr>
@@ -5823,7 +5923,7 @@
         </w:trPr>
         <w:tc>
           <w:tcPr>
-            <w:tcW w:w="1909" w:type="dxa"/>
+            <w:tcW w:w="1952" w:type="dxa"/>
           </w:tcPr>
           <w:p>
             <w:pPr>
@@ -5846,7 +5946,7 @@
         </w:tc>
         <w:tc>
           <w:tcPr>
-            <w:tcW w:w="3803" w:type="dxa"/>
+            <w:tcW w:w="3772" w:type="dxa"/>
           </w:tcPr>
           <w:p>
             <w:pPr>
@@ -5892,7 +5992,7 @@
         </w:tc>
         <w:tc>
           <w:tcPr>
-            <w:tcW w:w="2656" w:type="dxa"/>
+            <w:tcW w:w="2644" w:type="dxa"/>
           </w:tcPr>
           <w:p>
             <w:pPr>
@@ -5917,7 +6017,7 @@
       <w:tr>
         <w:tc>
           <w:tcPr>
-            <w:tcW w:w="1909" w:type="dxa"/>
+            <w:tcW w:w="1952" w:type="dxa"/>
           </w:tcPr>
           <w:p>
             <w:pPr>
@@ -5937,7 +6037,7 @@
         </w:tc>
         <w:tc>
           <w:tcPr>
-            <w:tcW w:w="3803" w:type="dxa"/>
+            <w:tcW w:w="3772" w:type="dxa"/>
           </w:tcPr>
           <w:p>
             <w:pPr>
@@ -5981,7 +6081,7 @@
         </w:tc>
         <w:tc>
           <w:tcPr>
-            <w:tcW w:w="2656" w:type="dxa"/>
+            <w:tcW w:w="2644" w:type="dxa"/>
           </w:tcPr>
           <w:p>
             <w:pPr>
@@ -6005,7 +6105,7 @@
       <w:tr>
         <w:tc>
           <w:tcPr>
-            <w:tcW w:w="1909" w:type="dxa"/>
+            <w:tcW w:w="1952" w:type="dxa"/>
           </w:tcPr>
           <w:p>
             <w:pPr>
@@ -6025,7 +6125,7 @@
         </w:tc>
         <w:tc>
           <w:tcPr>
-            <w:tcW w:w="3803" w:type="dxa"/>
+            <w:tcW w:w="3772" w:type="dxa"/>
           </w:tcPr>
           <w:p>
             <w:pPr>
@@ -6081,7 +6181,7 @@
         </w:tc>
         <w:tc>
           <w:tcPr>
-            <w:tcW w:w="2656" w:type="dxa"/>
+            <w:tcW w:w="2644" w:type="dxa"/>
           </w:tcPr>
           <w:p>
             <w:pPr>
@@ -6105,7 +6205,7 @@
       <w:tr>
         <w:tc>
           <w:tcPr>
-            <w:tcW w:w="1909" w:type="dxa"/>
+            <w:tcW w:w="1952" w:type="dxa"/>
           </w:tcPr>
           <w:p>
             <w:pPr>
@@ -6125,7 +6225,7 @@
         </w:tc>
         <w:tc>
           <w:tcPr>
-            <w:tcW w:w="3803" w:type="dxa"/>
+            <w:tcW w:w="3772" w:type="dxa"/>
           </w:tcPr>
           <w:p>
             <w:pPr>
@@ -6181,7 +6281,7 @@
         </w:tc>
         <w:tc>
           <w:tcPr>
-            <w:tcW w:w="2656" w:type="dxa"/>
+            <w:tcW w:w="2644" w:type="dxa"/>
           </w:tcPr>
           <w:p>
             <w:pPr>
@@ -6217,7 +6317,7 @@
       <w:tr>
         <w:tc>
           <w:tcPr>
-            <w:tcW w:w="1909" w:type="dxa"/>
+            <w:tcW w:w="1952" w:type="dxa"/>
           </w:tcPr>
           <w:p>
             <w:pPr>
@@ -6246,7 +6346,7 @@
         </w:tc>
         <w:tc>
           <w:tcPr>
-            <w:tcW w:w="3803" w:type="dxa"/>
+            <w:tcW w:w="3772" w:type="dxa"/>
           </w:tcPr>
           <w:p>
             <w:pPr>
@@ -6302,7 +6402,7 @@
         </w:tc>
         <w:tc>
           <w:tcPr>
-            <w:tcW w:w="2656" w:type="dxa"/>
+            <w:tcW w:w="2644" w:type="dxa"/>
           </w:tcPr>
           <w:p>
             <w:pPr>
@@ -6326,7 +6426,7 @@
       <w:tr>
         <w:tc>
           <w:tcPr>
-            <w:tcW w:w="1909" w:type="dxa"/>
+            <w:tcW w:w="1952" w:type="dxa"/>
           </w:tcPr>
           <w:p>
             <w:pPr>
@@ -6338,24 +6438,44 @@
               <w:pageBreakBefore w:val="0"/>
             </w:pPr>
             <m:oMath>
-              <m:sSub>
+              <m:sSubSup>
                 <m:e>
                   <m:r>
-                    <m:t>g</m:t>
+                    <m:t>h</m:t>
                   </m:r>
                 </m:e>
                 <m:sub>
                   <m:r>
+                    <m:rPr>
+                      <m:sty m:val="p"/>
+                    </m:rPr>
+                    <m:t>т</m:t>
+                  </m:r>
+                  <m:r>
+                    <m:rPr>
+                      <m:sty m:val="p"/>
+                    </m:rPr>
+                    <m:t>е</m:t>
+                  </m:r>
+                  <m:r>
+                    <m:rPr>
+                      <m:sty m:val="p"/>
+                    </m:rPr>
+                    <m:t>к</m:t>
+                  </m:r>
+                </m:sub>
+                <m:sup>
+                  <m:r>
                     <m:t>i</m:t>
                   </m:r>
-                </m:sub>
-              </m:sSub>
+                </m:sup>
+              </m:sSubSup>
             </m:oMath>
           </w:p>
         </w:tc>
         <w:tc>
           <w:tcPr>
-            <w:tcW w:w="3803" w:type="dxa"/>
+            <w:tcW w:w="3772" w:type="dxa"/>
           </w:tcPr>
           <w:p>
             <w:pPr>
@@ -6418,7 +6538,7 @@
         </w:tc>
         <w:tc>
           <w:tcPr>
-            <w:tcW w:w="2656" w:type="dxa"/>
+            <w:tcW w:w="2644" w:type="dxa"/>
           </w:tcPr>
           <w:p>
             <w:pPr>
@@ -6442,7 +6562,7 @@
       <w:tr>
         <w:tc>
           <w:tcPr>
-            <w:tcW w:w="1909" w:type="dxa"/>
+            <w:tcW w:w="1952" w:type="dxa"/>
           </w:tcPr>
           <w:p>
             <w:pPr>
@@ -6471,7 +6591,7 @@
         </w:tc>
         <w:tc>
           <w:tcPr>
-            <w:tcW w:w="3803" w:type="dxa"/>
+            <w:tcW w:w="3772" w:type="dxa"/>
           </w:tcPr>
           <w:p>
             <w:pPr>
@@ -6541,7 +6661,7 @@
         </w:tc>
         <w:tc>
           <w:tcPr>
-            <w:tcW w:w="2656" w:type="dxa"/>
+            <w:tcW w:w="2644" w:type="dxa"/>
           </w:tcPr>
           <w:p>
             <w:pPr>
@@ -6565,7 +6685,7 @@
       <w:tr>
         <w:tc>
           <w:tcPr>
-            <w:tcW w:w="1909" w:type="dxa"/>
+            <w:tcW w:w="1952" w:type="dxa"/>
           </w:tcPr>
           <w:p>
             <w:pPr>
@@ -6585,7 +6705,7 @@
         </w:tc>
         <w:tc>
           <w:tcPr>
-            <w:tcW w:w="3803" w:type="dxa"/>
+            <w:tcW w:w="3772" w:type="dxa"/>
           </w:tcPr>
           <w:p>
             <w:pPr>
@@ -6680,7 +6800,7 @@
         </w:tc>
         <w:tc>
           <w:tcPr>
-            <w:tcW w:w="2656" w:type="dxa"/>
+            <w:tcW w:w="2644" w:type="dxa"/>
           </w:tcPr>
           <w:p>
             <w:pPr>
@@ -6704,7 +6824,7 @@
       <w:tr>
         <w:tc>
           <w:tcPr>
-            <w:tcW w:w="1909" w:type="dxa"/>
+            <w:tcW w:w="1952" w:type="dxa"/>
           </w:tcPr>
           <w:p>
             <w:pPr>
@@ -6797,7 +6917,7 @@
         </w:tc>
         <w:tc>
           <w:tcPr>
-            <w:tcW w:w="3803" w:type="dxa"/>
+            <w:tcW w:w="3772" w:type="dxa"/>
           </w:tcPr>
           <w:p>
             <w:pPr>
@@ -6867,7 +6987,7 @@
         </w:tc>
         <w:tc>
           <w:tcPr>
-            <w:tcW w:w="2656" w:type="dxa"/>
+            <w:tcW w:w="2644" w:type="dxa"/>
           </w:tcPr>
           <w:p>
             <w:pPr>
@@ -6903,7 +7023,7 @@
       <w:tr>
         <w:tc>
           <w:tcPr>
-            <w:tcW w:w="1909" w:type="dxa"/>
+            <w:tcW w:w="1952" w:type="dxa"/>
           </w:tcPr>
           <w:p>
             <w:pPr>
@@ -6947,7 +7067,7 @@
         </w:tc>
         <w:tc>
           <w:tcPr>
-            <w:tcW w:w="3803" w:type="dxa"/>
+            <w:tcW w:w="3772" w:type="dxa"/>
           </w:tcPr>
           <w:p>
             <w:pPr>
@@ -6991,18 +7111,38 @@
                 </m:rPr>
                 <m:t>≠</m:t>
               </m:r>
-              <m:sSub>
+              <m:sSubSup>
                 <m:e>
                   <m:r>
-                    <m:t>g</m:t>
+                    <m:t>h</m:t>
                   </m:r>
                 </m:e>
                 <m:sub>
                   <m:r>
+                    <m:rPr>
+                      <m:sty m:val="p"/>
+                    </m:rPr>
+                    <m:t>т</m:t>
+                  </m:r>
+                  <m:r>
+                    <m:rPr>
+                      <m:sty m:val="p"/>
+                    </m:rPr>
+                    <m:t>е</m:t>
+                  </m:r>
+                  <m:r>
+                    <m:rPr>
+                      <m:sty m:val="p"/>
+                    </m:rPr>
+                    <m:t>к</m:t>
+                  </m:r>
+                </m:sub>
+                <m:sup>
+                  <m:r>
                     <m:t>i</m:t>
                   </m:r>
-                </m:sub>
-              </m:sSub>
+                </m:sup>
+              </m:sSubSup>
             </m:oMath>
           </w:p>
         </w:tc>
@@ -7030,7 +7170,7 @@
         </w:tc>
         <w:tc>
           <w:tcPr>
-            <w:tcW w:w="2656" w:type="dxa"/>
+            <w:tcW w:w="2644" w:type="dxa"/>
           </w:tcPr>
           <w:p>
             <w:pPr>
@@ -7066,7 +7206,7 @@
       <w:tr>
         <w:tc>
           <w:tcPr>
-            <w:tcW w:w="1909" w:type="dxa"/>
+            <w:tcW w:w="1952" w:type="dxa"/>
           </w:tcPr>
           <w:p>
             <w:pPr>
@@ -7086,7 +7226,7 @@
         </w:tc>
         <w:tc>
           <w:tcPr>
-            <w:tcW w:w="3803" w:type="dxa"/>
+            <w:tcW w:w="3772" w:type="dxa"/>
           </w:tcPr>
           <w:p>
             <w:pPr>
@@ -7130,7 +7270,7 @@
         </w:tc>
         <w:tc>
           <w:tcPr>
-            <w:tcW w:w="2656" w:type="dxa"/>
+            <w:tcW w:w="2644" w:type="dxa"/>
           </w:tcPr>
           <w:p>
             <w:pPr>
@@ -7154,7 +7294,7 @@
       <w:tr>
         <w:tc>
           <w:tcPr>
-            <w:tcW w:w="1909" w:type="dxa"/>
+            <w:tcW w:w="1952" w:type="dxa"/>
           </w:tcPr>
           <w:p>
             <w:pPr>
@@ -7198,7 +7338,7 @@
         </w:tc>
         <w:tc>
           <w:tcPr>
-            <w:tcW w:w="3803" w:type="dxa"/>
+            <w:tcW w:w="3772" w:type="dxa"/>
           </w:tcPr>
           <w:p>
             <w:pPr>
@@ -7338,7 +7478,7 @@
         </w:tc>
         <w:tc>
           <w:tcPr>
-            <w:tcW w:w="2656" w:type="dxa"/>
+            <w:tcW w:w="2644" w:type="dxa"/>
           </w:tcPr>
           <w:p>
             <w:pPr>
@@ -7362,7 +7502,7 @@
       <w:tr>
         <w:tc>
           <w:tcPr>
-            <w:tcW w:w="1909" w:type="dxa"/>
+            <w:tcW w:w="1952" w:type="dxa"/>
           </w:tcPr>
           <w:p>
             <w:pPr>
@@ -7398,7 +7538,7 @@
         </w:tc>
         <w:tc>
           <w:tcPr>
-            <w:tcW w:w="3803" w:type="dxa"/>
+            <w:tcW w:w="3772" w:type="dxa"/>
           </w:tcPr>
           <w:p>
             <w:pPr>
@@ -7510,7 +7650,7 @@
         </w:tc>
         <w:tc>
           <w:tcPr>
-            <w:tcW w:w="2656" w:type="dxa"/>
+            <w:tcW w:w="2644" w:type="dxa"/>
           </w:tcPr>
           <w:p>
             <w:pPr>
@@ -7534,7 +7674,7 @@
       <w:tr>
         <w:tc>
           <w:tcPr>
-            <w:tcW w:w="1909" w:type="dxa"/>
+            <w:tcW w:w="1952" w:type="dxa"/>
           </w:tcPr>
           <w:p>
             <w:pPr>
@@ -7563,7 +7703,7 @@
         </w:tc>
         <w:tc>
           <w:tcPr>
-            <w:tcW w:w="3803" w:type="dxa"/>
+            <w:tcW w:w="3772" w:type="dxa"/>
           </w:tcPr>
           <w:p>
             <w:pPr>
@@ -7626,7 +7766,7 @@
         </w:tc>
         <w:tc>
           <w:tcPr>
-            <w:tcW w:w="2656" w:type="dxa"/>
+            <w:tcW w:w="2644" w:type="dxa"/>
           </w:tcPr>
           <w:p>
             <w:pPr>
@@ -7650,7 +7790,7 @@
       <w:tr>
         <w:tc>
           <w:tcPr>
-            <w:tcW w:w="1909" w:type="dxa"/>
+            <w:tcW w:w="1952" w:type="dxa"/>
           </w:tcPr>
           <w:p>
             <w:pPr>
@@ -7686,7 +7826,7 @@
         </w:tc>
         <w:tc>
           <w:tcPr>
-            <w:tcW w:w="3803" w:type="dxa"/>
+            <w:tcW w:w="3772" w:type="dxa"/>
           </w:tcPr>
           <w:p>
             <w:pPr>
@@ -7808,7 +7948,7 @@
         </w:tc>
         <w:tc>
           <w:tcPr>
-            <w:tcW w:w="2656" w:type="dxa"/>
+            <w:tcW w:w="2644" w:type="dxa"/>
           </w:tcPr>
           <w:p>
             <w:pPr>
@@ -7923,7 +8063,7 @@
       <w:tr>
         <w:tc>
           <w:tcPr>
-            <w:tcW w:w="1909" w:type="dxa"/>
+            <w:tcW w:w="1952" w:type="dxa"/>
           </w:tcPr>
           <w:p>
             <w:pPr>
@@ -7943,7 +8083,7 @@
         </w:tc>
         <w:tc>
           <w:tcPr>
-            <w:tcW w:w="3803" w:type="dxa"/>
+            <w:tcW w:w="3772" w:type="dxa"/>
           </w:tcPr>
           <w:p>
             <w:pPr>
@@ -7987,7 +8127,7 @@
         </w:tc>
         <w:tc>
           <w:tcPr>
-            <w:tcW w:w="2656" w:type="dxa"/>
+            <w:tcW w:w="2644" w:type="dxa"/>
           </w:tcPr>
           <w:p>
             <w:pPr>
@@ -8011,7 +8151,7 @@
       <w:tr>
         <w:tc>
           <w:tcPr>
-            <w:tcW w:w="1909" w:type="dxa"/>
+            <w:tcW w:w="1952" w:type="dxa"/>
           </w:tcPr>
           <w:p>
             <w:pPr>
@@ -8134,7 +8274,7 @@
         </w:tc>
         <w:tc>
           <w:tcPr>
-            <w:tcW w:w="3803" w:type="dxa"/>
+            <w:tcW w:w="3772" w:type="dxa"/>
           </w:tcPr>
           <w:p>
             <w:pPr>
@@ -8204,7 +8344,7 @@
         </w:tc>
         <w:tc>
           <w:tcPr>
-            <w:tcW w:w="2656" w:type="dxa"/>
+            <w:tcW w:w="2644" w:type="dxa"/>
           </w:tcPr>
           <w:p>
             <w:pPr>
@@ -8228,7 +8368,7 @@
       <w:tr>
         <w:tc>
           <w:tcPr>
-            <w:tcW w:w="1909" w:type="dxa"/>
+            <w:tcW w:w="1952" w:type="dxa"/>
           </w:tcPr>
           <w:p>
             <w:pPr>
@@ -8321,7 +8461,7 @@
         </w:tc>
         <w:tc>
           <w:tcPr>
-            <w:tcW w:w="3803" w:type="dxa"/>
+            <w:tcW w:w="3772" w:type="dxa"/>
           </w:tcPr>
           <w:p>
             <w:pPr>
@@ -8365,7 +8505,7 @@
         </w:tc>
         <w:tc>
           <w:tcPr>
-            <w:tcW w:w="2656" w:type="dxa"/>
+            <w:tcW w:w="2644" w:type="dxa"/>
           </w:tcPr>
           <w:p>
             <w:pPr>
@@ -8389,7 +8529,7 @@
       <w:tr>
         <w:tc>
           <w:tcPr>
-            <w:tcW w:w="1909" w:type="dxa"/>
+            <w:tcW w:w="1952" w:type="dxa"/>
           </w:tcPr>
           <w:p>
             <w:pPr>
@@ -8482,7 +8622,7 @@
         </w:tc>
         <w:tc>
           <w:tcPr>
-            <w:tcW w:w="3803" w:type="dxa"/>
+            <w:tcW w:w="3772" w:type="dxa"/>
           </w:tcPr>
           <w:p>
             <w:pPr>
@@ -8526,7 +8666,7 @@
         </w:tc>
         <w:tc>
           <w:tcPr>
-            <w:tcW w:w="2656" w:type="dxa"/>
+            <w:tcW w:w="2644" w:type="dxa"/>
           </w:tcPr>
           <w:p>
             <w:pPr>
@@ -8550,7 +8690,7 @@
       <w:tr>
         <w:tc>
           <w:tcPr>
-            <w:tcW w:w="1909" w:type="dxa"/>
+            <w:tcW w:w="1952" w:type="dxa"/>
           </w:tcPr>
           <w:p>
             <w:pPr>
@@ -8562,7 +8702,7 @@
               <w:pageBreakBefore w:val="0"/>
             </w:pPr>
             <m:oMath>
-              <m:sSub>
+              <m:sSubSup>
                 <m:e>
                   <m:r>
                     <m:t>L</m:t>
@@ -8588,22 +8728,12 @@
                     <m:t>T</m:t>
                   </m:r>
                 </m:sub>
-              </m:sSub>
-              <m:r>
-                <m:rPr>
-                  <m:sty m:val="p"/>
-                </m:rPr>
-                <m:t>(</m:t>
-              </m:r>
-              <m:r>
-                <m:t>i</m:t>
-              </m:r>
-              <m:r>
-                <m:rPr>
-                  <m:sty m:val="p"/>
-                </m:rPr>
-                <m:t>)</m:t>
-              </m:r>
+                <m:sup>
+                  <m:r>
+                    <m:t>i</m:t>
+                  </m:r>
+                </m:sup>
+              </m:sSubSup>
             </m:oMath>
             <w:r>
               <w:rPr>
@@ -8620,7 +8750,7 @@
               <w:t xml:space="preserve"> </w:t>
             </w:r>
             <m:oMath>
-              <m:sSub>
+              <m:sSubSup>
                 <m:e>
                   <m:r>
                     <m:t>L</m:t>
@@ -8652,28 +8782,18 @@
                     <m:t>D</m:t>
                   </m:r>
                 </m:sub>
-              </m:sSub>
-              <m:r>
-                <m:rPr>
-                  <m:sty m:val="p"/>
-                </m:rPr>
-                <m:t>(</m:t>
-              </m:r>
-              <m:r>
-                <m:t>i</m:t>
-              </m:r>
-              <m:r>
-                <m:rPr>
-                  <m:sty m:val="p"/>
-                </m:rPr>
-                <m:t>)</m:t>
-              </m:r>
+                <m:sup>
+                  <m:r>
+                    <m:t>i</m:t>
+                  </m:r>
+                </m:sup>
+              </m:sSubSup>
             </m:oMath>
           </w:p>
         </w:tc>
         <w:tc>
           <w:tcPr>
-            <w:tcW w:w="3803" w:type="dxa"/>
+            <w:tcW w:w="3772" w:type="dxa"/>
           </w:tcPr>
           <w:p>
             <w:pPr>
@@ -8743,7 +8863,7 @@
         </w:tc>
         <w:tc>
           <w:tcPr>
-            <w:tcW w:w="2656" w:type="dxa"/>
+            <w:tcW w:w="2644" w:type="dxa"/>
           </w:tcPr>
           <w:p>
             <w:pPr>
@@ -8767,7 +8887,7 @@
       <w:tr>
         <w:tc>
           <w:tcPr>
-            <w:tcW w:w="1909" w:type="dxa"/>
+            <w:tcW w:w="1952" w:type="dxa"/>
           </w:tcPr>
           <w:p>
             <w:pPr>
@@ -8799,7 +8919,7 @@
         </w:tc>
         <w:tc>
           <w:tcPr>
-            <w:tcW w:w="3803" w:type="dxa"/>
+            <w:tcW w:w="3772" w:type="dxa"/>
           </w:tcPr>
           <w:p>
             <w:pPr>
@@ -8869,7 +8989,7 @@
         </w:tc>
         <w:tc>
           <w:tcPr>
-            <w:tcW w:w="2656" w:type="dxa"/>
+            <w:tcW w:w="2644" w:type="dxa"/>
           </w:tcPr>
           <w:p>
             <w:pPr>
@@ -8893,7 +9013,7 @@
       <w:tr>
         <w:tc>
           <w:tcPr>
-            <w:tcW w:w="1909" w:type="dxa"/>
+            <w:tcW w:w="1952" w:type="dxa"/>
           </w:tcPr>
           <w:p>
             <w:pPr>
@@ -8928,7 +9048,7 @@
         </w:tc>
         <w:tc>
           <w:tcPr>
-            <w:tcW w:w="3803" w:type="dxa"/>
+            <w:tcW w:w="3772" w:type="dxa"/>
           </w:tcPr>
           <w:p>
             <w:pPr>
@@ -8998,7 +9118,7 @@
         </w:tc>
         <w:tc>
           <w:tcPr>
-            <w:tcW w:w="2656" w:type="dxa"/>
+            <w:tcW w:w="2644" w:type="dxa"/>
           </w:tcPr>
           <w:p>
             <w:pPr>
@@ -9022,7 +9142,7 @@
       <w:tr>
         <w:tc>
           <w:tcPr>
-            <w:tcW w:w="1909" w:type="dxa"/>
+            <w:tcW w:w="1952" w:type="dxa"/>
           </w:tcPr>
           <w:p>
             <w:pPr>
@@ -9115,7 +9235,7 @@
         </w:tc>
         <w:tc>
           <w:tcPr>
-            <w:tcW w:w="3803" w:type="dxa"/>
+            <w:tcW w:w="3772" w:type="dxa"/>
           </w:tcPr>
           <w:p>
             <w:pPr>
@@ -9159,7 +9279,7 @@
         </w:tc>
         <w:tc>
           <w:tcPr>
-            <w:tcW w:w="2656" w:type="dxa"/>
+            <w:tcW w:w="2644" w:type="dxa"/>
           </w:tcPr>
           <w:p>
             <w:pPr>
@@ -9183,7 +9303,7 @@
       <w:tr>
         <w:tc>
           <w:tcPr>
-            <w:tcW w:w="1909" w:type="dxa"/>
+            <w:tcW w:w="1952" w:type="dxa"/>
           </w:tcPr>
           <w:p>
             <w:pPr>
@@ -9276,7 +9396,7 @@
         </w:tc>
         <w:tc>
           <w:tcPr>
-            <w:tcW w:w="3803" w:type="dxa"/>
+            <w:tcW w:w="3772" w:type="dxa"/>
           </w:tcPr>
           <w:p>
             <w:pPr>
@@ -9320,7 +9440,7 @@
         </w:tc>
         <w:tc>
           <w:tcPr>
-            <w:tcW w:w="2656" w:type="dxa"/>
+            <w:tcW w:w="2644" w:type="dxa"/>
           </w:tcPr>
           <w:p>
             <w:pPr>
@@ -9344,7 +9464,7 @@
       <w:tr>
         <w:tc>
           <w:tcPr>
-            <w:tcW w:w="1909" w:type="dxa"/>
+            <w:tcW w:w="1952" w:type="dxa"/>
           </w:tcPr>
           <w:p>
             <w:pPr>
@@ -9356,10 +9476,10 @@
               <w:pageBreakBefore w:val="0"/>
             </w:pPr>
             <m:oMath>
-              <m:sSub>
+              <m:sSubSup>
                 <m:e>
                   <m:r>
-                    <m:t>Q</m:t>
+                    <m:t>S</m:t>
                   </m:r>
                 </m:e>
                 <m:sub>
@@ -9382,7 +9502,27 @@
                     <m:t>T</m:t>
                   </m:r>
                 </m:sub>
-              </m:sSub>
+                <m:sup>
+                  <m:r>
+                    <m:rPr>
+                      <m:sty m:val="p"/>
+                    </m:rPr>
+                    <m:t>t</m:t>
+                  </m:r>
+                  <m:r>
+                    <m:rPr>
+                      <m:sty m:val="p"/>
+                    </m:rPr>
+                    <m:t>m</m:t>
+                  </m:r>
+                  <m:r>
+                    <m:rPr>
+                      <m:sty m:val="p"/>
+                    </m:rPr>
+                    <m:t>p</m:t>
+                  </m:r>
+                </m:sup>
+              </m:sSubSup>
             </m:oMath>
             <w:r>
               <w:rPr>
@@ -9399,10 +9539,10 @@
               <w:t xml:space="preserve"> </w:t>
             </w:r>
             <m:oMath>
-              <m:sSub>
+              <m:sSubSup>
                 <m:e>
                   <m:r>
-                    <m:t>Q</m:t>
+                    <m:t>S</m:t>
                   </m:r>
                 </m:e>
                 <m:sub>
@@ -9431,13 +9571,33 @@
                     <m:t>D</m:t>
                   </m:r>
                 </m:sub>
-              </m:sSub>
+                <m:sup>
+                  <m:r>
+                    <m:rPr>
+                      <m:sty m:val="p"/>
+                    </m:rPr>
+                    <m:t>t</m:t>
+                  </m:r>
+                  <m:r>
+                    <m:rPr>
+                      <m:sty m:val="p"/>
+                    </m:rPr>
+                    <m:t>m</m:t>
+                  </m:r>
+                  <m:r>
+                    <m:rPr>
+                      <m:sty m:val="p"/>
+                    </m:rPr>
+                    <m:t>p</m:t>
+                  </m:r>
+                </m:sup>
+              </m:sSubSup>
             </m:oMath>
           </w:p>
         </w:tc>
         <w:tc>
           <w:tcPr>
-            <w:tcW w:w="3803" w:type="dxa"/>
+            <w:tcW w:w="3772" w:type="dxa"/>
           </w:tcPr>
           <w:p>
             <w:pPr>
@@ -9481,7 +9641,7 @@
         </w:tc>
         <w:tc>
           <w:tcPr>
-            <w:tcW w:w="2656" w:type="dxa"/>
+            <w:tcW w:w="2644" w:type="dxa"/>
           </w:tcPr>
           <w:p>
             <w:pPr>
@@ -9505,7 +9665,7 @@
       <w:tr>
         <w:tc>
           <w:tcPr>
-            <w:tcW w:w="1909" w:type="dxa"/>
+            <w:tcW w:w="1952" w:type="dxa"/>
           </w:tcPr>
           <w:p>
             <w:pPr>
@@ -9517,10 +9677,10 @@
               <w:pageBreakBefore w:val="0"/>
             </w:pPr>
             <m:oMath>
-              <m:sSub>
+              <m:sSubSup>
                 <m:e>
                   <m:r>
-                    <m:t>V</m:t>
+                    <m:t>S</m:t>
                   </m:r>
                 </m:e>
                 <m:sub>
@@ -9543,7 +9703,27 @@
                     <m:t>T</m:t>
                   </m:r>
                 </m:sub>
-              </m:sSub>
+                <m:sup>
+                  <m:r>
+                    <m:rPr>
+                      <m:sty m:val="p"/>
+                    </m:rPr>
+                    <m:t>o</m:t>
+                  </m:r>
+                  <m:r>
+                    <m:rPr>
+                      <m:sty m:val="p"/>
+                    </m:rPr>
+                    <m:t>l</m:t>
+                  </m:r>
+                  <m:r>
+                    <m:rPr>
+                      <m:sty m:val="p"/>
+                    </m:rPr>
+                    <m:t>d</m:t>
+                  </m:r>
+                </m:sup>
+              </m:sSubSup>
             </m:oMath>
             <w:r>
               <w:rPr>
@@ -9560,10 +9740,10 @@
               <w:t xml:space="preserve"> </w:t>
             </w:r>
             <m:oMath>
-              <m:sSub>
+              <m:sSubSup>
                 <m:e>
                   <m:r>
-                    <m:t>V</m:t>
+                    <m:t>S</m:t>
                   </m:r>
                 </m:e>
                 <m:sub>
@@ -9592,13 +9772,33 @@
                     <m:t>D</m:t>
                   </m:r>
                 </m:sub>
-              </m:sSub>
+                <m:sup>
+                  <m:r>
+                    <m:rPr>
+                      <m:sty m:val="p"/>
+                    </m:rPr>
+                    <m:t>o</m:t>
+                  </m:r>
+                  <m:r>
+                    <m:rPr>
+                      <m:sty m:val="p"/>
+                    </m:rPr>
+                    <m:t>l</m:t>
+                  </m:r>
+                  <m:r>
+                    <m:rPr>
+                      <m:sty m:val="p"/>
+                    </m:rPr>
+                    <m:t>d</m:t>
+                  </m:r>
+                </m:sup>
+              </m:sSubSup>
             </m:oMath>
           </w:p>
         </w:tc>
         <w:tc>
           <w:tcPr>
-            <w:tcW w:w="3803" w:type="dxa"/>
+            <w:tcW w:w="3772" w:type="dxa"/>
           </w:tcPr>
           <w:p>
             <w:pPr>
@@ -9642,7 +9842,7 @@
         </w:tc>
         <w:tc>
           <w:tcPr>
-            <w:tcW w:w="2656" w:type="dxa"/>
+            <w:tcW w:w="2644" w:type="dxa"/>
           </w:tcPr>
           <w:p>
             <w:pPr>
@@ -9666,7 +9866,7 @@
       <w:tr>
         <w:tc>
           <w:tcPr>
-            <w:tcW w:w="1909" w:type="dxa"/>
+            <w:tcW w:w="1952" w:type="dxa"/>
           </w:tcPr>
           <w:p>
             <w:pPr>
@@ -9686,7 +9886,7 @@
         </w:tc>
         <w:tc>
           <w:tcPr>
-            <w:tcW w:w="3803" w:type="dxa"/>
+            <w:tcW w:w="3772" w:type="dxa"/>
           </w:tcPr>
           <w:p>
             <w:pPr>
@@ -9730,7 +9930,7 @@
         </w:tc>
         <w:tc>
           <w:tcPr>
-            <w:tcW w:w="2656" w:type="dxa"/>
+            <w:tcW w:w="2644" w:type="dxa"/>
           </w:tcPr>
           <w:p>
             <w:pPr>
@@ -9754,7 +9954,7 @@
       <w:tr>
         <w:tc>
           <w:tcPr>
-            <w:tcW w:w="1909" w:type="dxa"/>
+            <w:tcW w:w="1952" w:type="dxa"/>
           </w:tcPr>
           <w:p>
             <w:pPr>
@@ -9774,7 +9974,7 @@
         </w:tc>
         <w:tc>
           <w:tcPr>
-            <w:tcW w:w="3803" w:type="dxa"/>
+            <w:tcW w:w="3772" w:type="dxa"/>
           </w:tcPr>
           <w:p>
             <w:pPr>
@@ -9818,7 +10018,7 @@
         </w:tc>
         <w:tc>
           <w:tcPr>
-            <w:tcW w:w="2656" w:type="dxa"/>
+            <w:tcW w:w="2644" w:type="dxa"/>
           </w:tcPr>
           <w:p>
             <w:pPr>
@@ -9842,7 +10042,7 @@
       <w:tr>
         <w:tc>
           <w:tcPr>
-            <w:tcW w:w="1909" w:type="dxa"/>
+            <w:tcW w:w="1952" w:type="dxa"/>
           </w:tcPr>
           <w:p>
             <w:pPr>
@@ -9877,7 +10077,7 @@
         </w:tc>
         <w:tc>
           <w:tcPr>
-            <w:tcW w:w="3803" w:type="dxa"/>
+            <w:tcW w:w="3772" w:type="dxa"/>
           </w:tcPr>
           <w:p>
             <w:pPr>
@@ -9921,7 +10121,7 @@
         </w:tc>
         <w:tc>
           <w:tcPr>
-            <w:tcW w:w="2656" w:type="dxa"/>
+            <w:tcW w:w="2644" w:type="dxa"/>
           </w:tcPr>
           <w:p>
             <w:pPr>
@@ -10736,7 +10936,7 @@
         <w:tab/>
       </w:r>
       <m:oMath>
-        <m:sSub>
+        <m:sSubSup>
           <m:e>
             <m:r>
               <m:t>L</m:t>
@@ -10762,22 +10962,12 @@
               <m:t>T</m:t>
             </m:r>
           </m:sub>
-        </m:sSub>
-        <m:r>
-          <m:rPr>
-            <m:sty m:val="p"/>
-          </m:rPr>
-          <m:t>(</m:t>
-        </m:r>
-        <m:r>
-          <m:t>i</m:t>
-        </m:r>
-        <m:r>
-          <m:rPr>
-            <m:sty m:val="p"/>
-          </m:rPr>
-          <m:t>)</m:t>
-        </m:r>
+          <m:sup>
+            <m:r>
+              <m:t>i</m:t>
+            </m:r>
+          </m:sup>
+        </m:sSubSup>
         <m:r>
           <m:rPr>
             <m:sty m:val="p"/>
@@ -10921,7 +11111,7 @@
         <w:t xml:space="preserve"> </w:t>
       </w:r>
       <m:oMath>
-        <m:sSub>
+        <m:sSubSup>
           <m:e>
             <m:r>
               <m:t>L</m:t>
@@ -10947,22 +11137,12 @@
               <m:t>T</m:t>
             </m:r>
           </m:sub>
-        </m:sSub>
-        <m:r>
-          <m:rPr>
-            <m:sty m:val="p"/>
-          </m:rPr>
-          <m:t>(</m:t>
-        </m:r>
-        <m:r>
-          <m:t>i</m:t>
-        </m:r>
-        <m:r>
-          <m:rPr>
-            <m:sty m:val="p"/>
-          </m:rPr>
-          <m:t>)</m:t>
-        </m:r>
+          <m:sup>
+            <m:r>
+              <m:t>i</m:t>
+            </m:r>
+          </m:sup>
+        </m:sSubSup>
       </m:oMath>
       <w:r>
         <w:t xml:space="preserve"> </w:t>
@@ -11074,7 +11254,7 @@
         <w:tab/>
       </w:r>
       <m:oMath>
-        <m:sSub>
+        <m:sSubSup>
           <m:e>
             <m:r>
               <m:t>L</m:t>
@@ -11106,22 +11286,12 @@
               <m:t>D</m:t>
             </m:r>
           </m:sub>
-        </m:sSub>
-        <m:r>
-          <m:rPr>
-            <m:sty m:val="p"/>
-          </m:rPr>
-          <m:t>(</m:t>
-        </m:r>
-        <m:r>
-          <m:t>i</m:t>
-        </m:r>
-        <m:r>
-          <m:rPr>
-            <m:sty m:val="p"/>
-          </m:rPr>
-          <m:t>)</m:t>
-        </m:r>
+          <m:sup>
+            <m:r>
+              <m:t>i</m:t>
+            </m:r>
+          </m:sup>
+        </m:sSubSup>
         <m:r>
           <m:rPr>
             <m:sty m:val="p"/>
@@ -11277,7 +11447,7 @@
         <w:t xml:space="preserve"> </w:t>
       </w:r>
       <m:oMath>
-        <m:sSub>
+        <m:sSubSup>
           <m:e>
             <m:r>
               <m:t>L</m:t>
@@ -11309,22 +11479,12 @@
               <m:t>D</m:t>
             </m:r>
           </m:sub>
-        </m:sSub>
-        <m:r>
-          <m:rPr>
-            <m:sty m:val="p"/>
-          </m:rPr>
-          <m:t>(</m:t>
-        </m:r>
-        <m:r>
-          <m:t>i</m:t>
-        </m:r>
-        <m:r>
-          <m:rPr>
-            <m:sty m:val="p"/>
-          </m:rPr>
-          <m:t>)</m:t>
-        </m:r>
+          <m:sup>
+            <m:r>
+              <m:t>i</m:t>
+            </m:r>
+          </m:sup>
+        </m:sSubSup>
       </m:oMath>
       <w:r>
         <w:t xml:space="preserve"> </w:t>
@@ -11393,7 +11553,7 @@
           </m:rPr>
           <m:t>=</m:t>
         </m:r>
-        <m:sSub>
+        <m:sSubSup>
           <m:e>
             <m:r>
               <m:t>L</m:t>
@@ -11425,29 +11585,19 @@
               <m:t>D</m:t>
             </m:r>
           </m:sub>
-        </m:sSub>
-        <m:r>
-          <m:rPr>
-            <m:sty m:val="p"/>
-          </m:rPr>
-          <m:t>(</m:t>
-        </m:r>
-        <m:r>
-          <m:t>i</m:t>
-        </m:r>
-        <m:r>
-          <m:rPr>
-            <m:sty m:val="p"/>
-          </m:rPr>
-          <m:t>)</m:t>
-        </m:r>
+          <m:sup>
+            <m:r>
+              <m:t>i</m:t>
+            </m:r>
+          </m:sup>
+        </m:sSubSup>
         <m:r>
           <m:rPr>
             <m:sty m:val="p"/>
           </m:rPr>
           <m:t>−</m:t>
         </m:r>
-        <m:sSub>
+        <m:sSubSup>
           <m:e>
             <m:r>
               <m:t>L</m:t>
@@ -11473,22 +11623,12 @@
               <m:t>T</m:t>
             </m:r>
           </m:sub>
-        </m:sSub>
-        <m:r>
-          <m:rPr>
-            <m:sty m:val="p"/>
-          </m:rPr>
-          <m:t>(</m:t>
-        </m:r>
-        <m:r>
-          <m:t>i</m:t>
-        </m:r>
-        <m:r>
-          <m:rPr>
-            <m:sty m:val="p"/>
-          </m:rPr>
-          <m:t>)</m:t>
-        </m:r>
+          <m:sup>
+            <m:r>
+              <m:t>i</m:t>
+            </m:r>
+          </m:sup>
+        </m:sSubSup>
       </m:oMath>
       <w:r>
         <w:tab/>
@@ -12150,10 +12290,10 @@
           </m:rPr>
           <m:t>+</m:t>
         </m:r>
-        <m:sSub>
+        <m:sSubSup>
           <m:e>
             <m:r>
-              <m:t>Q</m:t>
+              <m:t>S</m:t>
             </m:r>
           </m:e>
           <m:sub>
@@ -12176,17 +12316,37 @@
               <m:t>T</m:t>
             </m:r>
           </m:sub>
-        </m:sSub>
+          <m:sup>
+            <m:r>
+              <m:rPr>
+                <m:sty m:val="p"/>
+              </m:rPr>
+              <m:t>t</m:t>
+            </m:r>
+            <m:r>
+              <m:rPr>
+                <m:sty m:val="p"/>
+              </m:rPr>
+              <m:t>m</m:t>
+            </m:r>
+            <m:r>
+              <m:rPr>
+                <m:sty m:val="p"/>
+              </m:rPr>
+              <m:t>p</m:t>
+            </m:r>
+          </m:sup>
+        </m:sSubSup>
         <m:r>
           <m:rPr>
             <m:sty m:val="p"/>
           </m:rPr>
           <m:t>+</m:t>
         </m:r>
-        <m:sSub>
+        <m:sSubSup>
           <m:e>
             <m:r>
-              <m:t>V</m:t>
+              <m:t>S</m:t>
             </m:r>
           </m:e>
           <m:sub>
@@ -12209,7 +12369,27 @@
               <m:t>T</m:t>
             </m:r>
           </m:sub>
-        </m:sSub>
+          <m:sup>
+            <m:r>
+              <m:rPr>
+                <m:sty m:val="p"/>
+              </m:rPr>
+              <m:t>o</m:t>
+            </m:r>
+            <m:r>
+              <m:rPr>
+                <m:sty m:val="p"/>
+              </m:rPr>
+              <m:t>l</m:t>
+            </m:r>
+            <m:r>
+              <m:rPr>
+                <m:sty m:val="p"/>
+              </m:rPr>
+              <m:t>d</m:t>
+            </m:r>
+          </m:sup>
+        </m:sSubSup>
         <m:r>
           <m:rPr>
             <m:sty m:val="p"/>
@@ -12297,10 +12477,10 @@
         <w:t xml:space="preserve"> </w:t>
       </w:r>
       <m:oMath>
-        <m:sSub>
+        <m:sSubSup>
           <m:e>
             <m:r>
-              <m:t>Q</m:t>
+              <m:t>S</m:t>
             </m:r>
           </m:e>
           <m:sub>
@@ -12323,7 +12503,27 @@
               <m:t>T</m:t>
             </m:r>
           </m:sub>
-        </m:sSub>
+          <m:sup>
+            <m:r>
+              <m:rPr>
+                <m:sty m:val="p"/>
+              </m:rPr>
+              <m:t>t</m:t>
+            </m:r>
+            <m:r>
+              <m:rPr>
+                <m:sty m:val="p"/>
+              </m:rPr>
+              <m:t>m</m:t>
+            </m:r>
+            <m:r>
+              <m:rPr>
+                <m:sty m:val="p"/>
+              </m:rPr>
+              <m:t>p</m:t>
+            </m:r>
+          </m:sup>
+        </m:sSubSup>
       </m:oMath>
       <w:r>
         <w:t xml:space="preserve"> </w:t>
@@ -12337,10 +12537,10 @@
         <w:pStyle w:val="Where"/>
       </w:pPr>
       <m:oMath>
-        <m:sSub>
+        <m:sSubSup>
           <m:e>
             <m:r>
-              <m:t>V</m:t>
+              <m:t>S</m:t>
             </m:r>
           </m:e>
           <m:sub>
@@ -12363,7 +12563,27 @@
               <m:t>T</m:t>
             </m:r>
           </m:sub>
-        </m:sSub>
+          <m:sup>
+            <m:r>
+              <m:rPr>
+                <m:sty m:val="p"/>
+              </m:rPr>
+              <m:t>o</m:t>
+            </m:r>
+            <m:r>
+              <m:rPr>
+                <m:sty m:val="p"/>
+              </m:rPr>
+              <m:t>l</m:t>
+            </m:r>
+            <m:r>
+              <m:rPr>
+                <m:sty m:val="p"/>
+              </m:rPr>
+              <m:t>d</m:t>
+            </m:r>
+          </m:sup>
+        </m:sSubSup>
       </m:oMath>
       <w:r>
         <w:t xml:space="preserve"> </w:t>
@@ -12554,10 +12774,10 @@
           </m:rPr>
           <m:t>+</m:t>
         </m:r>
-        <m:sSub>
+        <m:sSubSup>
           <m:e>
             <m:r>
-              <m:t>Q</m:t>
+              <m:t>S</m:t>
             </m:r>
           </m:e>
           <m:sub>
@@ -12586,17 +12806,37 @@
               <m:t>D</m:t>
             </m:r>
           </m:sub>
-        </m:sSub>
+          <m:sup>
+            <m:r>
+              <m:rPr>
+                <m:sty m:val="p"/>
+              </m:rPr>
+              <m:t>t</m:t>
+            </m:r>
+            <m:r>
+              <m:rPr>
+                <m:sty m:val="p"/>
+              </m:rPr>
+              <m:t>m</m:t>
+            </m:r>
+            <m:r>
+              <m:rPr>
+                <m:sty m:val="p"/>
+              </m:rPr>
+              <m:t>p</m:t>
+            </m:r>
+          </m:sup>
+        </m:sSubSup>
         <m:r>
           <m:rPr>
             <m:sty m:val="p"/>
           </m:rPr>
           <m:t>+</m:t>
         </m:r>
-        <m:sSub>
+        <m:sSubSup>
           <m:e>
             <m:r>
-              <m:t>V</m:t>
+              <m:t>S</m:t>
             </m:r>
           </m:e>
           <m:sub>
@@ -12625,7 +12865,27 @@
               <m:t>D</m:t>
             </m:r>
           </m:sub>
-        </m:sSub>
+          <m:sup>
+            <m:r>
+              <m:rPr>
+                <m:sty m:val="p"/>
+              </m:rPr>
+              <m:t>o</m:t>
+            </m:r>
+            <m:r>
+              <m:rPr>
+                <m:sty m:val="p"/>
+              </m:rPr>
+              <m:t>l</m:t>
+            </m:r>
+            <m:r>
+              <m:rPr>
+                <m:sty m:val="p"/>
+              </m:rPr>
+              <m:t>d</m:t>
+            </m:r>
+          </m:sup>
+        </m:sSubSup>
         <m:r>
           <m:rPr>
             <m:sty m:val="p"/>
@@ -12771,10 +13031,10 @@
         <w:pStyle w:val="Where"/>
       </w:pPr>
       <m:oMath>
-        <m:sSub>
+        <m:sSubSup>
           <m:e>
             <m:r>
-              <m:t>Q</m:t>
+              <m:t>S</m:t>
             </m:r>
           </m:e>
           <m:sub>
@@ -12803,7 +13063,27 @@
               <m:t>D</m:t>
             </m:r>
           </m:sub>
-        </m:sSub>
+          <m:sup>
+            <m:r>
+              <m:rPr>
+                <m:sty m:val="p"/>
+              </m:rPr>
+              <m:t>t</m:t>
+            </m:r>
+            <m:r>
+              <m:rPr>
+                <m:sty m:val="p"/>
+              </m:rPr>
+              <m:t>m</m:t>
+            </m:r>
+            <m:r>
+              <m:rPr>
+                <m:sty m:val="p"/>
+              </m:rPr>
+              <m:t>p</m:t>
+            </m:r>
+          </m:sup>
+        </m:sSubSup>
       </m:oMath>
       <w:r>
         <w:t xml:space="preserve"> </w:t>
@@ -12817,10 +13097,10 @@
         <w:pStyle w:val="Where"/>
       </w:pPr>
       <m:oMath>
-        <m:sSub>
+        <m:sSubSup>
           <m:e>
             <m:r>
-              <m:t>V</m:t>
+              <m:t>S</m:t>
             </m:r>
           </m:e>
           <m:sub>
@@ -12849,7 +13129,27 @@
               <m:t>D</m:t>
             </m:r>
           </m:sub>
-        </m:sSub>
+          <m:sup>
+            <m:r>
+              <m:rPr>
+                <m:sty m:val="p"/>
+              </m:rPr>
+              <m:t>o</m:t>
+            </m:r>
+            <m:r>
+              <m:rPr>
+                <m:sty m:val="p"/>
+              </m:rPr>
+              <m:t>l</m:t>
+            </m:r>
+            <m:r>
+              <m:rPr>
+                <m:sty m:val="p"/>
+              </m:rPr>
+              <m:t>d</m:t>
+            </m:r>
+          </m:sup>
+        </m:sSubSup>
       </m:oMath>
       <w:r>
         <w:t xml:space="preserve"> </w:t>

</xml_diff>

<commit_message>
Keep object index as subscript in thesis formulas
</commit_message>
<xml_diff>
--- a/40 - Projects/Диплом/Диплом_ГОСТ.docx
+++ b/40 - Projects/Диплом/Диплом_ГОСТ.docx
@@ -5294,6 +5294,11 @@
           </m:e>
           <m:sub>
             <m:r>
+              <m:t>i</m:t>
+            </m:r>
+          </m:sub>
+          <m:sup>
+            <m:r>
               <m:rPr>
                 <m:sty m:val="p"/>
               </m:rPr>
@@ -5311,11 +5316,6 @@
               </m:rPr>
               <m:t>к</m:t>
             </m:r>
-          </m:sub>
-          <m:sup>
-            <m:r>
-              <m:t>i</m:t>
-            </m:r>
           </m:sup>
         </m:sSubSup>
       </m:oMath>
@@ -5596,6 +5596,11 @@
           </m:e>
           <m:sub>
             <m:r>
+              <m:t>i</m:t>
+            </m:r>
+          </m:sub>
+          <m:sup>
+            <m:r>
               <m:rPr>
                 <m:sty m:val="p"/>
               </m:rPr>
@@ -5613,11 +5618,6 @@
               </m:rPr>
               <m:t>к</m:t>
             </m:r>
-          </m:sub>
-          <m:sup>
-            <m:r>
-              <m:t>i</m:t>
-            </m:r>
           </m:sup>
         </m:sSubSup>
       </m:oMath>
@@ -5712,6 +5712,11 @@
           </m:e>
           <m:sub>
             <m:r>
+              <m:t>i</m:t>
+            </m:r>
+          </m:sub>
+          <m:sup>
+            <m:r>
               <m:rPr>
                 <m:sty m:val="p"/>
               </m:rPr>
@@ -5728,11 +5733,6 @@
                 <m:sty m:val="p"/>
               </m:rPr>
               <m:t>к</m:t>
-            </m:r>
-          </m:sub>
-          <m:sup>
-            <m:r>
-              <m:t>i</m:t>
             </m:r>
           </m:sup>
         </m:sSubSup>
@@ -6446,6 +6446,11 @@
                 </m:e>
                 <m:sub>
                   <m:r>
+                    <m:t>i</m:t>
+                  </m:r>
+                </m:sub>
+                <m:sup>
+                  <m:r>
                     <m:rPr>
                       <m:sty m:val="p"/>
                     </m:rPr>
@@ -6462,11 +6467,6 @@
                       <m:sty m:val="p"/>
                     </m:rPr>
                     <m:t>к</m:t>
-                  </m:r>
-                </m:sub>
-                <m:sup>
-                  <m:r>
-                    <m:t>i</m:t>
                   </m:r>
                 </m:sup>
               </m:sSubSup>
@@ -7119,6 +7119,11 @@
                 </m:e>
                 <m:sub>
                   <m:r>
+                    <m:t>i</m:t>
+                  </m:r>
+                </m:sub>
+                <m:sup>
+                  <m:r>
                     <m:rPr>
                       <m:sty m:val="p"/>
                     </m:rPr>
@@ -7135,11 +7140,6 @@
                       <m:sty m:val="p"/>
                     </m:rPr>
                     <m:t>к</m:t>
-                  </m:r>
-                </m:sub>
-                <m:sup>
-                  <m:r>
-                    <m:t>i</m:t>
                   </m:r>
                 </m:sup>
               </m:sSubSup>
@@ -8710,6 +8710,11 @@
                 </m:e>
                 <m:sub>
                   <m:r>
+                    <m:t>i</m:t>
+                  </m:r>
+                </m:sub>
+                <m:sup>
+                  <m:r>
                     <m:rPr>
                       <m:sty m:val="p"/>
                     </m:rPr>
@@ -8727,11 +8732,6 @@
                     </m:rPr>
                     <m:t>T</m:t>
                   </m:r>
-                </m:sub>
-                <m:sup>
-                  <m:r>
-                    <m:t>i</m:t>
-                  </m:r>
                 </m:sup>
               </m:sSubSup>
             </m:oMath>
@@ -8757,6 +8757,11 @@
                   </m:r>
                 </m:e>
                 <m:sub>
+                  <m:r>
+                    <m:t>i</m:t>
+                  </m:r>
+                </m:sub>
+                <m:sup>
                   <m:r>
                     <m:rPr>
                       <m:sty m:val="p"/>
@@ -8780,11 +8785,6 @@
                       <m:sty m:val="p"/>
                     </m:rPr>
                     <m:t>D</m:t>
-                  </m:r>
-                </m:sub>
-                <m:sup>
-                  <m:r>
-                    <m:t>i</m:t>
                   </m:r>
                 </m:sup>
               </m:sSubSup>
@@ -10944,6 +10944,11 @@
           </m:e>
           <m:sub>
             <m:r>
+              <m:t>i</m:t>
+            </m:r>
+          </m:sub>
+          <m:sup>
+            <m:r>
               <m:rPr>
                 <m:sty m:val="p"/>
               </m:rPr>
@@ -10960,11 +10965,6 @@
                 <m:sty m:val="p"/>
               </m:rPr>
               <m:t>T</m:t>
-            </m:r>
-          </m:sub>
-          <m:sup>
-            <m:r>
-              <m:t>i</m:t>
             </m:r>
           </m:sup>
         </m:sSubSup>
@@ -11119,6 +11119,11 @@
           </m:e>
           <m:sub>
             <m:r>
+              <m:t>i</m:t>
+            </m:r>
+          </m:sub>
+          <m:sup>
+            <m:r>
               <m:rPr>
                 <m:sty m:val="p"/>
               </m:rPr>
@@ -11135,11 +11140,6 @@
                 <m:sty m:val="p"/>
               </m:rPr>
               <m:t>T</m:t>
-            </m:r>
-          </m:sub>
-          <m:sup>
-            <m:r>
-              <m:t>i</m:t>
             </m:r>
           </m:sup>
         </m:sSubSup>
@@ -11262,6 +11262,11 @@
           </m:e>
           <m:sub>
             <m:r>
+              <m:t>i</m:t>
+            </m:r>
+          </m:sub>
+          <m:sup>
+            <m:r>
               <m:rPr>
                 <m:sty m:val="p"/>
               </m:rPr>
@@ -11284,11 +11289,6 @@
                 <m:sty m:val="p"/>
               </m:rPr>
               <m:t>D</m:t>
-            </m:r>
-          </m:sub>
-          <m:sup>
-            <m:r>
-              <m:t>i</m:t>
             </m:r>
           </m:sup>
         </m:sSubSup>
@@ -11455,6 +11455,11 @@
           </m:e>
           <m:sub>
             <m:r>
+              <m:t>i</m:t>
+            </m:r>
+          </m:sub>
+          <m:sup>
+            <m:r>
               <m:rPr>
                 <m:sty m:val="p"/>
               </m:rPr>
@@ -11477,11 +11482,6 @@
                 <m:sty m:val="p"/>
               </m:rPr>
               <m:t>D</m:t>
-            </m:r>
-          </m:sub>
-          <m:sup>
-            <m:r>
-              <m:t>i</m:t>
             </m:r>
           </m:sup>
         </m:sSubSup>
@@ -11561,6 +11561,11 @@
           </m:e>
           <m:sub>
             <m:r>
+              <m:t>i</m:t>
+            </m:r>
+          </m:sub>
+          <m:sup>
+            <m:r>
               <m:rPr>
                 <m:sty m:val="p"/>
               </m:rPr>
@@ -11584,11 +11589,6 @@
               </m:rPr>
               <m:t>D</m:t>
             </m:r>
-          </m:sub>
-          <m:sup>
-            <m:r>
-              <m:t>i</m:t>
-            </m:r>
           </m:sup>
         </m:sSubSup>
         <m:r>
@@ -11605,6 +11605,11 @@
           </m:e>
           <m:sub>
             <m:r>
+              <m:t>i</m:t>
+            </m:r>
+          </m:sub>
+          <m:sup>
+            <m:r>
               <m:rPr>
                 <m:sty m:val="p"/>
               </m:rPr>
@@ -11621,11 +11626,6 @@
                 <m:sty m:val="p"/>
               </m:rPr>
               <m:t>T</m:t>
-            </m:r>
-          </m:sub>
-          <m:sup>
-            <m:r>
-              <m:t>i</m:t>
             </m:r>
           </m:sup>
         </m:sSubSup>

</xml_diff>

<commit_message>
Remove trivial and duplicated explanations under thesis formulas
</commit_message>
<xml_diff>
--- a/40 - Projects/Диплом/Диплом_ГОСТ.docx
+++ b/40 - Projects/Диплом/Диплом_ГОСТ.docx
@@ -5581,10 +5581,10 @@
         <w:tblCaption w:val="Таблица 2.1 — Обозначения модели размещения"/>
       </w:tblPr>
       <w:tblGrid>
-        <w:gridCol w:w="1973"/>
-        <w:gridCol w:w="3641"/>
+        <w:gridCol w:w="1962"/>
+        <w:gridCol w:w="3709"/>
         <w:gridCol w:w="1270"/>
-        <w:gridCol w:w="2754"/>
+        <w:gridCol w:w="2697"/>
       </w:tblGrid>
       <w:tr>
         <w:trPr>
@@ -5593,7 +5593,7 @@
         </w:trPr>
         <w:tc>
           <w:tcPr>
-            <w:tcW w:w="1973" w:type="dxa"/>
+            <w:tcW w:w="1962" w:type="dxa"/>
           </w:tcPr>
           <w:p>
             <w:pPr>
@@ -5617,7 +5617,7 @@
         </w:tc>
         <w:tc>
           <w:tcPr>
-            <w:tcW w:w="3641" w:type="dxa"/>
+            <w:tcW w:w="3709" w:type="dxa"/>
           </w:tcPr>
           <w:p>
             <w:pPr>
@@ -5665,7 +5665,7 @@
         </w:tc>
         <w:tc>
           <w:tcPr>
-            <w:tcW w:w="2754" w:type="dxa"/>
+            <w:tcW w:w="2697" w:type="dxa"/>
           </w:tcPr>
           <w:p>
             <w:pPr>
@@ -5694,7 +5694,7 @@
         </w:trPr>
         <w:tc>
           <w:tcPr>
-            <w:tcW w:w="1973" w:type="dxa"/>
+            <w:tcW w:w="1962" w:type="dxa"/>
           </w:tcPr>
           <w:p>
             <w:pPr>
@@ -5715,7 +5715,7 @@
         </w:tc>
         <w:tc>
           <w:tcPr>
-            <w:tcW w:w="3641" w:type="dxa"/>
+            <w:tcW w:w="3709" w:type="dxa"/>
           </w:tcPr>
           <w:p>
             <w:pPr>
@@ -5761,7 +5761,7 @@
         </w:tc>
         <w:tc>
           <w:tcPr>
-            <w:tcW w:w="2754" w:type="dxa"/>
+            <w:tcW w:w="2697" w:type="dxa"/>
           </w:tcPr>
           <w:p>
             <w:pPr>
@@ -5789,7 +5789,7 @@
         </w:trPr>
         <w:tc>
           <w:tcPr>
-            <w:tcW w:w="1973" w:type="dxa"/>
+            <w:tcW w:w="1962" w:type="dxa"/>
           </w:tcPr>
           <w:p>
             <w:pPr>
@@ -5810,7 +5810,7 @@
         </w:tc>
         <w:tc>
           <w:tcPr>
-            <w:tcW w:w="3641" w:type="dxa"/>
+            <w:tcW w:w="3709" w:type="dxa"/>
           </w:tcPr>
           <w:p>
             <w:pPr>
@@ -5868,7 +5868,7 @@
         </w:tc>
         <w:tc>
           <w:tcPr>
-            <w:tcW w:w="2754" w:type="dxa"/>
+            <w:tcW w:w="2697" w:type="dxa"/>
           </w:tcPr>
           <w:p>
             <w:pPr>
@@ -5896,7 +5896,7 @@
         </w:trPr>
         <w:tc>
           <w:tcPr>
-            <w:tcW w:w="1973" w:type="dxa"/>
+            <w:tcW w:w="1962" w:type="dxa"/>
           </w:tcPr>
           <w:p>
             <w:pPr>
@@ -5926,7 +5926,7 @@
         </w:tc>
         <w:tc>
           <w:tcPr>
-            <w:tcW w:w="3641" w:type="dxa"/>
+            <w:tcW w:w="3709" w:type="dxa"/>
           </w:tcPr>
           <w:p>
             <w:pPr>
@@ -5984,7 +5984,7 @@
         </w:tc>
         <w:tc>
           <w:tcPr>
-            <w:tcW w:w="2754" w:type="dxa"/>
+            <w:tcW w:w="2697" w:type="dxa"/>
           </w:tcPr>
           <w:p>
             <w:pPr>
@@ -6012,7 +6012,7 @@
         </w:trPr>
         <w:tc>
           <w:tcPr>
-            <w:tcW w:w="1973" w:type="dxa"/>
+            <w:tcW w:w="1962" w:type="dxa"/>
           </w:tcPr>
           <w:p>
             <w:pPr>
@@ -6062,7 +6062,7 @@
         </w:tc>
         <w:tc>
           <w:tcPr>
-            <w:tcW w:w="3641" w:type="dxa"/>
+            <w:tcW w:w="3709" w:type="dxa"/>
           </w:tcPr>
           <w:p>
             <w:pPr>
@@ -6127,7 +6127,7 @@
         </w:tc>
         <w:tc>
           <w:tcPr>
-            <w:tcW w:w="2754" w:type="dxa"/>
+            <w:tcW w:w="2697" w:type="dxa"/>
           </w:tcPr>
           <w:p>
             <w:pPr>
@@ -6155,7 +6155,7 @@
         </w:trPr>
         <w:tc>
           <w:tcPr>
-            <w:tcW w:w="1973" w:type="dxa"/>
+            <w:tcW w:w="1962" w:type="dxa"/>
           </w:tcPr>
           <w:p>
             <w:pPr>
@@ -6185,7 +6185,7 @@
         </w:tc>
         <w:tc>
           <w:tcPr>
-            <w:tcW w:w="3641" w:type="dxa"/>
+            <w:tcW w:w="3709" w:type="dxa"/>
           </w:tcPr>
           <w:p>
             <w:pPr>
@@ -6257,7 +6257,7 @@
         </w:tc>
         <w:tc>
           <w:tcPr>
-            <w:tcW w:w="2754" w:type="dxa"/>
+            <w:tcW w:w="2697" w:type="dxa"/>
           </w:tcPr>
           <w:p>
             <w:pPr>
@@ -6285,7 +6285,7 @@
         </w:trPr>
         <w:tc>
           <w:tcPr>
-            <w:tcW w:w="1973" w:type="dxa"/>
+            <w:tcW w:w="1962" w:type="dxa"/>
           </w:tcPr>
           <w:p>
             <w:pPr>
@@ -6306,7 +6306,7 @@
         </w:tc>
         <w:tc>
           <w:tcPr>
-            <w:tcW w:w="3641" w:type="dxa"/>
+            <w:tcW w:w="3709" w:type="dxa"/>
           </w:tcPr>
           <w:p>
             <w:pPr>
@@ -6352,7 +6352,7 @@
         </w:tc>
         <w:tc>
           <w:tcPr>
-            <w:tcW w:w="2754" w:type="dxa"/>
+            <w:tcW w:w="2697" w:type="dxa"/>
           </w:tcPr>
           <w:p>
             <w:pPr>
@@ -6380,7 +6380,7 @@
         </w:trPr>
         <w:tc>
           <w:tcPr>
-            <w:tcW w:w="1973" w:type="dxa"/>
+            <w:tcW w:w="1962" w:type="dxa"/>
           </w:tcPr>
           <w:p>
             <w:pPr>
@@ -6425,7 +6425,7 @@
         </w:tc>
         <w:tc>
           <w:tcPr>
-            <w:tcW w:w="3641" w:type="dxa"/>
+            <w:tcW w:w="3709" w:type="dxa"/>
           </w:tcPr>
           <w:p>
             <w:pPr>
@@ -6567,7 +6567,7 @@
         </w:tc>
         <w:tc>
           <w:tcPr>
-            <w:tcW w:w="2754" w:type="dxa"/>
+            <w:tcW w:w="2697" w:type="dxa"/>
           </w:tcPr>
           <w:p>
             <w:pPr>
@@ -6595,7 +6595,7 @@
         </w:trPr>
         <w:tc>
           <w:tcPr>
-            <w:tcW w:w="1973" w:type="dxa"/>
+            <w:tcW w:w="1962" w:type="dxa"/>
           </w:tcPr>
           <w:p>
             <w:pPr>
@@ -6632,7 +6632,7 @@
         </w:tc>
         <w:tc>
           <w:tcPr>
-            <w:tcW w:w="3641" w:type="dxa"/>
+            <w:tcW w:w="3709" w:type="dxa"/>
           </w:tcPr>
           <w:p>
             <w:pPr>
@@ -6746,7 +6746,7 @@
         </w:tc>
         <w:tc>
           <w:tcPr>
-            <w:tcW w:w="2754" w:type="dxa"/>
+            <w:tcW w:w="2697" w:type="dxa"/>
           </w:tcPr>
           <w:p>
             <w:pPr>
@@ -6774,7 +6774,7 @@
         </w:trPr>
         <w:tc>
           <w:tcPr>
-            <w:tcW w:w="1973" w:type="dxa"/>
+            <w:tcW w:w="1962" w:type="dxa"/>
           </w:tcPr>
           <w:p>
             <w:pPr>
@@ -6804,7 +6804,7 @@
         </w:tc>
         <w:tc>
           <w:tcPr>
-            <w:tcW w:w="3641" w:type="dxa"/>
+            <w:tcW w:w="3709" w:type="dxa"/>
           </w:tcPr>
           <w:p>
             <w:pPr>
@@ -6869,7 +6869,7 @@
         </w:tc>
         <w:tc>
           <w:tcPr>
-            <w:tcW w:w="2754" w:type="dxa"/>
+            <w:tcW w:w="2697" w:type="dxa"/>
           </w:tcPr>
           <w:p>
             <w:pPr>
@@ -6897,7 +6897,7 @@
         </w:trPr>
         <w:tc>
           <w:tcPr>
-            <w:tcW w:w="1973" w:type="dxa"/>
+            <w:tcW w:w="1962" w:type="dxa"/>
           </w:tcPr>
           <w:p>
             <w:pPr>
@@ -6934,7 +6934,7 @@
         </w:tc>
         <w:tc>
           <w:tcPr>
-            <w:tcW w:w="3641" w:type="dxa"/>
+            <w:tcW w:w="3709" w:type="dxa"/>
           </w:tcPr>
           <w:p>
             <w:pPr>
@@ -7058,7 +7058,7 @@
         </w:tc>
         <w:tc>
           <w:tcPr>
-            <w:tcW w:w="2754" w:type="dxa"/>
+            <w:tcW w:w="2697" w:type="dxa"/>
           </w:tcPr>
           <w:p>
             <w:pPr>
@@ -7177,7 +7177,7 @@
         </w:trPr>
         <w:tc>
           <w:tcPr>
-            <w:tcW w:w="1973" w:type="dxa"/>
+            <w:tcW w:w="1962" w:type="dxa"/>
           </w:tcPr>
           <w:p>
             <w:pPr>
@@ -7271,7 +7271,7 @@
         </w:tc>
         <w:tc>
           <w:tcPr>
-            <w:tcW w:w="3641" w:type="dxa"/>
+            <w:tcW w:w="3709" w:type="dxa"/>
           </w:tcPr>
           <w:p>
             <w:pPr>
@@ -7317,7 +7317,7 @@
         </w:tc>
         <w:tc>
           <w:tcPr>
-            <w:tcW w:w="2754" w:type="dxa"/>
+            <w:tcW w:w="2697" w:type="dxa"/>
           </w:tcPr>
           <w:p>
             <w:pPr>
@@ -7345,7 +7345,7 @@
         </w:trPr>
         <w:tc>
           <w:tcPr>
-            <w:tcW w:w="1973" w:type="dxa"/>
+            <w:tcW w:w="1962" w:type="dxa"/>
           </w:tcPr>
           <w:p>
             <w:pPr>
@@ -7439,7 +7439,7 @@
         </w:tc>
         <w:tc>
           <w:tcPr>
-            <w:tcW w:w="3641" w:type="dxa"/>
+            <w:tcW w:w="3709" w:type="dxa"/>
           </w:tcPr>
           <w:p>
             <w:pPr>
@@ -7485,7 +7485,7 @@
         </w:tc>
         <w:tc>
           <w:tcPr>
-            <w:tcW w:w="2754" w:type="dxa"/>
+            <w:tcW w:w="2697" w:type="dxa"/>
           </w:tcPr>
           <w:p>
             <w:pPr>
@@ -7513,7 +7513,7 @@
         </w:trPr>
         <w:tc>
           <w:tcPr>
-            <w:tcW w:w="1973" w:type="dxa"/>
+            <w:tcW w:w="1962" w:type="dxa"/>
           </w:tcPr>
           <w:p>
             <w:pPr>
@@ -7607,7 +7607,7 @@
         </w:tc>
         <w:tc>
           <w:tcPr>
-            <w:tcW w:w="3641" w:type="dxa"/>
+            <w:tcW w:w="3709" w:type="dxa"/>
           </w:tcPr>
           <w:p>
             <w:pPr>
@@ -7653,7 +7653,7 @@
         </w:tc>
         <w:tc>
           <w:tcPr>
-            <w:tcW w:w="2754" w:type="dxa"/>
+            <w:tcW w:w="2697" w:type="dxa"/>
           </w:tcPr>
           <w:p>
             <w:pPr>
@@ -7681,7 +7681,7 @@
         </w:trPr>
         <w:tc>
           <w:tcPr>
-            <w:tcW w:w="1973" w:type="dxa"/>
+            <w:tcW w:w="1962" w:type="dxa"/>
           </w:tcPr>
           <w:p>
             <w:pPr>
@@ -7775,7 +7775,7 @@
         </w:tc>
         <w:tc>
           <w:tcPr>
-            <w:tcW w:w="3641" w:type="dxa"/>
+            <w:tcW w:w="3709" w:type="dxa"/>
           </w:tcPr>
           <w:p>
             <w:pPr>
@@ -7821,7 +7821,7 @@
         </w:tc>
         <w:tc>
           <w:tcPr>
-            <w:tcW w:w="2754" w:type="dxa"/>
+            <w:tcW w:w="2697" w:type="dxa"/>
           </w:tcPr>
           <w:p>
             <w:pPr>
@@ -7849,7 +7849,7 @@
         </w:trPr>
         <w:tc>
           <w:tcPr>
-            <w:tcW w:w="1973" w:type="dxa"/>
+            <w:tcW w:w="1962" w:type="dxa"/>
           </w:tcPr>
           <w:p>
             <w:pPr>
@@ -7983,7 +7983,7 @@
         </w:tc>
         <w:tc>
           <w:tcPr>
-            <w:tcW w:w="3641" w:type="dxa"/>
+            <w:tcW w:w="3709" w:type="dxa"/>
           </w:tcPr>
           <w:p>
             <w:pPr>
@@ -8029,7 +8029,7 @@
         </w:tc>
         <w:tc>
           <w:tcPr>
-            <w:tcW w:w="2754" w:type="dxa"/>
+            <w:tcW w:w="2697" w:type="dxa"/>
           </w:tcPr>
           <w:p>
             <w:pPr>
@@ -8057,7 +8057,7 @@
         </w:trPr>
         <w:tc>
           <w:tcPr>
-            <w:tcW w:w="1973" w:type="dxa"/>
+            <w:tcW w:w="1962" w:type="dxa"/>
           </w:tcPr>
           <w:p>
             <w:pPr>
@@ -8191,7 +8191,7 @@
         </w:tc>
         <w:tc>
           <w:tcPr>
-            <w:tcW w:w="3641" w:type="dxa"/>
+            <w:tcW w:w="3709" w:type="dxa"/>
           </w:tcPr>
           <w:p>
             <w:pPr>
@@ -8237,7 +8237,7 @@
         </w:tc>
         <w:tc>
           <w:tcPr>
-            <w:tcW w:w="2754" w:type="dxa"/>
+            <w:tcW w:w="2697" w:type="dxa"/>
           </w:tcPr>
           <w:p>
             <w:pPr>
@@ -8265,7 +8265,7 @@
         </w:trPr>
         <w:tc>
           <w:tcPr>
-            <w:tcW w:w="1973" w:type="dxa"/>
+            <w:tcW w:w="1962" w:type="dxa"/>
           </w:tcPr>
           <w:p>
             <w:pPr>
@@ -8286,7 +8286,7 @@
         </w:tc>
         <w:tc>
           <w:tcPr>
-            <w:tcW w:w="3641" w:type="dxa"/>
+            <w:tcW w:w="3709" w:type="dxa"/>
           </w:tcPr>
           <w:p>
             <w:pPr>
@@ -8303,7 +8303,7 @@
                 <w:sz w:val="24"/>
                 <w:szCs w:val="24"/>
               </w:rPr>
-              <w:t xml:space="preserve">Остаток бюджета копирования на цикл</w:t>
+              <w:t xml:space="preserve">Остаток бюджета копирования на цикл за вычетом выполняемых переносов и неуспешных попыток</w:t>
             </w:r>
           </w:p>
         </w:tc>
@@ -8332,7 +8332,7 @@
         </w:tc>
         <w:tc>
           <w:tcPr>
-            <w:tcW w:w="2754" w:type="dxa"/>
+            <w:tcW w:w="2697" w:type="dxa"/>
           </w:tcPr>
           <w:p>
             <w:pPr>
@@ -8360,7 +8360,7 @@
         </w:trPr>
         <w:tc>
           <w:tcPr>
-            <w:tcW w:w="1973" w:type="dxa"/>
+            <w:tcW w:w="1962" w:type="dxa"/>
           </w:tcPr>
           <w:p>
             <w:pPr>
@@ -8381,7 +8381,7 @@
         </w:tc>
         <w:tc>
           <w:tcPr>
-            <w:tcW w:w="3641" w:type="dxa"/>
+            <w:tcW w:w="3709" w:type="dxa"/>
           </w:tcPr>
           <w:p>
             <w:pPr>
@@ -8427,7 +8427,7 @@
         </w:tc>
         <w:tc>
           <w:tcPr>
-            <w:tcW w:w="2754" w:type="dxa"/>
+            <w:tcW w:w="2697" w:type="dxa"/>
           </w:tcPr>
           <w:p>
             <w:pPr>
@@ -8455,7 +8455,7 @@
         </w:trPr>
         <w:tc>
           <w:tcPr>
-            <w:tcW w:w="1973" w:type="dxa"/>
+            <w:tcW w:w="1962" w:type="dxa"/>
           </w:tcPr>
           <w:p>
             <w:pPr>
@@ -8491,7 +8491,7 @@
         </w:tc>
         <w:tc>
           <w:tcPr>
-            <w:tcW w:w="3641" w:type="dxa"/>
+            <w:tcW w:w="3709" w:type="dxa"/>
           </w:tcPr>
           <w:p>
             <w:pPr>
@@ -8537,7 +8537,7 @@
         </w:tc>
         <w:tc>
           <w:tcPr>
-            <w:tcW w:w="2754" w:type="dxa"/>
+            <w:tcW w:w="2697" w:type="dxa"/>
           </w:tcPr>
           <w:p>
             <w:pPr>
@@ -8833,93 +8833,7 @@
         <w:t xml:space="preserve"> </w:t>
       </w:r>
       <w:r>
-        <w:t xml:space="preserve">– объём одного чтения, МиБ;</w:t>
-      </w:r>
-    </w:p>
-    <w:p>
-      <w:pPr>
-        <w:pStyle w:val="Where"/>
-      </w:pPr>
-      <w:r>
-        <w:tab/>
-      </w:r>
-      <m:oMath>
-        <m:sSub>
-          <m:e>
-            <m:r>
-              <m:t>c</m:t>
-            </m:r>
-          </m:e>
-          <m:sub>
-            <m:r>
-              <m:rPr>
-                <m:sty m:val="p"/>
-              </m:rPr>
-              <m:t>H</m:t>
-            </m:r>
-            <m:r>
-              <m:rPr>
-                <m:sty m:val="p"/>
-              </m:rPr>
-              <m:t>O</m:t>
-            </m:r>
-            <m:r>
-              <m:rPr>
-                <m:sty m:val="p"/>
-              </m:rPr>
-              <m:t>T</m:t>
-            </m:r>
-          </m:sub>
-        </m:sSub>
-      </m:oMath>
-      <w:r>
-        <w:t xml:space="preserve"> </w:t>
-      </w:r>
-      <w:r>
-        <w:t xml:space="preserve">– постоянная часть времени чтения в HOT, не зависящая от объёма, мс;</w:t>
-      </w:r>
-    </w:p>
-    <w:p>
-      <w:pPr>
-        <w:pStyle w:val="Where"/>
-      </w:pPr>
-      <w:r>
-        <w:tab/>
-      </w:r>
-      <m:oMath>
-        <m:sSub>
-          <m:e>
-            <m:r>
-              <m:t>v</m:t>
-            </m:r>
-          </m:e>
-          <m:sub>
-            <m:r>
-              <m:rPr>
-                <m:sty m:val="p"/>
-              </m:rPr>
-              <m:t>H</m:t>
-            </m:r>
-            <m:r>
-              <m:rPr>
-                <m:sty m:val="p"/>
-              </m:rPr>
-              <m:t>O</m:t>
-            </m:r>
-            <m:r>
-              <m:rPr>
-                <m:sty m:val="p"/>
-              </m:rPr>
-              <m:t>T</m:t>
-            </m:r>
-          </m:sub>
-        </m:sSub>
-      </m:oMath>
-      <w:r>
-        <w:t xml:space="preserve"> </w:t>
-      </w:r>
-      <w:r>
-        <w:t xml:space="preserve">– скорость передачи данных в HOT, МиБ/мс.</w:t>
+        <w:t xml:space="preserve">– объём одного чтения, МиБ.</w:t>
       </w:r>
     </w:p>
     <w:p>
@@ -8933,8 +8847,7 @@
     <w:p>
       <w:pPr>
         <w:pStyle w:val="a2"/>
-        <w:keepNext w:val="1"/>
-        <w:keepLines w:val="1"/>
+        <w:keepNext w:val="0"/>
         <w:pageBreakBefore w:val="0"/>
         <w:widowControl w:val="1"/>
         <w:tabs>
@@ -9092,7 +9005,7 @@
           <m:rPr>
             <m:sty m:val="p"/>
           </m:rPr>
-          <m:t>,</m:t>
+          <m:t>.</m:t>
         </m:r>
       </m:oMath>
       <w:r>
@@ -9114,186 +9027,7 @@
     </w:p>
     <w:p>
       <w:pPr>
-        <w:pStyle w:val="Where"/>
-      </w:pPr>
-      <w:r>
-        <w:t xml:space="preserve">где</w:t>
-      </w:r>
-      <w:r>
-        <w:tab/>
-      </w:r>
-      <m:oMath>
-        <m:sSub>
-          <m:e>
-            <m:r>
-              <m:t>t</m:t>
-            </m:r>
-          </m:e>
-          <m:sub>
-            <m:r>
-              <m:rPr>
-                <m:sty m:val="p"/>
-              </m:rPr>
-              <m:t>C</m:t>
-            </m:r>
-            <m:r>
-              <m:rPr>
-                <m:sty m:val="p"/>
-              </m:rPr>
-              <m:t>O</m:t>
-            </m:r>
-            <m:r>
-              <m:rPr>
-                <m:sty m:val="p"/>
-              </m:rPr>
-              <m:t>L</m:t>
-            </m:r>
-            <m:r>
-              <m:rPr>
-                <m:sty m:val="p"/>
-              </m:rPr>
-              <m:t>D</m:t>
-            </m:r>
-          </m:sub>
-        </m:sSub>
-        <m:r>
-          <m:rPr>
-            <m:sty m:val="p"/>
-          </m:rPr>
-          <m:t>(</m:t>
-        </m:r>
-        <m:r>
-          <m:t>d</m:t>
-        </m:r>
-        <m:r>
-          <m:rPr>
-            <m:sty m:val="p"/>
-          </m:rPr>
-          <m:t>)</m:t>
-        </m:r>
-      </m:oMath>
-      <w:r>
-        <w:t xml:space="preserve"> </w:t>
-      </w:r>
-      <w:r>
-        <w:t xml:space="preserve">– время одного чтения объёма</w:t>
-      </w:r>
-      <w:r>
-        <w:t xml:space="preserve"> </w:t>
-      </w:r>
-      <m:oMath>
-        <m:r>
-          <m:t>d</m:t>
-        </m:r>
-      </m:oMath>
-      <w:r>
-        <w:t xml:space="preserve"> </w:t>
-      </w:r>
-      <w:r>
-        <w:t xml:space="preserve">из COLD, мс;</w:t>
-      </w:r>
-    </w:p>
-    <w:p>
-      <w:pPr>
-        <w:pStyle w:val="Where"/>
-      </w:pPr>
-      <w:r>
-        <w:tab/>
-      </w:r>
-      <m:oMath>
-        <m:sSub>
-          <m:e>
-            <m:r>
-              <m:t>c</m:t>
-            </m:r>
-          </m:e>
-          <m:sub>
-            <m:r>
-              <m:rPr>
-                <m:sty m:val="p"/>
-              </m:rPr>
-              <m:t>C</m:t>
-            </m:r>
-            <m:r>
-              <m:rPr>
-                <m:sty m:val="p"/>
-              </m:rPr>
-              <m:t>O</m:t>
-            </m:r>
-            <m:r>
-              <m:rPr>
-                <m:sty m:val="p"/>
-              </m:rPr>
-              <m:t>L</m:t>
-            </m:r>
-            <m:r>
-              <m:rPr>
-                <m:sty m:val="p"/>
-              </m:rPr>
-              <m:t>D</m:t>
-            </m:r>
-          </m:sub>
-        </m:sSub>
-      </m:oMath>
-      <w:r>
-        <w:t xml:space="preserve"> </w:t>
-      </w:r>
-      <w:r>
-        <w:t xml:space="preserve">– постоянная часть времени чтения в COLD, мс;</w:t>
-      </w:r>
-    </w:p>
-    <w:p>
-      <w:pPr>
-        <w:pStyle w:val="Where"/>
-      </w:pPr>
-      <w:r>
-        <w:tab/>
-      </w:r>
-      <m:oMath>
-        <m:sSub>
-          <m:e>
-            <m:r>
-              <m:t>v</m:t>
-            </m:r>
-          </m:e>
-          <m:sub>
-            <m:r>
-              <m:rPr>
-                <m:sty m:val="p"/>
-              </m:rPr>
-              <m:t>C</m:t>
-            </m:r>
-            <m:r>
-              <m:rPr>
-                <m:sty m:val="p"/>
-              </m:rPr>
-              <m:t>O</m:t>
-            </m:r>
-            <m:r>
-              <m:rPr>
-                <m:sty m:val="p"/>
-              </m:rPr>
-              <m:t>L</m:t>
-            </m:r>
-            <m:r>
-              <m:rPr>
-                <m:sty m:val="p"/>
-              </m:rPr>
-              <m:t>D</m:t>
-            </m:r>
-          </m:sub>
-        </m:sSub>
-      </m:oMath>
-      <w:r>
-        <w:t xml:space="preserve"> </w:t>
-      </w:r>
-      <w:r>
-        <w:t xml:space="preserve">– скорость передачи данных в COLD, МиБ/мс.</w:t>
-      </w:r>
-    </w:p>
-    <w:p>
-      <w:pPr>
-        <w:pStyle w:val="a2"/>
+        <w:pStyle w:val="FirstParagraph"/>
       </w:pPr>
       <w:r>
         <w:t xml:space="preserve">Второе слагаемое равно времени передачи данных. Два слагаемых нужны, так как объекты имеют разный размер, а интерфейс S3 объектного хранилища допускает чтение диапазона [13]. Постоянная часть и скорость передачи определяются накопителями класса и измеряются на стенде. Сумма времени чтения (2.1) по</w:t>
@@ -9613,92 +9347,70 @@
         <w:t xml:space="preserve"> </w:t>
       </w:r>
       <w:r>
-        <w:t xml:space="preserve">в HOT за горизонт, мс;</w:t>
-      </w:r>
-    </w:p>
-    <w:p>
-      <w:pPr>
-        <w:pStyle w:val="Where"/>
-      </w:pPr>
-      <w:r>
-        <w:tab/>
+        <w:t xml:space="preserve">в HOT за горизонт, мс.</w:t>
+      </w:r>
+    </w:p>
+    <w:p>
+      <w:pPr>
+        <w:pStyle w:val="a2"/>
+      </w:pPr>
+      <w:r>
+        <w:t xml:space="preserve">Задержка</w:t>
+      </w:r>
+      <w:r>
+        <w:t xml:space="preserve"> </w:t>
       </w:r>
       <m:oMath>
-        <m:sSub>
+        <m:sSubSup>
           <m:e>
-            <m:acc>
-              <m:accPr>
-                <m:chr m:val="̂"/>
-              </m:accPr>
-              <m:e>
-                <m:r>
-                  <m:t>N</m:t>
-                </m:r>
-              </m:e>
-            </m:acc>
+            <m:r>
+              <m:t>L</m:t>
+            </m:r>
           </m:e>
           <m:sub>
             <m:r>
               <m:t>i</m:t>
             </m:r>
           </m:sub>
-        </m:sSub>
+          <m:sup>
+            <m:r>
+              <m:rPr>
+                <m:sty m:val="p"/>
+              </m:rPr>
+              <m:t>C</m:t>
+            </m:r>
+            <m:r>
+              <m:rPr>
+                <m:sty m:val="p"/>
+              </m:rPr>
+              <m:t>O</m:t>
+            </m:r>
+            <m:r>
+              <m:rPr>
+                <m:sty m:val="p"/>
+              </m:rPr>
+              <m:t>L</m:t>
+            </m:r>
+            <m:r>
+              <m:rPr>
+                <m:sty m:val="p"/>
+              </m:rPr>
+              <m:t>D</m:t>
+            </m:r>
+          </m:sup>
+        </m:sSubSup>
       </m:oMath>
       <w:r>
         <w:t xml:space="preserve"> </w:t>
       </w:r>
       <w:r>
-        <w:t xml:space="preserve">– прогноз числа чтений объекта за горизонт (Таблица 2.1);</w:t>
-      </w:r>
-    </w:p>
-    <w:p>
-      <w:pPr>
-        <w:pStyle w:val="Where"/>
-      </w:pPr>
-      <w:r>
-        <w:tab/>
-      </w:r>
-      <m:oMath>
-        <m:sSub>
-          <m:e>
-            <m:acc>
-              <m:accPr>
-                <m:chr m:val="̂"/>
-              </m:accPr>
-              <m:e>
-                <m:r>
-                  <m:t>D</m:t>
-                </m:r>
-              </m:e>
-            </m:acc>
-          </m:e>
-          <m:sub>
-            <m:r>
-              <m:t>i</m:t>
-            </m:r>
-          </m:sub>
-        </m:sSub>
-      </m:oMath>
-      <w:r>
-        <w:t xml:space="preserve"> </w:t>
-      </w:r>
-      <w:r>
-        <w:t xml:space="preserve">– прогноз прочитанного объёма объекта за горизонт, МиБ (Таблица 2.1).</w:t>
+        <w:t xml:space="preserve">объекта в COLD определяется аналогично по формуле (2.4).</w:t>
       </w:r>
     </w:p>
     <w:p>
       <w:pPr>
         <w:pStyle w:val="a2"/>
-      </w:pPr>
-      <w:r>
-        <w:t xml:space="preserve">Для COLD задержка определяется аналогично по формуле (2.4).</w:t>
-      </w:r>
-    </w:p>
-    <w:p>
-      <w:pPr>
-        <w:pStyle w:val="a2"/>
-        <w:keepNext w:val="1"/>
-        <w:keepLines w:val="1"/>
+        <w:keepNext w:val="0"/>
         <w:pageBreakBefore w:val="0"/>
         <w:widowControl w:val="1"/>
         <w:tabs>
@@ -9884,7 +9596,7 @@
           <m:rPr>
             <m:sty m:val="p"/>
           </m:rPr>
-          <m:t>,</m:t>
+          <m:t>.</m:t>
         </m:r>
       </m:oMath>
       <w:r>
@@ -9906,88 +9618,42 @@
     </w:p>
     <w:p>
       <w:pPr>
-        <w:pStyle w:val="Where"/>
-      </w:pPr>
-      <w:r>
-        <w:t xml:space="preserve">где</w:t>
-      </w:r>
-      <w:r>
-        <w:tab/>
+        <w:pStyle w:val="FirstParagraph"/>
+      </w:pPr>
+      <w:r>
+        <w:t xml:space="preserve">Выигрыш</w:t>
+      </w:r>
+      <w:r>
+        <w:t xml:space="preserve"> </w:t>
       </w:r>
       <m:oMath>
-        <m:sSubSup>
+        <m:sSub>
           <m:e>
-            <m:r>
-              <m:t>L</m:t>
-            </m:r>
-          </m:e>
-          <m:sub>
-            <m:r>
-              <m:t>i</m:t>
-            </m:r>
-          </m:sub>
-          <m:sup>
             <m:r>
               <m:rPr>
                 <m:sty m:val="p"/>
               </m:rPr>
-              <m:t>C</m:t>
-            </m:r>
-            <m:r>
-              <m:rPr>
-                <m:sty m:val="p"/>
-              </m:rPr>
-              <m:t>O</m:t>
-            </m:r>
-            <m:r>
-              <m:rPr>
-                <m:sty m:val="p"/>
-              </m:rPr>
-              <m:t>L</m:t>
-            </m:r>
-            <m:r>
-              <m:rPr>
-                <m:sty m:val="p"/>
-              </m:rPr>
-              <m:t>D</m:t>
-            </m:r>
-          </m:sup>
-        </m:sSubSup>
+              <m:t>Δ</m:t>
+            </m:r>
+          </m:e>
+          <m:sub>
+            <m:r>
+              <m:t>i</m:t>
+            </m:r>
+          </m:sub>
+        </m:sSub>
       </m:oMath>
       <w:r>
         <w:t xml:space="preserve"> </w:t>
       </w:r>
       <w:r>
-        <w:t xml:space="preserve">– ожидаемая суммарная задержка чтений объекта</w:t>
-      </w:r>
-      <w:r>
-        <w:t xml:space="preserve"> </w:t>
-      </w:r>
-      <m:oMath>
-        <m:r>
-          <m:t>i</m:t>
-        </m:r>
-      </m:oMath>
-      <w:r>
-        <w:t xml:space="preserve"> </w:t>
-      </w:r>
-      <w:r>
-        <w:t xml:space="preserve">в COLD за горизонт, мс.</w:t>
+        <w:t xml:space="preserve">от размещения объекта в HOT, то есть уменьшение его суммарной задержки за горизонт, равен разности задержек (2.4) и (2.3) и вычисляется по формуле (2.5).</w:t>
       </w:r>
     </w:p>
     <w:p>
       <w:pPr>
         <w:pStyle w:val="a2"/>
-      </w:pPr>
-      <w:r>
-        <w:t xml:space="preserve">Выигрыш от размещения объекта в HOT равен разности задержек (2.4) и (2.3) и вычисляется по формуле (2.5).</w:t>
-      </w:r>
-    </w:p>
-    <w:p>
-      <w:pPr>
-        <w:pStyle w:val="a2"/>
-        <w:keepNext w:val="1"/>
-        <w:keepLines w:val="1"/>
+        <w:keepNext w:val="0"/>
         <w:pageBreakBefore w:val="0"/>
         <w:widowControl w:val="1"/>
         <w:tabs>
@@ -10104,7 +9770,7 @@
           <m:rPr>
             <m:sty m:val="p"/>
           </m:rPr>
-          <m:t>,</m:t>
+          <m:t>.</m:t>
         </m:r>
       </m:oMath>
       <w:r>
@@ -10126,55 +9792,7 @@
     </w:p>
     <w:p>
       <w:pPr>
-        <w:pStyle w:val="Where"/>
-      </w:pPr>
-      <w:r>
-        <w:t xml:space="preserve">где</w:t>
-      </w:r>
-      <w:r>
-        <w:tab/>
-      </w:r>
-      <m:oMath>
-        <m:sSub>
-          <m:e>
-            <m:r>
-              <m:rPr>
-                <m:sty m:val="p"/>
-              </m:rPr>
-              <m:t>Δ</m:t>
-            </m:r>
-          </m:e>
-          <m:sub>
-            <m:r>
-              <m:t>i</m:t>
-            </m:r>
-          </m:sub>
-        </m:sSub>
-      </m:oMath>
-      <w:r>
-        <w:t xml:space="preserve"> </w:t>
-      </w:r>
-      <w:r>
-        <w:t xml:space="preserve">– выигрыш от размещения объекта</w:t>
-      </w:r>
-      <w:r>
-        <w:t xml:space="preserve"> </w:t>
-      </w:r>
-      <m:oMath>
-        <m:r>
-          <m:t>i</m:t>
-        </m:r>
-      </m:oMath>
-      <w:r>
-        <w:t xml:space="preserve"> </w:t>
-      </w:r>
-      <w:r>
-        <w:t xml:space="preserve">в HOT, то есть уменьшение его суммарной задержки за горизонт, мс.</w:t>
-      </w:r>
-    </w:p>
-    <w:p>
-      <w:pPr>
-        <w:pStyle w:val="a2"/>
+        <w:pStyle w:val="FirstParagraph"/>
       </w:pPr>
       <w:r>
         <w:t xml:space="preserve">Предполагается, что HOT не медленнее COLD, поэтому</w:t>
@@ -10532,59 +10150,6 @@
         <w:tab/>
       </w:r>
       <m:oMath>
-        <m:r>
-          <m:t>h</m:t>
-        </m:r>
-      </m:oMath>
-      <w:r>
-        <w:t xml:space="preserve"> </w:t>
-      </w:r>
-      <w:r>
-        <w:t xml:space="preserve">– план, то есть вектор решений</w:t>
-      </w:r>
-      <w:r>
-        <w:t xml:space="preserve"> </w:t>
-      </w:r>
-      <m:oMath>
-        <m:sSub>
-          <m:e>
-            <m:r>
-              <m:t>h</m:t>
-            </m:r>
-          </m:e>
-          <m:sub>
-            <m:r>
-              <m:t>i</m:t>
-            </m:r>
-          </m:sub>
-        </m:sSub>
-      </m:oMath>
-      <w:r>
-        <w:t xml:space="preserve"> </w:t>
-      </w:r>
-      <w:r>
-        <w:t xml:space="preserve">по всем объектам</w:t>
-      </w:r>
-      <w:r>
-        <w:t xml:space="preserve"> </w:t>
-      </w:r>
-      <m:oMath>
-        <m:r>
-          <m:t>I</m:t>
-        </m:r>
-      </m:oMath>
-      <w:r>
-        <w:t xml:space="preserve">;</w:t>
-      </w:r>
-    </w:p>
-    <w:p>
-      <w:pPr>
-        <w:pStyle w:val="Where"/>
-      </w:pPr>
-      <w:r>
-        <w:tab/>
-      </w:r>
-      <m:oMath>
         <m:sSub>
           <m:e>
             <m:r>
@@ -10718,15 +10283,18 @@
         </m:sSubSup>
       </m:oMath>
       <w:r>
-        <w:t xml:space="preserve">;</w:t>
-      </w:r>
-    </w:p>
-    <w:p>
-      <w:pPr>
-        <w:pStyle w:val="Where"/>
-      </w:pPr>
-      <w:r>
-        <w:tab/>
+        <w:t xml:space="preserve">.</w:t>
+      </w:r>
+    </w:p>
+    <w:p>
+      <w:pPr>
+        <w:pStyle w:val="a2"/>
+      </w:pPr>
+      <w:r>
+        <w:t xml:space="preserve">Первая сумма – выигрыш объектов в HOT. Вторая сумма – объём копирования переносимых объектов, а вводимый в работе штраф</w:t>
+      </w:r>
+      <w:r>
+        <w:t xml:space="preserve"> </w:t>
       </w:r>
       <m:oMath>
         <m:r>
@@ -10737,36 +10305,13 @@
         <w:t xml:space="preserve"> </w:t>
       </w:r>
       <w:r>
-        <w:t xml:space="preserve">– штраф за перенос 1 МиБ, мс/МиБ.</w:t>
+        <w:t xml:space="preserve">переводит его в миллисекунды задержки из-за конкуренции копирования с чтениями. Ёмкость HOT с учётом временных копий и предыдущих версий ограничена условием (2.7).</w:t>
       </w:r>
     </w:p>
     <w:p>
       <w:pPr>
         <w:pStyle w:val="a2"/>
-      </w:pPr>
-      <w:r>
-        <w:t xml:space="preserve">Первая сумма – выигрыш объектов в HOT. Вторая сумма – объём копирования переносимых объектов, а вводимый в работе штраф</w:t>
-      </w:r>
-      <w:r>
-        <w:t xml:space="preserve"> </w:t>
-      </w:r>
-      <m:oMath>
-        <m:r>
-          <m:t>P</m:t>
-        </m:r>
-      </m:oMath>
-      <w:r>
-        <w:t xml:space="preserve"> </w:t>
-      </w:r>
-      <w:r>
-        <w:t xml:space="preserve">переводит его в миллисекунды задержки из-за конкуренции копирования с чтениями. Ёмкость HOT с учётом временных копий и предыдущих версий ограничена условием (2.7).</w:t>
-      </w:r>
-    </w:p>
-    <w:p>
-      <w:pPr>
-        <w:pStyle w:val="a2"/>
-        <w:keepNext w:val="1"/>
-        <w:keepLines w:val="1"/>
+        <w:keepNext w:val="0"/>
         <w:pageBreakBefore w:val="0"/>
         <w:widowControl w:val="1"/>
         <w:tabs>
@@ -11017,7 +10562,7 @@
           <m:rPr>
             <m:sty m:val="p"/>
           </m:rPr>
-          <m:t>,</m:t>
+          <m:t>.</m:t>
         </m:r>
       </m:oMath>
       <w:r>
@@ -11039,222 +10584,7 @@
     </w:p>
     <w:p>
       <w:pPr>
-        <w:pStyle w:val="Where"/>
-      </w:pPr>
-      <w:r>
-        <w:t xml:space="preserve">где</w:t>
-      </w:r>
-      <w:r>
-        <w:tab/>
-      </w:r>
-      <m:oMath>
-        <m:sSubSup>
-          <m:e>
-            <m:r>
-              <m:t>S</m:t>
-            </m:r>
-          </m:e>
-          <m:sub>
-            <m:r>
-              <m:rPr>
-                <m:sty m:val="p"/>
-              </m:rPr>
-              <m:t>H</m:t>
-            </m:r>
-            <m:r>
-              <m:rPr>
-                <m:sty m:val="p"/>
-              </m:rPr>
-              <m:t>O</m:t>
-            </m:r>
-            <m:r>
-              <m:rPr>
-                <m:sty m:val="p"/>
-              </m:rPr>
-              <m:t>T</m:t>
-            </m:r>
-          </m:sub>
-          <m:sup>
-            <m:r>
-              <m:rPr>
-                <m:sty m:val="p"/>
-              </m:rPr>
-              <m:t>t</m:t>
-            </m:r>
-            <m:r>
-              <m:rPr>
-                <m:sty m:val="p"/>
-              </m:rPr>
-              <m:t>m</m:t>
-            </m:r>
-            <m:r>
-              <m:rPr>
-                <m:sty m:val="p"/>
-              </m:rPr>
-              <m:t>p</m:t>
-            </m:r>
-          </m:sup>
-        </m:sSubSup>
-      </m:oMath>
-      <w:r>
-        <w:t xml:space="preserve"> </w:t>
-      </w:r>
-      <w:r>
-        <w:t xml:space="preserve">– объём временных копий в HOT, МиБ;</w:t>
-      </w:r>
-    </w:p>
-    <w:p>
-      <w:pPr>
-        <w:pStyle w:val="Where"/>
-      </w:pPr>
-      <w:r>
-        <w:tab/>
-      </w:r>
-      <m:oMath>
-        <m:sSubSup>
-          <m:e>
-            <m:r>
-              <m:t>S</m:t>
-            </m:r>
-          </m:e>
-          <m:sub>
-            <m:r>
-              <m:rPr>
-                <m:sty m:val="p"/>
-              </m:rPr>
-              <m:t>H</m:t>
-            </m:r>
-            <m:r>
-              <m:rPr>
-                <m:sty m:val="p"/>
-              </m:rPr>
-              <m:t>O</m:t>
-            </m:r>
-            <m:r>
-              <m:rPr>
-                <m:sty m:val="p"/>
-              </m:rPr>
-              <m:t>T</m:t>
-            </m:r>
-          </m:sub>
-          <m:sup>
-            <m:r>
-              <m:rPr>
-                <m:sty m:val="p"/>
-              </m:rPr>
-              <m:t>o</m:t>
-            </m:r>
-            <m:r>
-              <m:rPr>
-                <m:sty m:val="p"/>
-              </m:rPr>
-              <m:t>l</m:t>
-            </m:r>
-            <m:r>
-              <m:rPr>
-                <m:sty m:val="p"/>
-              </m:rPr>
-              <m:t>d</m:t>
-            </m:r>
-          </m:sup>
-        </m:sSubSup>
-      </m:oMath>
-      <w:r>
-        <w:t xml:space="preserve"> </w:t>
-      </w:r>
-      <w:r>
-        <w:t xml:space="preserve">– объём предыдущих версий в HOT, МиБ;</w:t>
-      </w:r>
-    </w:p>
-    <w:p>
-      <w:pPr>
-        <w:pStyle w:val="Where"/>
-      </w:pPr>
-      <w:r>
-        <w:tab/>
-      </w:r>
-      <m:oMath>
-        <m:sSub>
-          <m:e>
-            <m:r>
-              <m:t>u</m:t>
-            </m:r>
-          </m:e>
-          <m:sub>
-            <m:r>
-              <m:rPr>
-                <m:sty m:val="p"/>
-              </m:rPr>
-              <m:t>H</m:t>
-            </m:r>
-            <m:r>
-              <m:rPr>
-                <m:sty m:val="p"/>
-              </m:rPr>
-              <m:t>O</m:t>
-            </m:r>
-            <m:r>
-              <m:rPr>
-                <m:sty m:val="p"/>
-              </m:rPr>
-              <m:t>T</m:t>
-            </m:r>
-          </m:sub>
-        </m:sSub>
-      </m:oMath>
-      <w:r>
-        <w:t xml:space="preserve"> </w:t>
-      </w:r>
-      <w:r>
-        <w:t xml:space="preserve">– допустимая доля занятости HOT;</w:t>
-      </w:r>
-    </w:p>
-    <w:p>
-      <w:pPr>
-        <w:pStyle w:val="Where"/>
-      </w:pPr>
-      <w:r>
-        <w:tab/>
-      </w:r>
-      <m:oMath>
-        <m:sSub>
-          <m:e>
-            <m:r>
-              <m:t>C</m:t>
-            </m:r>
-          </m:e>
-          <m:sub>
-            <m:r>
-              <m:rPr>
-                <m:sty m:val="p"/>
-              </m:rPr>
-              <m:t>H</m:t>
-            </m:r>
-            <m:r>
-              <m:rPr>
-                <m:sty m:val="p"/>
-              </m:rPr>
-              <m:t>O</m:t>
-            </m:r>
-            <m:r>
-              <m:rPr>
-                <m:sty m:val="p"/>
-              </m:rPr>
-              <m:t>T</m:t>
-            </m:r>
-          </m:sub>
-        </m:sSub>
-      </m:oMath>
-      <w:r>
-        <w:t xml:space="preserve"> </w:t>
-      </w:r>
-      <w:r>
-        <w:t xml:space="preserve">– ёмкость HOT, МиБ.</w:t>
-      </w:r>
-    </w:p>
-    <w:p>
-      <w:pPr>
-        <w:pStyle w:val="a2"/>
+        <w:pStyle w:val="FirstParagraph"/>
       </w:pPr>
       <w:r>
         <w:t xml:space="preserve">Временные копии – это целевые копии выполняемых переносов, источники до удаления и неудалённые копии, учтённые в Metadata. Для COLD действует условие (2.8).</w:t>
@@ -11614,243 +10944,7 @@
         <w:t xml:space="preserve"> </w:t>
       </w:r>
       <w:r>
-        <w:t xml:space="preserve">– множество объектов, размещённых по плану в COLD;</w:t>
-      </w:r>
-    </w:p>
-    <w:p>
-      <w:pPr>
-        <w:pStyle w:val="Where"/>
-      </w:pPr>
-      <w:r>
-        <w:tab/>
-      </w:r>
-      <m:oMath>
-        <m:sSubSup>
-          <m:e>
-            <m:r>
-              <m:t>S</m:t>
-            </m:r>
-          </m:e>
-          <m:sub>
-            <m:r>
-              <m:rPr>
-                <m:sty m:val="p"/>
-              </m:rPr>
-              <m:t>C</m:t>
-            </m:r>
-            <m:r>
-              <m:rPr>
-                <m:sty m:val="p"/>
-              </m:rPr>
-              <m:t>O</m:t>
-            </m:r>
-            <m:r>
-              <m:rPr>
-                <m:sty m:val="p"/>
-              </m:rPr>
-              <m:t>L</m:t>
-            </m:r>
-            <m:r>
-              <m:rPr>
-                <m:sty m:val="p"/>
-              </m:rPr>
-              <m:t>D</m:t>
-            </m:r>
-          </m:sub>
-          <m:sup>
-            <m:r>
-              <m:rPr>
-                <m:sty m:val="p"/>
-              </m:rPr>
-              <m:t>t</m:t>
-            </m:r>
-            <m:r>
-              <m:rPr>
-                <m:sty m:val="p"/>
-              </m:rPr>
-              <m:t>m</m:t>
-            </m:r>
-            <m:r>
-              <m:rPr>
-                <m:sty m:val="p"/>
-              </m:rPr>
-              <m:t>p</m:t>
-            </m:r>
-          </m:sup>
-        </m:sSubSup>
-      </m:oMath>
-      <w:r>
-        <w:t xml:space="preserve"> </w:t>
-      </w:r>
-      <w:r>
-        <w:t xml:space="preserve">– объём временных копий в COLD, МиБ;</w:t>
-      </w:r>
-    </w:p>
-    <w:p>
-      <w:pPr>
-        <w:pStyle w:val="Where"/>
-      </w:pPr>
-      <w:r>
-        <w:tab/>
-      </w:r>
-      <m:oMath>
-        <m:sSubSup>
-          <m:e>
-            <m:r>
-              <m:t>S</m:t>
-            </m:r>
-          </m:e>
-          <m:sub>
-            <m:r>
-              <m:rPr>
-                <m:sty m:val="p"/>
-              </m:rPr>
-              <m:t>C</m:t>
-            </m:r>
-            <m:r>
-              <m:rPr>
-                <m:sty m:val="p"/>
-              </m:rPr>
-              <m:t>O</m:t>
-            </m:r>
-            <m:r>
-              <m:rPr>
-                <m:sty m:val="p"/>
-              </m:rPr>
-              <m:t>L</m:t>
-            </m:r>
-            <m:r>
-              <m:rPr>
-                <m:sty m:val="p"/>
-              </m:rPr>
-              <m:t>D</m:t>
-            </m:r>
-          </m:sub>
-          <m:sup>
-            <m:r>
-              <m:rPr>
-                <m:sty m:val="p"/>
-              </m:rPr>
-              <m:t>o</m:t>
-            </m:r>
-            <m:r>
-              <m:rPr>
-                <m:sty m:val="p"/>
-              </m:rPr>
-              <m:t>l</m:t>
-            </m:r>
-            <m:r>
-              <m:rPr>
-                <m:sty m:val="p"/>
-              </m:rPr>
-              <m:t>d</m:t>
-            </m:r>
-          </m:sup>
-        </m:sSubSup>
-      </m:oMath>
-      <w:r>
-        <w:t xml:space="preserve"> </w:t>
-      </w:r>
-      <w:r>
-        <w:t xml:space="preserve">– объём предыдущих версий в COLD, МиБ;</w:t>
-      </w:r>
-    </w:p>
-    <w:p>
-      <w:pPr>
-        <w:pStyle w:val="Where"/>
-      </w:pPr>
-      <w:r>
-        <w:tab/>
-      </w:r>
-      <m:oMath>
-        <m:sSub>
-          <m:e>
-            <m:r>
-              <m:t>u</m:t>
-            </m:r>
-          </m:e>
-          <m:sub>
-            <m:r>
-              <m:rPr>
-                <m:sty m:val="p"/>
-              </m:rPr>
-              <m:t>C</m:t>
-            </m:r>
-            <m:r>
-              <m:rPr>
-                <m:sty m:val="p"/>
-              </m:rPr>
-              <m:t>O</m:t>
-            </m:r>
-            <m:r>
-              <m:rPr>
-                <m:sty m:val="p"/>
-              </m:rPr>
-              <m:t>L</m:t>
-            </m:r>
-            <m:r>
-              <m:rPr>
-                <m:sty m:val="p"/>
-              </m:rPr>
-              <m:t>D</m:t>
-            </m:r>
-          </m:sub>
-        </m:sSub>
-      </m:oMath>
-      <w:r>
-        <w:t xml:space="preserve"> </w:t>
-      </w:r>
-      <w:r>
-        <w:t xml:space="preserve">– допустимая доля занятости COLD;</w:t>
-      </w:r>
-    </w:p>
-    <w:p>
-      <w:pPr>
-        <w:pStyle w:val="Where"/>
-      </w:pPr>
-      <w:r>
-        <w:tab/>
-      </w:r>
-      <m:oMath>
-        <m:sSub>
-          <m:e>
-            <m:r>
-              <m:t>C</m:t>
-            </m:r>
-          </m:e>
-          <m:sub>
-            <m:r>
-              <m:rPr>
-                <m:sty m:val="p"/>
-              </m:rPr>
-              <m:t>C</m:t>
-            </m:r>
-            <m:r>
-              <m:rPr>
-                <m:sty m:val="p"/>
-              </m:rPr>
-              <m:t>O</m:t>
-            </m:r>
-            <m:r>
-              <m:rPr>
-                <m:sty m:val="p"/>
-              </m:rPr>
-              <m:t>L</m:t>
-            </m:r>
-            <m:r>
-              <m:rPr>
-                <m:sty m:val="p"/>
-              </m:rPr>
-              <m:t>D</m:t>
-            </m:r>
-          </m:sub>
-        </m:sSub>
-      </m:oMath>
-      <w:r>
-        <w:t xml:space="preserve"> </w:t>
-      </w:r>
-      <w:r>
-        <w:t xml:space="preserve">– ёмкость COLD, МиБ.</w:t>
+        <w:t xml:space="preserve">– множество объектов, размещённых по плану в COLD.</w:t>
       </w:r>
     </w:p>
     <w:p>
@@ -11864,8 +10958,7 @@
     <w:p>
       <w:pPr>
         <w:pStyle w:val="a2"/>
-        <w:keepNext w:val="1"/>
-        <w:keepLines w:val="1"/>
+        <w:keepNext w:val="0"/>
         <w:pageBreakBefore w:val="0"/>
         <w:widowControl w:val="1"/>
         <w:tabs>
@@ -11959,7 +11052,7 @@
           <m:rPr>
             <m:sty m:val="p"/>
           </m:rPr>
-          <m:t>,</m:t>
+          <m:t>.</m:t>
         </m:r>
       </m:oMath>
       <w:r>
@@ -11981,29 +11074,7 @@
     </w:p>
     <w:p>
       <w:pPr>
-        <w:pStyle w:val="Where"/>
-      </w:pPr>
-      <w:r>
-        <w:t xml:space="preserve">где</w:t>
-      </w:r>
-      <w:r>
-        <w:tab/>
-      </w:r>
-      <m:oMath>
-        <m:r>
-          <m:t>B</m:t>
-        </m:r>
-      </m:oMath>
-      <w:r>
-        <w:t xml:space="preserve"> </w:t>
-      </w:r>
-      <w:r>
-        <w:t xml:space="preserve">– остаток бюджета копирования на цикл за вычетом выполняемых переносов и неуспешных попыток, МиБ.</w:t>
-      </w:r>
-    </w:p>
-    <w:p>
-      <w:pPr>
-        <w:pStyle w:val="a2"/>
+        <w:pStyle w:val="FirstParagraph"/>
       </w:pPr>
       <w:r>
         <w:t xml:space="preserve">Порог</w:t>
@@ -12502,25 +11573,6 @@
       </w:r>
       <w:r>
         <w:t xml:space="preserve">– коэффициент обучения;</w:t>
-      </w:r>
-    </w:p>
-    <w:p>
-      <w:pPr>
-        <w:pStyle w:val="Where"/>
-      </w:pPr>
-      <w:r>
-        <w:tab/>
-      </w:r>
-      <m:oMath>
-        <m:r>
-          <m:t>k</m:t>
-        </m:r>
-      </m:oMath>
-      <w:r>
-        <w:t xml:space="preserve"> </w:t>
-      </w:r>
-      <w:r>
-        <w:t xml:space="preserve">– номер шага бустинга;</w:t>
       </w:r>
     </w:p>
     <w:p>
@@ -12972,46 +12024,7 @@
         <w:t xml:space="preserve"> </w:t>
       </w:r>
       <w:r>
-        <w:t xml:space="preserve">– выход классификатора по формуле (2.10);</w:t>
-      </w:r>
-    </w:p>
-    <w:p>
-      <w:pPr>
-        <w:pStyle w:val="Where"/>
-      </w:pPr>
-      <w:r>
-        <w:tab/>
-      </w:r>
-      <m:oMath>
-        <m:sSub>
-          <m:e>
-            <m:r>
-              <m:t>x</m:t>
-            </m:r>
-          </m:e>
-          <m:sub>
-            <m:r>
-              <m:t>i</m:t>
-            </m:r>
-          </m:sub>
-        </m:sSub>
-      </m:oMath>
-      <w:r>
-        <w:t xml:space="preserve"> </w:t>
-      </w:r>
-      <w:r>
-        <w:t xml:space="preserve">– вектор признаков объекта</w:t>
-      </w:r>
-      <w:r>
-        <w:t xml:space="preserve"> </w:t>
-      </w:r>
-      <m:oMath>
-        <m:r>
-          <m:t>i</m:t>
-        </m:r>
-      </m:oMath>
-      <w:r>
-        <w:t xml:space="preserve">.</w:t>
+        <w:t xml:space="preserve">– выход классификатора по формуле (2.10).</w:t>
       </w:r>
     </w:p>
     <w:p>
@@ -13321,8 +12334,7 @@
     <w:p>
       <w:pPr>
         <w:pStyle w:val="a2"/>
-        <w:keepNext w:val="1"/>
-        <w:keepLines w:val="1"/>
+        <w:keepNext w:val="0"/>
         <w:pageBreakBefore w:val="0"/>
         <w:widowControl w:val="1"/>
         <w:tabs>
@@ -13391,7 +12403,7 @@
           <m:rPr>
             <m:sty m:val="p"/>
           </m:rPr>
-          <m:t>,</m:t>
+          <m:t>.</m:t>
         </m:r>
       </m:oMath>
       <w:r>
@@ -13413,59 +12425,7 @@
     </w:p>
     <w:p>
       <w:pPr>
-        <w:pStyle w:val="Where"/>
-      </w:pPr>
-      <w:r>
-        <w:t xml:space="preserve">где</w:t>
-      </w:r>
-      <w:r>
-        <w:tab/>
-      </w:r>
-      <m:oMath>
-        <m:sSub>
-          <m:e>
-            <m:acc>
-              <m:accPr>
-                <m:chr m:val="̂"/>
-              </m:accPr>
-              <m:e>
-                <m:r>
-                  <m:t>N</m:t>
-                </m:r>
-              </m:e>
-            </m:acc>
-          </m:e>
-          <m:sub>
-            <m:r>
-              <m:t>i</m:t>
-            </m:r>
-          </m:sub>
-        </m:sSub>
-      </m:oMath>
-      <w:r>
-        <w:t xml:space="preserve"> </w:t>
-      </w:r>
-      <w:r>
-        <w:t xml:space="preserve">– прогноз числа чтений объекта</w:t>
-      </w:r>
-      <w:r>
-        <w:t xml:space="preserve"> </w:t>
-      </w:r>
-      <m:oMath>
-        <m:r>
-          <m:t>i</m:t>
-        </m:r>
-      </m:oMath>
-      <w:r>
-        <w:t xml:space="preserve"> </w:t>
-      </w:r>
-      <w:r>
-        <w:t xml:space="preserve">за горизонт (Таблица 2.1).</w:t>
-      </w:r>
-    </w:p>
-    <w:p>
-      <w:pPr>
-        <w:pStyle w:val="a2"/>
+        <w:pStyle w:val="FirstParagraph"/>
       </w:pPr>
       <w:r>
         <w:t xml:space="preserve">Равенство выполняется при откалиброванной</w:t>
@@ -13998,33 +12958,7 @@
         </m:r>
       </m:oMath>
       <w:r>
-        <w:t xml:space="preserve">;</w:t>
-      </w:r>
-    </w:p>
-    <w:p>
-      <w:pPr>
-        <w:pStyle w:val="Where"/>
-      </w:pPr>
-      <w:r>
-        <w:tab/>
-      </w:r>
-      <m:oMath>
-        <m:acc>
-          <m:accPr>
-            <m:chr m:val="̂"/>
-          </m:accPr>
-          <m:e>
-            <m:r>
-              <m:t>y</m:t>
-            </m:r>
-          </m:e>
-        </m:acc>
-      </m:oMath>
-      <w:r>
-        <w:t xml:space="preserve"> </w:t>
-      </w:r>
-      <w:r>
-        <w:t xml:space="preserve">– прогноз регрессора по формуле (2.14).</w:t>
+        <w:t xml:space="preserve">.</w:t>
       </w:r>
     </w:p>
     <w:p>
@@ -15252,7 +14186,7 @@
         <m:sSub>
           <m:e>
             <m:r>
-              <m:t>N</m:t>
+              <m:t>R</m:t>
             </m:r>
           </m:e>
           <m:sub>
@@ -15261,27 +14195,12 @@
             </m:r>
           </m:sub>
         </m:sSub>
-        <m:r>
-          <m:rPr>
-            <m:sty m:val="p"/>
-          </m:rPr>
-          <m:t>(</m:t>
-        </m:r>
-        <m:r>
-          <m:t>T</m:t>
-        </m:r>
-        <m:r>
-          <m:rPr>
-            <m:sty m:val="p"/>
-          </m:rPr>
-          <m:t>)</m:t>
-        </m:r>
       </m:oMath>
       <w:r>
         <w:t xml:space="preserve"> </w:t>
       </w:r>
       <w:r>
-        <w:t xml:space="preserve">– фактическое число клиентских чтений объекта</w:t>
+        <w:t xml:space="preserve">– множество клиентских чтений объекта</w:t>
       </w:r>
       <w:r>
         <w:t xml:space="preserve"> </w:t>
@@ -15292,127 +14211,7 @@
         </m:r>
       </m:oMath>
       <w:r>
-        <w:t xml:space="preserve"> </w:t>
-      </w:r>
-      <w:r>
-        <w:t xml:space="preserve">на интервале</w:t>
-      </w:r>
-      <w:r>
-        <w:t xml:space="preserve"> </w:t>
-      </w:r>
-      <m:oMath>
-        <m:r>
-          <m:rPr>
-            <m:sty m:val="p"/>
-          </m:rPr>
-          <m:t>[</m:t>
-        </m:r>
-        <m:r>
-          <m:t>T</m:t>
-        </m:r>
-        <m:r>
-          <m:rPr>
-            <m:sty m:val="p"/>
-          </m:rPr>
-          <m:t>,</m:t>
-        </m:r>
-        <m:r>
-          <m:t>T</m:t>
-        </m:r>
-        <m:r>
-          <m:rPr>
-            <m:sty m:val="p"/>
-          </m:rPr>
-          <m:t>+</m:t>
-        </m:r>
-        <m:r>
-          <m:t>H</m:t>
-        </m:r>
-        <m:r>
-          <m:rPr>
-            <m:sty m:val="p"/>
-          </m:rPr>
-          <m:t>)</m:t>
-        </m:r>
-      </m:oMath>
-      <w:r>
-        <w:t xml:space="preserve"> </w:t>
-      </w:r>
-      <w:r>
-        <w:t xml:space="preserve">(Таблица 2.1);</w:t>
-      </w:r>
-    </w:p>
-    <w:p>
-      <w:pPr>
-        <w:pStyle w:val="Where"/>
-      </w:pPr>
-      <w:r>
-        <w:tab/>
-      </w:r>
-      <m:oMath>
-        <m:sSub>
-          <m:e>
-            <m:r>
-              <m:t>R</m:t>
-            </m:r>
-          </m:e>
-          <m:sub>
-            <m:r>
-              <m:t>i</m:t>
-            </m:r>
-          </m:sub>
-        </m:sSub>
-      </m:oMath>
-      <w:r>
-        <w:t xml:space="preserve"> </w:t>
-      </w:r>
-      <w:r>
-        <w:t xml:space="preserve">– множество клиентских чтений объекта</w:t>
-      </w:r>
-      <w:r>
-        <w:t xml:space="preserve"> </w:t>
-      </w:r>
-      <m:oMath>
-        <m:r>
-          <m:t>i</m:t>
-        </m:r>
-      </m:oMath>
-      <w:r>
-        <w:t xml:space="preserve">;</w:t>
-      </w:r>
-    </w:p>
-    <w:p>
-      <w:pPr>
-        <w:pStyle w:val="Where"/>
-      </w:pPr>
-      <w:r>
-        <w:tab/>
-      </w:r>
-      <m:oMath>
-        <m:r>
-          <m:rPr>
-            <m:sty m:val="p"/>
-          </m:rPr>
-          <m:t>|</m:t>
-        </m:r>
-        <m:r>
-          <m:rPr>
-            <m:sty m:val="p"/>
-          </m:rPr>
-          <m:t>⋅</m:t>
-        </m:r>
-        <m:r>
-          <m:rPr>
-            <m:sty m:val="p"/>
-          </m:rPr>
-          <m:t>|</m:t>
-        </m:r>
-      </m:oMath>
-      <w:r>
-        <w:t xml:space="preserve"> </w:t>
-      </w:r>
-      <w:r>
-        <w:t xml:space="preserve">– число элементов множества.</w:t>
+        <w:t xml:space="preserve">.</w:t>
       </w:r>
     </w:p>
     <w:p>
@@ -16052,49 +14851,7 @@
         </m:sSub>
       </m:oMath>
       <w:r>
-        <w:t xml:space="preserve">;</w:t>
-      </w:r>
-    </w:p>
-    <w:p>
-      <w:pPr>
-        <w:pStyle w:val="Where"/>
-      </w:pPr>
-      <w:r>
-        <w:tab/>
-      </w:r>
-      <m:oMath>
-        <m:sSub>
-          <m:e>
-            <m:r>
-              <m:t>N</m:t>
-            </m:r>
-          </m:e>
-          <m:sub>
-            <m:r>
-              <m:t>i</m:t>
-            </m:r>
-          </m:sub>
-        </m:sSub>
-      </m:oMath>
-      <w:r>
-        <w:t xml:space="preserve"> </w:t>
-      </w:r>
-      <w:r>
-        <w:t xml:space="preserve">– фактическое число чтений объекта</w:t>
-      </w:r>
-      <w:r>
-        <w:t xml:space="preserve"> </w:t>
-      </w:r>
-      <m:oMath>
-        <m:r>
-          <m:t>i</m:t>
-        </m:r>
-      </m:oMath>
-      <w:r>
-        <w:t xml:space="preserve"> </w:t>
-      </w:r>
-      <w:r>
-        <w:t xml:space="preserve">за горизонт.</w:t>
+        <w:t xml:space="preserve">.</w:t>
       </w:r>
     </w:p>
     <w:p>

</xml_diff>

<commit_message>
Show formula ranges in thesis as 2.5 – 2.9
</commit_message>
<xml_diff>
--- a/40 - Projects/Диплом/Диплом_ГОСТ.docx
+++ b/40 - Projects/Диплом/Диплом_ГОСТ.docx
@@ -11140,7 +11140,7 @@
         <w:pStyle w:val="a2"/>
       </w:pPr>
       <w:r>
-        <w:t xml:space="preserve">Ограничение бюджета делает задачу вариантом задачи о ранце с дополнительным ограничением, который в общем случае NP-труден [29], поэтому для 10 000 объектов используется жадный алгоритм, а точное решение – только для его проверки. Формулы (2.5)–(2.9) обеспечивают ранжирование рекомендаций и основу объяснения эффекта, то есть функциональные требования F-05 и F-06.</w:t>
+        <w:t xml:space="preserve">Ограничение бюджета делает задачу вариантом задачи о ранце с дополнительным ограничением, который в общем случае NP-труден [29], поэтому для 10 000 объектов используется жадный алгоритм, а точное решение – только для его проверки. Формулы 2.5 – 2.9 обеспечивают ранжирование рекомендаций и основу объяснения эффекта, то есть функциональные требования F-05 и F-06.</w:t>
       </w:r>
     </w:p>
     <w:bookmarkEnd w:id="56"/>
@@ -14887,7 +14887,7 @@
         <w:pStyle w:val="FirstParagraph"/>
       </w:pPr>
       <w:r>
-        <w:t xml:space="preserve">Алгоритм решает задачу (2.6)–(2.9) жадным выбором. При устаревших данных прогнозные действия приостанавливаются, а при непригодной модели спрос оценивает базовая политика. Если HOT переполнен уже в начале цикла, сначала формируются опускания в COLD. Затем незакреплённые кандидаты COLD перебираются по убыванию удельной ценности</w:t>
+        <w:t xml:space="preserve">Алгоритм решает задачу 2.6 – 2.9 жадным выбором. При устаревших данных прогнозные действия приостанавливаются, а при непригодной модели спрос оценивает базовая политика. Если HOT переполнен уже в начале цикла, сначала формируются опускания в COLD. Затем незакреплённые кандидаты COLD перебираются по убыванию удельной ценности</w:t>
       </w:r>
       <w:r>
         <w:t xml:space="preserve"> </w:t>
@@ -18390,7 +18390,7 @@
                 <w:sz w:val="24"/>
                 <w:szCs w:val="24"/>
               </w:rPr>
-              <w:t xml:space="preserve">Задача (2.6)–(2.9) и жадный алгоритм</w:t>
+              <w:t xml:space="preserve">Задача 2.6 – 2.9 и жадный алгоритм</w:t>
             </w:r>
           </w:p>
         </w:tc>

</xml_diff>